<commit_message>
improve the optimazation file and use prompt optimizaiton file
</commit_message>
<xml_diff>
--- a/Group_Report_Allocation.docx
+++ b/Group_Report_Allocation.docx
@@ -5,6 +5,7 @@
     <w:p>
       <w:pPr>
         <w:rPr>
+          <w:rFonts w:hint="eastAsia"/>
           <w:b/>
           <w:bCs/>
         </w:rPr>
@@ -35,6 +36,7 @@
     <w:p>
       <w:pPr>
         <w:rPr>
+          <w:rFonts w:hint="eastAsia"/>
           <w:b/>
           <w:bCs/>
         </w:rPr>
@@ -48,15 +50,21 @@
       </w:r>
     </w:p>
     <w:p>
+      <w:pPr>
+        <w:rPr>
+          <w:rFonts w:hint="eastAsia"/>
+        </w:rPr>
+      </w:pPr>
       <w:r>
         <w:pict w14:anchorId="75CF331D">
-          <v:rect id="_x0000_i1083" style="width:0;height:1.5pt" o:hralign="center" o:hrstd="t" o:hr="t" fillcolor="#a0a0a0" stroked="f"/>
+          <v:rect id="_x0000_i1025" style="width:0;height:1.5pt" o:hralign="center" o:hrstd="t" o:hr="t" fillcolor="#a0a0a0" stroked="f"/>
         </w:pict>
       </w:r>
     </w:p>
     <w:p>
       <w:pPr>
         <w:rPr>
+          <w:rFonts w:hint="eastAsia"/>
           <w:b/>
           <w:bCs/>
         </w:rPr>
@@ -100,6 +108,7 @@
           <w:p>
             <w:pPr>
               <w:rPr>
+                <w:rFonts w:hint="eastAsia"/>
                 <w:b/>
                 <w:bCs/>
               </w:rPr>
@@ -122,6 +131,7 @@
           <w:p>
             <w:pPr>
               <w:rPr>
+                <w:rFonts w:hint="eastAsia"/>
                 <w:b/>
                 <w:bCs/>
               </w:rPr>
@@ -144,6 +154,7 @@
           <w:p>
             <w:pPr>
               <w:rPr>
+                <w:rFonts w:hint="eastAsia"/>
                 <w:b/>
                 <w:bCs/>
               </w:rPr>
@@ -169,6 +180,11 @@
             <w:hideMark/>
           </w:tcPr>
           <w:p>
+            <w:pPr>
+              <w:rPr>
+                <w:rFonts w:hint="eastAsia"/>
+              </w:rPr>
+            </w:pPr>
             <w:r>
               <w:t>1. Abstract</w:t>
             </w:r>
@@ -181,6 +197,11 @@
             <w:hideMark/>
           </w:tcPr>
           <w:p>
+            <w:pPr>
+              <w:rPr>
+                <w:rFonts w:hint="eastAsia"/>
+              </w:rPr>
+            </w:pPr>
             <w:r>
               <w:t>Haoran (last, after all results)</w:t>
             </w:r>
@@ -193,6 +214,11 @@
             <w:hideMark/>
           </w:tcPr>
           <w:p>
+            <w:pPr>
+              <w:rPr>
+                <w:rFonts w:hint="eastAsia"/>
+              </w:rPr>
+            </w:pPr>
             <w:r>
               <w:t>0.25 p</w:t>
             </w:r>
@@ -210,6 +236,11 @@
             <w:hideMark/>
           </w:tcPr>
           <w:p>
+            <w:pPr>
+              <w:rPr>
+                <w:rFonts w:hint="eastAsia"/>
+              </w:rPr>
+            </w:pPr>
             <w:r>
               <w:t>2.1 Background &amp; Motivation</w:t>
             </w:r>
@@ -222,6 +253,11 @@
             <w:hideMark/>
           </w:tcPr>
           <w:p>
+            <w:pPr>
+              <w:rPr>
+                <w:rFonts w:hint="eastAsia"/>
+              </w:rPr>
+            </w:pPr>
             <w:r>
               <w:t>Pallavi</w:t>
             </w:r>
@@ -234,6 +270,11 @@
             <w:hideMark/>
           </w:tcPr>
           <w:p>
+            <w:pPr>
+              <w:rPr>
+                <w:rFonts w:hint="eastAsia"/>
+              </w:rPr>
+            </w:pPr>
             <w:r>
               <w:t>0.5 p</w:t>
             </w:r>
@@ -251,6 +292,11 @@
             <w:hideMark/>
           </w:tcPr>
           <w:p>
+            <w:pPr>
+              <w:rPr>
+                <w:rFonts w:hint="eastAsia"/>
+              </w:rPr>
+            </w:pPr>
             <w:r>
               <w:t>2.2 Dataset &amp; EDA</w:t>
             </w:r>
@@ -263,6 +309,11 @@
             <w:hideMark/>
           </w:tcPr>
           <w:p>
+            <w:pPr>
+              <w:rPr>
+                <w:rFonts w:hint="eastAsia"/>
+              </w:rPr>
+            </w:pPr>
             <w:r>
               <w:t>Alex</w:t>
             </w:r>
@@ -275,6 +326,11 @@
             <w:hideMark/>
           </w:tcPr>
           <w:p>
+            <w:pPr>
+              <w:rPr>
+                <w:rFonts w:hint="eastAsia"/>
+              </w:rPr>
+            </w:pPr>
             <w:r>
               <w:t>0.7 p</w:t>
             </w:r>
@@ -292,6 +348,11 @@
             <w:hideMark/>
           </w:tcPr>
           <w:p>
+            <w:pPr>
+              <w:rPr>
+                <w:rFonts w:hint="eastAsia"/>
+              </w:rPr>
+            </w:pPr>
             <w:r>
               <w:t>2.3 Pipeline Overview</w:t>
             </w:r>
@@ -304,6 +365,11 @@
             <w:hideMark/>
           </w:tcPr>
           <w:p>
+            <w:pPr>
+              <w:rPr>
+                <w:rFonts w:hint="eastAsia"/>
+              </w:rPr>
+            </w:pPr>
             <w:r>
               <w:t>Haoran</w:t>
             </w:r>
@@ -316,6 +382,11 @@
             <w:hideMark/>
           </w:tcPr>
           <w:p>
+            <w:pPr>
+              <w:rPr>
+                <w:rFonts w:hint="eastAsia"/>
+              </w:rPr>
+            </w:pPr>
             <w:r>
               <w:t>0.3 p</w:t>
             </w:r>
@@ -333,6 +404,11 @@
             <w:hideMark/>
           </w:tcPr>
           <w:p>
+            <w:pPr>
+              <w:rPr>
+                <w:rFonts w:hint="eastAsia"/>
+              </w:rPr>
+            </w:pPr>
             <w:r>
               <w:t>3.1 Preprocessing</w:t>
             </w:r>
@@ -345,6 +421,11 @@
             <w:hideMark/>
           </w:tcPr>
           <w:p>
+            <w:pPr>
+              <w:rPr>
+                <w:rFonts w:hint="eastAsia"/>
+              </w:rPr>
+            </w:pPr>
             <w:r>
               <w:t>Lingshi</w:t>
             </w:r>
@@ -357,6 +438,11 @@
             <w:hideMark/>
           </w:tcPr>
           <w:p>
+            <w:pPr>
+              <w:rPr>
+                <w:rFonts w:hint="eastAsia"/>
+              </w:rPr>
+            </w:pPr>
             <w:r>
               <w:t>0.4 p</w:t>
             </w:r>
@@ -374,6 +460,11 @@
             <w:hideMark/>
           </w:tcPr>
           <w:p>
+            <w:pPr>
+              <w:rPr>
+                <w:rFonts w:hint="eastAsia"/>
+              </w:rPr>
+            </w:pPr>
             <w:r>
               <w:t>3.2 Baseline</w:t>
             </w:r>
@@ -386,6 +477,11 @@
             <w:hideMark/>
           </w:tcPr>
           <w:p>
+            <w:pPr>
+              <w:rPr>
+                <w:rFonts w:hint="eastAsia"/>
+              </w:rPr>
+            </w:pPr>
             <w:r>
               <w:t>Lingshi</w:t>
             </w:r>
@@ -398,6 +494,11 @@
             <w:hideMark/>
           </w:tcPr>
           <w:p>
+            <w:pPr>
+              <w:rPr>
+                <w:rFonts w:hint="eastAsia"/>
+              </w:rPr>
+            </w:pPr>
             <w:r>
               <w:t>0.2 p</w:t>
             </w:r>
@@ -415,6 +516,11 @@
             <w:hideMark/>
           </w:tcPr>
           <w:p>
+            <w:pPr>
+              <w:rPr>
+                <w:rFonts w:hint="eastAsia"/>
+              </w:rPr>
+            </w:pPr>
             <w:r>
               <w:t>3.3 Axis 1 — Text Representations</w:t>
             </w:r>
@@ -427,6 +533,11 @@
             <w:hideMark/>
           </w:tcPr>
           <w:p>
+            <w:pPr>
+              <w:rPr>
+                <w:rFonts w:hint="eastAsia"/>
+              </w:rPr>
+            </w:pPr>
             <w:r>
               <w:t>Haoran</w:t>
             </w:r>
@@ -451,6 +562,11 @@
             <w:hideMark/>
           </w:tcPr>
           <w:p>
+            <w:pPr>
+              <w:rPr>
+                <w:rFonts w:hint="eastAsia"/>
+              </w:rPr>
+            </w:pPr>
             <w:r>
               <w:t>1.0 p</w:t>
             </w:r>
@@ -468,6 +584,11 @@
             <w:hideMark/>
           </w:tcPr>
           <w:p>
+            <w:pPr>
+              <w:rPr>
+                <w:rFonts w:hint="eastAsia"/>
+              </w:rPr>
+            </w:pPr>
             <w:r>
               <w:t>3.4 Axis 2 — Classifiers</w:t>
             </w:r>
@@ -480,6 +601,11 @@
             <w:hideMark/>
           </w:tcPr>
           <w:p>
+            <w:pPr>
+              <w:rPr>
+                <w:rFonts w:hint="eastAsia"/>
+              </w:rPr>
+            </w:pPr>
             <w:r>
               <w:t>Anis</w:t>
             </w:r>
@@ -492,6 +618,11 @@
             <w:hideMark/>
           </w:tcPr>
           <w:p>
+            <w:pPr>
+              <w:rPr>
+                <w:rFonts w:hint="eastAsia"/>
+              </w:rPr>
+            </w:pPr>
             <w:r>
               <w:t>0.7 p</w:t>
             </w:r>
@@ -509,6 +640,11 @@
             <w:hideMark/>
           </w:tcPr>
           <w:p>
+            <w:pPr>
+              <w:rPr>
+                <w:rFonts w:hint="eastAsia"/>
+              </w:rPr>
+            </w:pPr>
             <w:r>
               <w:t>3.5 Generative Comparison: BioGPT</w:t>
             </w:r>
@@ -521,6 +657,11 @@
             <w:hideMark/>
           </w:tcPr>
           <w:p>
+            <w:pPr>
+              <w:rPr>
+                <w:rFonts w:hint="eastAsia"/>
+              </w:rPr>
+            </w:pPr>
             <w:r>
               <w:t>Haoran + Lingshi</w:t>
             </w:r>
@@ -533,6 +674,11 @@
             <w:hideMark/>
           </w:tcPr>
           <w:p>
+            <w:pPr>
+              <w:rPr>
+                <w:rFonts w:hint="eastAsia"/>
+              </w:rPr>
+            </w:pPr>
             <w:r>
               <w:t>0.5 p</w:t>
             </w:r>
@@ -550,6 +696,11 @@
             <w:hideMark/>
           </w:tcPr>
           <w:p>
+            <w:pPr>
+              <w:rPr>
+                <w:rFonts w:hint="eastAsia"/>
+              </w:rPr>
+            </w:pPr>
             <w:r>
               <w:t>4.1 Evaluation Metrics</w:t>
             </w:r>
@@ -562,6 +713,11 @@
             <w:hideMark/>
           </w:tcPr>
           <w:p>
+            <w:pPr>
+              <w:rPr>
+                <w:rFonts w:hint="eastAsia"/>
+              </w:rPr>
+            </w:pPr>
             <w:r>
               <w:t>Lingshi</w:t>
             </w:r>
@@ -574,6 +730,11 @@
             <w:hideMark/>
           </w:tcPr>
           <w:p>
+            <w:pPr>
+              <w:rPr>
+                <w:rFonts w:hint="eastAsia"/>
+              </w:rPr>
+            </w:pPr>
             <w:r>
               <w:t>0.3 p</w:t>
             </w:r>
@@ -591,6 +752,11 @@
             <w:hideMark/>
           </w:tcPr>
           <w:p>
+            <w:pPr>
+              <w:rPr>
+                <w:rFonts w:hint="eastAsia"/>
+              </w:rPr>
+            </w:pPr>
             <w:r>
               <w:t>4.2 Experimental Setup</w:t>
             </w:r>
@@ -603,6 +769,11 @@
             <w:hideMark/>
           </w:tcPr>
           <w:p>
+            <w:pPr>
+              <w:rPr>
+                <w:rFonts w:hint="eastAsia"/>
+              </w:rPr>
+            </w:pPr>
             <w:r>
               <w:t>All (Haoran assembles)</w:t>
             </w:r>
@@ -615,6 +786,11 @@
             <w:hideMark/>
           </w:tcPr>
           <w:p>
+            <w:pPr>
+              <w:rPr>
+                <w:rFonts w:hint="eastAsia"/>
+              </w:rPr>
+            </w:pPr>
             <w:r>
               <w:t>0.3 p</w:t>
             </w:r>
@@ -632,6 +808,11 @@
             <w:hideMark/>
           </w:tcPr>
           <w:p>
+            <w:pPr>
+              <w:rPr>
+                <w:rFonts w:hint="eastAsia"/>
+              </w:rPr>
+            </w:pPr>
             <w:r>
               <w:t>4.3 Main Results</w:t>
             </w:r>
@@ -644,6 +825,11 @@
             <w:hideMark/>
           </w:tcPr>
           <w:p>
+            <w:pPr>
+              <w:rPr>
+                <w:rFonts w:hint="eastAsia"/>
+              </w:rPr>
+            </w:pPr>
             <w:r>
               <w:t>All (Haoran assembles)</w:t>
             </w:r>
@@ -656,6 +842,11 @@
             <w:hideMark/>
           </w:tcPr>
           <w:p>
+            <w:pPr>
+              <w:rPr>
+                <w:rFonts w:hint="eastAsia"/>
+              </w:rPr>
+            </w:pPr>
             <w:r>
               <w:t>1.3 p</w:t>
             </w:r>
@@ -673,6 +864,11 @@
             <w:hideMark/>
           </w:tcPr>
           <w:p>
+            <w:pPr>
+              <w:rPr>
+                <w:rFonts w:hint="eastAsia"/>
+              </w:rPr>
+            </w:pPr>
             <w:r>
               <w:t>4.4 Error Analysis</w:t>
             </w:r>
@@ -685,6 +881,11 @@
             <w:hideMark/>
           </w:tcPr>
           <w:p>
+            <w:pPr>
+              <w:rPr>
+                <w:rFonts w:hint="eastAsia"/>
+              </w:rPr>
+            </w:pPr>
             <w:r>
               <w:t>All (Haoran assembles)</w:t>
             </w:r>
@@ -697,6 +898,11 @@
             <w:hideMark/>
           </w:tcPr>
           <w:p>
+            <w:pPr>
+              <w:rPr>
+                <w:rFonts w:hint="eastAsia"/>
+              </w:rPr>
+            </w:pPr>
             <w:r>
               <w:t>0.8 p</w:t>
             </w:r>
@@ -714,6 +920,11 @@
             <w:hideMark/>
           </w:tcPr>
           <w:p>
+            <w:pPr>
+              <w:rPr>
+                <w:rFonts w:hint="eastAsia"/>
+              </w:rPr>
+            </w:pPr>
             <w:r>
               <w:t>4.5 Answer Quality Prediction (Task 3)</w:t>
             </w:r>
@@ -726,6 +937,11 @@
             <w:hideMark/>
           </w:tcPr>
           <w:p>
+            <w:pPr>
+              <w:rPr>
+                <w:rFonts w:hint="eastAsia"/>
+              </w:rPr>
+            </w:pPr>
             <w:r>
               <w:t>Alex</w:t>
             </w:r>
@@ -738,6 +954,11 @@
             <w:hideMark/>
           </w:tcPr>
           <w:p>
+            <w:pPr>
+              <w:rPr>
+                <w:rFonts w:hint="eastAsia"/>
+              </w:rPr>
+            </w:pPr>
             <w:r>
               <w:t>0.5 p</w:t>
             </w:r>
@@ -755,6 +976,11 @@
             <w:hideMark/>
           </w:tcPr>
           <w:p>
+            <w:pPr>
+              <w:rPr>
+                <w:rFonts w:hint="eastAsia"/>
+              </w:rPr>
+            </w:pPr>
             <w:r>
               <w:t>4.6 Discussion</w:t>
             </w:r>
@@ -767,6 +993,11 @@
             <w:hideMark/>
           </w:tcPr>
           <w:p>
+            <w:pPr>
+              <w:rPr>
+                <w:rFonts w:hint="eastAsia"/>
+              </w:rPr>
+            </w:pPr>
             <w:r>
               <w:rPr>
                 <w:rFonts w:hint="eastAsia"/>
@@ -782,6 +1013,11 @@
             <w:hideMark/>
           </w:tcPr>
           <w:p>
+            <w:pPr>
+              <w:rPr>
+                <w:rFonts w:hint="eastAsia"/>
+              </w:rPr>
+            </w:pPr>
             <w:r>
               <w:t>0.5 p</w:t>
             </w:r>
@@ -799,6 +1035,11 @@
             <w:hideMark/>
           </w:tcPr>
           <w:p>
+            <w:pPr>
+              <w:rPr>
+                <w:rFonts w:hint="eastAsia"/>
+              </w:rPr>
+            </w:pPr>
             <w:r>
               <w:t>5. Conclusions</w:t>
             </w:r>
@@ -811,6 +1052,11 @@
             <w:hideMark/>
           </w:tcPr>
           <w:p>
+            <w:pPr>
+              <w:rPr>
+                <w:rFonts w:hint="eastAsia"/>
+              </w:rPr>
+            </w:pPr>
             <w:r>
               <w:t>Haoran (last)</w:t>
             </w:r>
@@ -823,6 +1069,11 @@
             <w:hideMark/>
           </w:tcPr>
           <w:p>
+            <w:pPr>
+              <w:rPr>
+                <w:rFonts w:hint="eastAsia"/>
+              </w:rPr>
+            </w:pPr>
             <w:r>
               <w:t>1.0 p</w:t>
             </w:r>
@@ -831,15 +1082,21 @@
       </w:tr>
     </w:tbl>
     <w:p>
+      <w:pPr>
+        <w:rPr>
+          <w:rFonts w:hint="eastAsia"/>
+        </w:rPr>
+      </w:pPr>
       <w:r>
         <w:pict w14:anchorId="28E8DA45">
-          <v:rect id="_x0000_i1068" style="width:0;height:1.5pt" o:hralign="center" o:hrstd="t" o:hr="t" fillcolor="#a0a0a0" stroked="f"/>
+          <v:rect id="_x0000_i1026" style="width:0;height:1.5pt" o:hralign="center" o:hrstd="t" o:hr="t" fillcolor="#a0a0a0" stroked="f"/>
         </w:pict>
       </w:r>
     </w:p>
     <w:p>
       <w:pPr>
         <w:rPr>
+          <w:rFonts w:hint="eastAsia"/>
           <w:b/>
           <w:bCs/>
         </w:rPr>
@@ -853,6 +1110,11 @@
       </w:r>
     </w:p>
     <w:p>
+      <w:pPr>
+        <w:rPr>
+          <w:rFonts w:hint="eastAsia"/>
+        </w:rPr>
+      </w:pPr>
       <w:r>
         <w:rPr>
           <w:b/>
@@ -872,6 +1134,11 @@
       </w:r>
     </w:p>
     <w:p>
+      <w:pPr>
+        <w:rPr>
+          <w:rFonts w:hint="eastAsia"/>
+        </w:rPr>
+      </w:pPr>
       <w:r>
         <w:t>Write a single paragraph (~150 words) covering:</w:t>
       </w:r>
@@ -882,6 +1149,9 @@
           <w:ilvl w:val="0"/>
           <w:numId w:val="1"/>
         </w:numPr>
+        <w:rPr>
+          <w:rFonts w:hint="eastAsia"/>
+        </w:rPr>
       </w:pPr>
       <w:r>
         <w:t>The task: 3-class answer classification on PubMedQA</w:t>
@@ -893,6 +1163,9 @@
           <w:ilvl w:val="0"/>
           <w:numId w:val="1"/>
         </w:numPr>
+        <w:rPr>
+          <w:rFonts w:hint="eastAsia"/>
+        </w:rPr>
       </w:pPr>
       <w:r>
         <w:t>The two design axes explored (text representation × classifier)</w:t>
@@ -904,6 +1177,9 @@
           <w:ilvl w:val="0"/>
           <w:numId w:val="1"/>
         </w:numPr>
+        <w:rPr>
+          <w:rFonts w:hint="eastAsia"/>
+        </w:rPr>
       </w:pPr>
       <w:r>
         <w:t>The generative comparison (BioGPT)</w:t>
@@ -915,6 +1191,9 @@
           <w:ilvl w:val="0"/>
           <w:numId w:val="1"/>
         </w:numPr>
+        <w:rPr>
+          <w:rFonts w:hint="eastAsia"/>
+        </w:rPr>
       </w:pPr>
       <w:r>
         <w:t>2–3 headline numbers (e.g., best accuracy, Macro-F1)</w:t>
@@ -926,21 +1205,30 @@
           <w:ilvl w:val="0"/>
           <w:numId w:val="1"/>
         </w:numPr>
+        <w:rPr>
+          <w:rFonts w:hint="eastAsia"/>
+        </w:rPr>
       </w:pPr>
       <w:r>
         <w:t>One key insight from the experiments</w:t>
       </w:r>
     </w:p>
     <w:p>
+      <w:pPr>
+        <w:rPr>
+          <w:rFonts w:hint="eastAsia"/>
+        </w:rPr>
+      </w:pPr>
       <w:r>
         <w:pict w14:anchorId="080A50ED">
-          <v:rect id="_x0000_i1069" style="width:0;height:1.5pt" o:hralign="center" o:hrstd="t" o:hr="t" fillcolor="#a0a0a0" stroked="f"/>
+          <v:rect id="_x0000_i1027" style="width:0;height:1.5pt" o:hralign="center" o:hrstd="t" o:hr="t" fillcolor="#a0a0a0" stroked="f"/>
         </w:pict>
       </w:r>
     </w:p>
     <w:p>
       <w:pPr>
         <w:rPr>
+          <w:rFonts w:hint="eastAsia"/>
           <w:b/>
           <w:bCs/>
         </w:rPr>
@@ -954,6 +1242,11 @@
       </w:r>
     </w:p>
     <w:p>
+      <w:pPr>
+        <w:rPr>
+          <w:rFonts w:hint="eastAsia"/>
+        </w:rPr>
+      </w:pPr>
       <w:r>
         <w:rPr>
           <w:b/>
@@ -965,6 +1258,7 @@
     <w:p>
       <w:pPr>
         <w:rPr>
+          <w:rFonts w:hint="eastAsia"/>
           <w:b/>
           <w:bCs/>
         </w:rPr>
@@ -978,6 +1272,11 @@
       </w:r>
     </w:p>
     <w:p>
+      <w:pPr>
+        <w:rPr>
+          <w:rFonts w:hint="eastAsia"/>
+        </w:rPr>
+      </w:pPr>
       <w:r>
         <w:rPr>
           <w:b/>
@@ -997,6 +1296,11 @@
       </w:r>
     </w:p>
     <w:p>
+      <w:pPr>
+        <w:rPr>
+          <w:rFonts w:hint="eastAsia"/>
+        </w:rPr>
+      </w:pPr>
       <w:r>
         <w:t>Cover the following:</w:t>
       </w:r>
@@ -1007,6 +1311,9 @@
           <w:ilvl w:val="0"/>
           <w:numId w:val="2"/>
         </w:numPr>
+        <w:rPr>
+          <w:rFonts w:hint="eastAsia"/>
+        </w:rPr>
       </w:pPr>
       <w:r>
         <w:t>What is biomedical question answering and why does it matter clinically?</w:t>
@@ -1018,6 +1325,9 @@
           <w:ilvl w:val="0"/>
           <w:numId w:val="2"/>
         </w:numPr>
+        <w:rPr>
+          <w:rFonts w:hint="eastAsia"/>
+        </w:rPr>
       </w:pPr>
       <w:r>
         <w:t>The challenge of structured answer classification (yes / no / maybe) vs. open-ended generation</w:t>
@@ -1029,6 +1339,9 @@
           <w:ilvl w:val="0"/>
           <w:numId w:val="2"/>
         </w:numPr>
+        <w:rPr>
+          <w:rFonts w:hint="eastAsia"/>
+        </w:rPr>
       </w:pPr>
       <w:r>
         <w:t>Brief overview of the PubMedQA dataset and its relevance to real-world clinical decision support</w:t>
@@ -1040,6 +1353,9 @@
           <w:ilvl w:val="0"/>
           <w:numId w:val="2"/>
         </w:numPr>
+        <w:rPr>
+          <w:rFonts w:hint="eastAsia"/>
+        </w:rPr>
       </w:pPr>
       <w:r>
         <w:lastRenderedPageBreak/>
@@ -1052,6 +1368,9 @@
           <w:ilvl w:val="0"/>
           <w:numId w:val="2"/>
         </w:numPr>
+        <w:rPr>
+          <w:rFonts w:hint="eastAsia"/>
+        </w:rPr>
       </w:pPr>
       <w:r>
         <w:t>Cite 3–5 relevant works (e.g., the original PubMedQA paper, BioWordVec, PubMedBERT papers)</w:t>
@@ -1060,6 +1379,7 @@
     <w:p>
       <w:pPr>
         <w:rPr>
+          <w:rFonts w:hint="eastAsia"/>
           <w:b/>
           <w:bCs/>
         </w:rPr>
@@ -1073,6 +1393,11 @@
       </w:r>
     </w:p>
     <w:p>
+      <w:pPr>
+        <w:rPr>
+          <w:rFonts w:hint="eastAsia"/>
+        </w:rPr>
+      </w:pPr>
       <w:r>
         <w:rPr>
           <w:b/>
@@ -1092,6 +1417,11 @@
       </w:r>
     </w:p>
     <w:p>
+      <w:pPr>
+        <w:rPr>
+          <w:rFonts w:hint="eastAsia"/>
+        </w:rPr>
+      </w:pPr>
       <w:r>
         <w:t>Include the following content and figures:</w:t>
       </w:r>
@@ -1102,6 +1432,9 @@
           <w:ilvl w:val="0"/>
           <w:numId w:val="3"/>
         </w:numPr>
+        <w:rPr>
+          <w:rFonts w:hint="eastAsia"/>
+        </w:rPr>
       </w:pPr>
       <w:r>
         <w:t>Dataset statistics: total samples, train/dev/test split sizes, source (PubMedQA PQA-L, 1000 labelled samples)</w:t>
@@ -1113,6 +1446,9 @@
           <w:ilvl w:val="0"/>
           <w:numId w:val="3"/>
         </w:numPr>
+        <w:rPr>
+          <w:rFonts w:hint="eastAsia"/>
+        </w:rPr>
       </w:pPr>
       <w:r>
         <w:rPr>
@@ -1131,6 +1467,9 @@
           <w:ilvl w:val="0"/>
           <w:numId w:val="3"/>
         </w:numPr>
+        <w:rPr>
+          <w:rFonts w:hint="eastAsia"/>
+        </w:rPr>
       </w:pPr>
       <w:r>
         <w:rPr>
@@ -1149,6 +1488,9 @@
           <w:ilvl w:val="0"/>
           <w:numId w:val="3"/>
         </w:numPr>
+        <w:rPr>
+          <w:rFonts w:hint="eastAsia"/>
+        </w:rPr>
       </w:pPr>
       <w:r>
         <w:t>Observations about question structure (e.g., most questions are polar, abstractive context length varies)</w:t>
@@ -1160,6 +1502,9 @@
           <w:ilvl w:val="0"/>
           <w:numId w:val="3"/>
         </w:numPr>
+        <w:rPr>
+          <w:rFonts w:hint="eastAsia"/>
+        </w:rPr>
       </w:pPr>
       <w:r>
         <w:t>Note any patterns relevant to downstream difficulty (e.g., "maybe" class sparsity, long-context samples)</w:t>
@@ -1168,6 +1513,7 @@
     <w:p>
       <w:pPr>
         <w:rPr>
+          <w:rFonts w:hint="eastAsia"/>
           <w:b/>
           <w:bCs/>
         </w:rPr>
@@ -1181,6 +1527,11 @@
       </w:r>
     </w:p>
     <w:p>
+      <w:pPr>
+        <w:rPr>
+          <w:rFonts w:hint="eastAsia"/>
+        </w:rPr>
+      </w:pPr>
       <w:r>
         <w:rPr>
           <w:b/>
@@ -1205,6 +1556,9 @@
           <w:ilvl w:val="0"/>
           <w:numId w:val="4"/>
         </w:numPr>
+        <w:rPr>
+          <w:rFonts w:hint="eastAsia"/>
+        </w:rPr>
       </w:pPr>
       <w:r>
         <w:t>Define the task formally as a 3-class classification problem: given (question, context) → label ∈ {yes, no, maybe}</w:t>
@@ -1216,6 +1570,9 @@
           <w:ilvl w:val="0"/>
           <w:numId w:val="4"/>
         </w:numPr>
+        <w:rPr>
+          <w:rFonts w:hint="eastAsia"/>
+        </w:rPr>
       </w:pPr>
       <w:r>
         <w:t xml:space="preserve">Present a pipeline diagram showing the two design axes as a matrix: </w:t>
@@ -1237,21 +1594,30 @@
           <w:ilvl w:val="0"/>
           <w:numId w:val="4"/>
         </w:numPr>
+        <w:rPr>
+          <w:rFonts w:hint="eastAsia"/>
+        </w:rPr>
       </w:pPr>
       <w:r>
         <w:t>State the evaluation protocol briefly (fixed test set, same metrics across all pipelines)</w:t>
       </w:r>
     </w:p>
     <w:p>
+      <w:pPr>
+        <w:rPr>
+          <w:rFonts w:hint="eastAsia"/>
+        </w:rPr>
+      </w:pPr>
       <w:r>
         <w:pict w14:anchorId="0ECF4EFF">
-          <v:rect id="_x0000_i1070" style="width:0;height:1.5pt" o:hralign="center" o:hrstd="t" o:hr="t" fillcolor="#a0a0a0" stroked="f"/>
+          <v:rect id="_x0000_i1028" style="width:0;height:1.5pt" o:hralign="center" o:hrstd="t" o:hr="t" fillcolor="#a0a0a0" stroked="f"/>
         </w:pict>
       </w:r>
     </w:p>
     <w:p>
       <w:pPr>
         <w:rPr>
+          <w:rFonts w:hint="eastAsia"/>
           <w:b/>
           <w:bCs/>
         </w:rPr>
@@ -1265,6 +1631,11 @@
       </w:r>
     </w:p>
     <w:p>
+      <w:pPr>
+        <w:rPr>
+          <w:rFonts w:hint="eastAsia"/>
+        </w:rPr>
+      </w:pPr>
       <w:r>
         <w:rPr>
           <w:b/>
@@ -1276,6 +1647,7 @@
     <w:p>
       <w:pPr>
         <w:rPr>
+          <w:rFonts w:hint="eastAsia"/>
           <w:b/>
           <w:bCs/>
         </w:rPr>
@@ -1289,6 +1661,11 @@
       </w:r>
     </w:p>
     <w:p>
+      <w:pPr>
+        <w:rPr>
+          <w:rFonts w:hint="eastAsia"/>
+        </w:rPr>
+      </w:pPr>
       <w:r>
         <w:rPr>
           <w:b/>
@@ -1308,6 +1685,11 @@
       </w:r>
     </w:p>
     <w:p>
+      <w:pPr>
+        <w:rPr>
+          <w:rFonts w:hint="eastAsia"/>
+        </w:rPr>
+      </w:pPr>
       <w:r>
         <w:t>Describe the three preprocessing pipelines and justify why they differ:</w:t>
       </w:r>
@@ -1342,6 +1724,7 @@
           <w:p>
             <w:pPr>
               <w:rPr>
+                <w:rFonts w:hint="eastAsia"/>
                 <w:b/>
                 <w:bCs/>
               </w:rPr>
@@ -1364,6 +1747,7 @@
           <w:p>
             <w:pPr>
               <w:rPr>
+                <w:rFonts w:hint="eastAsia"/>
                 <w:b/>
                 <w:bCs/>
               </w:rPr>
@@ -1389,6 +1773,11 @@
             <w:hideMark/>
           </w:tcPr>
           <w:p>
+            <w:pPr>
+              <w:rPr>
+                <w:rFonts w:hint="eastAsia"/>
+              </w:rPr>
+            </w:pPr>
             <w:r>
               <w:t>TF-IDF</w:t>
             </w:r>
@@ -1401,6 +1790,11 @@
             <w:hideMark/>
           </w:tcPr>
           <w:p>
+            <w:pPr>
+              <w:rPr>
+                <w:rFonts w:hint="eastAsia"/>
+              </w:rPr>
+            </w:pPr>
             <w:r>
               <w:t>Lowercasing, punctuation removal, stopword removal, stemming; MeSH terms appended as string suffix for the +MeSH variant</w:t>
             </w:r>
@@ -1418,6 +1812,11 @@
             <w:hideMark/>
           </w:tcPr>
           <w:p>
+            <w:pPr>
+              <w:rPr>
+                <w:rFonts w:hint="eastAsia"/>
+              </w:rPr>
+            </w:pPr>
             <w:r>
               <w:t>BioWordVec</w:t>
             </w:r>
@@ -1430,6 +1829,11 @@
             <w:hideMark/>
           </w:tcPr>
           <w:p>
+            <w:pPr>
+              <w:rPr>
+                <w:rFonts w:hint="eastAsia"/>
+              </w:rPr>
+            </w:pPr>
             <w:r>
               <w:t xml:space="preserve">Lowercasing, punctuation removal only — </w:t>
             </w:r>
@@ -1457,6 +1861,11 @@
             <w:hideMark/>
           </w:tcPr>
           <w:p>
+            <w:pPr>
+              <w:rPr>
+                <w:rFonts w:hint="eastAsia"/>
+              </w:rPr>
+            </w:pPr>
             <w:r>
               <w:t>PubMedBERT</w:t>
             </w:r>
@@ -1469,6 +1878,11 @@
             <w:hideMark/>
           </w:tcPr>
           <w:p>
+            <w:pPr>
+              <w:rPr>
+                <w:rFonts w:hint="eastAsia"/>
+              </w:rPr>
+            </w:pPr>
             <w:r>
               <w:t>Raw text passed directly; tokenisation handled by HuggingFace tokeniser; truncation="only_second" to preserve the full question</w:t>
             </w:r>
@@ -1482,6 +1896,9 @@
           <w:ilvl w:val="0"/>
           <w:numId w:val="5"/>
         </w:numPr>
+        <w:rPr>
+          <w:rFonts w:hint="eastAsia"/>
+        </w:rPr>
       </w:pPr>
       <w:r>
         <w:t>Note that all CONTEXTS sections are concatenated regardless of label type</w:t>
@@ -1493,6 +1910,9 @@
           <w:ilvl w:val="0"/>
           <w:numId w:val="5"/>
         </w:numPr>
+        <w:rPr>
+          <w:rFonts w:hint="eastAsia"/>
+        </w:rPr>
       </w:pPr>
       <w:r>
         <w:t>Note that preprocessed data is not persisted to disk; reprocessed at runtime</w:t>
@@ -1501,6 +1921,7 @@
     <w:p>
       <w:pPr>
         <w:rPr>
+          <w:rFonts w:hint="eastAsia"/>
           <w:b/>
           <w:bCs/>
         </w:rPr>
@@ -1514,6 +1935,11 @@
       </w:r>
     </w:p>
     <w:p>
+      <w:pPr>
+        <w:rPr>
+          <w:rFonts w:hint="eastAsia"/>
+        </w:rPr>
+      </w:pPr>
       <w:r>
         <w:rPr>
           <w:b/>
@@ -1538,6 +1964,9 @@
           <w:ilvl w:val="0"/>
           <w:numId w:val="6"/>
         </w:numPr>
+        <w:rPr>
+          <w:rFonts w:hint="eastAsia"/>
+        </w:rPr>
       </w:pPr>
       <w:r>
         <w:t>System: TF-IDF + Logistic Regression</w:t>
@@ -1549,6 +1978,9 @@
           <w:ilvl w:val="0"/>
           <w:numId w:val="6"/>
         </w:numPr>
+        <w:rPr>
+          <w:rFonts w:hint="eastAsia"/>
+        </w:rPr>
       </w:pPr>
       <w:r>
         <w:lastRenderedPageBreak/>
@@ -1561,6 +1993,9 @@
           <w:ilvl w:val="0"/>
           <w:numId w:val="6"/>
         </w:numPr>
+        <w:rPr>
+          <w:rFonts w:hint="eastAsia"/>
+        </w:rPr>
       </w:pPr>
       <w:r>
         <w:t>State key parameters (e.g., max features, regularisation)</w:t>
@@ -1572,6 +2007,9 @@
           <w:ilvl w:val="0"/>
           <w:numId w:val="6"/>
         </w:numPr>
+        <w:rPr>
+          <w:rFonts w:hint="eastAsia"/>
+        </w:rPr>
       </w:pPr>
       <w:r>
         <w:t>State the hypothesis: this establishes a lower-bound for domain-specific methods to improve upon</w:t>
@@ -1580,6 +2018,7 @@
     <w:p>
       <w:pPr>
         <w:rPr>
+          <w:rFonts w:hint="eastAsia"/>
           <w:b/>
           <w:bCs/>
         </w:rPr>
@@ -1593,6 +2032,11 @@
       </w:r>
     </w:p>
     <w:p>
+      <w:pPr>
+        <w:rPr>
+          <w:rFonts w:hint="eastAsia"/>
+        </w:rPr>
+      </w:pPr>
       <w:r>
         <w:rPr>
           <w:b/>
@@ -1612,11 +2056,21 @@
       </w:r>
     </w:p>
     <w:p>
+      <w:pPr>
+        <w:rPr>
+          <w:rFonts w:hint="eastAsia"/>
+        </w:rPr>
+      </w:pPr>
       <w:r>
         <w:t>Begin with a short paragraph (~0.15p) motivating the axis: the hypothesis that increasing domain specificity and representational richness (from sparse bag-of-words → dense static embeddings → contextual embeddings) will progressively improve classification performance on biomedical text.</w:t>
       </w:r>
     </w:p>
     <w:p>
+      <w:pPr>
+        <w:rPr>
+          <w:rFonts w:hint="eastAsia"/>
+        </w:rPr>
+      </w:pPr>
       <w:r>
         <w:rPr>
           <w:b/>
@@ -1631,6 +2085,9 @@
           <w:ilvl w:val="0"/>
           <w:numId w:val="7"/>
         </w:numPr>
+        <w:rPr>
+          <w:rFonts w:hint="eastAsia"/>
+        </w:rPr>
       </w:pPr>
       <w:r>
         <w:t>Sparse bag-of-words representation; n-gram range; IDF weighting</w:t>
@@ -1642,6 +2099,9 @@
           <w:ilvl w:val="0"/>
           <w:numId w:val="7"/>
         </w:numPr>
+        <w:rPr>
+          <w:rFonts w:hint="eastAsia"/>
+        </w:rPr>
       </w:pPr>
       <w:r>
         <w:t>MeSH variant: controlled medical vocabulary appended to enrich domain signal</w:t>
@@ -1653,12 +2113,20 @@
           <w:ilvl w:val="0"/>
           <w:numId w:val="7"/>
         </w:numPr>
+        <w:rPr>
+          <w:rFonts w:hint="eastAsia"/>
+        </w:rPr>
       </w:pPr>
       <w:r>
         <w:t>Hypothesis: MeSH terms encode domain knowledge absent from raw text; the +MeSH variant should outperform plain TF-IDF</w:t>
       </w:r>
     </w:p>
     <w:p>
+      <w:pPr>
+        <w:rPr>
+          <w:rFonts w:hint="eastAsia"/>
+        </w:rPr>
+      </w:pPr>
       <w:r>
         <w:rPr>
           <w:b/>
@@ -1673,6 +2141,9 @@
           <w:ilvl w:val="0"/>
           <w:numId w:val="8"/>
         </w:numPr>
+        <w:rPr>
+          <w:rFonts w:hint="eastAsia"/>
+        </w:rPr>
       </w:pPr>
       <w:r>
         <w:t>fastText-based static word embeddings trained on PubMed + MIMIC-III (200-dim)</w:t>
@@ -1684,6 +2155,9 @@
           <w:ilvl w:val="0"/>
           <w:numId w:val="8"/>
         </w:numPr>
+        <w:rPr>
+          <w:rFonts w:hint="eastAsia"/>
+        </w:rPr>
       </w:pPr>
       <w:r>
         <w:t>Document representation: mean-pooling over word vectors</w:t>
@@ -1695,12 +2169,20 @@
           <w:ilvl w:val="0"/>
           <w:numId w:val="8"/>
         </w:numPr>
+        <w:rPr>
+          <w:rFonts w:hint="eastAsia"/>
+        </w:rPr>
       </w:pPr>
       <w:r>
         <w:t>Hypothesis: dense biomedical embeddings will capture semantic similarity between terms better than sparse TF-IDF, especially for rare biomedical terminology</w:t>
       </w:r>
     </w:p>
     <w:p>
+      <w:pPr>
+        <w:rPr>
+          <w:rFonts w:hint="eastAsia"/>
+        </w:rPr>
+      </w:pPr>
       <w:r>
         <w:rPr>
           <w:b/>
@@ -1715,6 +2197,9 @@
           <w:ilvl w:val="0"/>
           <w:numId w:val="9"/>
         </w:numPr>
+        <w:rPr>
+          <w:rFonts w:hint="eastAsia"/>
+        </w:rPr>
       </w:pPr>
       <w:r>
         <w:t>Pretrained exclusively on PubMed abstracts (microsoft/BiomedNLP-BiomedBERT-base-uncased-abstract)</w:t>
@@ -1726,6 +2211,9 @@
           <w:ilvl w:val="0"/>
           <w:numId w:val="9"/>
         </w:numPr>
+        <w:rPr>
+          <w:rFonts w:hint="eastAsia"/>
+        </w:rPr>
       </w:pPr>
       <w:r>
         <w:t>Input construction: [CLS] question [SEP] context [SEP]; truncation applied to context only (truncation="only_second")</w:t>
@@ -1737,6 +2225,9 @@
           <w:ilvl w:val="0"/>
           <w:numId w:val="9"/>
         </w:numPr>
+        <w:rPr>
+          <w:rFonts w:hint="eastAsia"/>
+        </w:rPr>
       </w:pPr>
       <w:r>
         <w:t>Hypothesis: contextual representations from a domain-specific pretrained model will best capture the interaction between question and context, yielding the highest classification performance</w:t>
@@ -1745,6 +2236,7 @@
     <w:p>
       <w:pPr>
         <w:rPr>
+          <w:rFonts w:hint="eastAsia"/>
           <w:b/>
           <w:bCs/>
         </w:rPr>
@@ -1758,6 +2250,11 @@
       </w:r>
     </w:p>
     <w:p>
+      <w:pPr>
+        <w:rPr>
+          <w:rFonts w:hint="eastAsia"/>
+        </w:rPr>
+      </w:pPr>
       <w:r>
         <w:rPr>
           <w:b/>
@@ -1777,11 +2274,21 @@
       </w:r>
     </w:p>
     <w:p>
+      <w:pPr>
+        <w:rPr>
+          <w:rFonts w:hint="eastAsia"/>
+        </w:rPr>
+      </w:pPr>
       <w:r>
         <w:t>Begin with a short paragraph motivating the axis: the hypothesis that a non-linear classifier (MLP) will better capture complex feature interactions compared to a linear kernel SVM, especially for higher-dimensional or denser representations.</w:t>
       </w:r>
     </w:p>
     <w:p>
+      <w:pPr>
+        <w:rPr>
+          <w:rFonts w:hint="eastAsia"/>
+        </w:rPr>
+      </w:pPr>
       <w:r>
         <w:rPr>
           <w:b/>
@@ -1796,6 +2303,9 @@
           <w:ilvl w:val="0"/>
           <w:numId w:val="10"/>
         </w:numPr>
+        <w:rPr>
+          <w:rFonts w:hint="eastAsia"/>
+        </w:rPr>
       </w:pPr>
       <w:r>
         <w:t>Kernel choice and justification</w:t>
@@ -1807,6 +2317,9 @@
           <w:ilvl w:val="0"/>
           <w:numId w:val="10"/>
         </w:numPr>
+        <w:rPr>
+          <w:rFonts w:hint="eastAsia"/>
+        </w:rPr>
       </w:pPr>
       <w:r>
         <w:t>Regularisation parameter C; note class-weight balancing given label imbalance</w:t>
@@ -1818,12 +2331,20 @@
           <w:ilvl w:val="0"/>
           <w:numId w:val="10"/>
         </w:numPr>
+        <w:rPr>
+          <w:rFonts w:hint="eastAsia"/>
+        </w:rPr>
       </w:pPr>
       <w:r>
         <w:t>Note: BERT + SVM pipeline was not implemented. Justify briefly: given BERT produces contextual sequence embeddings (not a fixed-size feature vector in the traditional sense), integrating it with a standard SVM requires a pooling step that introduces additional design choices outside the scope of this study; the BERT pipeline is instead evaluated with MLP only.</w:t>
       </w:r>
     </w:p>
     <w:p>
+      <w:pPr>
+        <w:rPr>
+          <w:rFonts w:hint="eastAsia"/>
+        </w:rPr>
+      </w:pPr>
       <w:r>
         <w:rPr>
           <w:b/>
@@ -1838,6 +2359,9 @@
           <w:ilvl w:val="0"/>
           <w:numId w:val="11"/>
         </w:numPr>
+        <w:rPr>
+          <w:rFonts w:hint="eastAsia"/>
+        </w:rPr>
       </w:pPr>
       <w:r>
         <w:t>Architecture: number of layers, hidden dimensions, activation functions</w:t>
@@ -1849,6 +2373,9 @@
           <w:ilvl w:val="0"/>
           <w:numId w:val="11"/>
         </w:numPr>
+        <w:rPr>
+          <w:rFonts w:hint="eastAsia"/>
+        </w:rPr>
       </w:pPr>
       <w:r>
         <w:lastRenderedPageBreak/>
@@ -1861,6 +2388,9 @@
           <w:ilvl w:val="0"/>
           <w:numId w:val="11"/>
         </w:numPr>
+        <w:rPr>
+          <w:rFonts w:hint="eastAsia"/>
+        </w:rPr>
       </w:pPr>
       <w:r>
         <w:t>Note MLP hyperparameter tuning conducted for BioWordVec pipeline (Haoran); describe the search space and criterion</w:t>
@@ -1869,6 +2399,7 @@
     <w:p>
       <w:pPr>
         <w:rPr>
+          <w:rFonts w:hint="eastAsia"/>
           <w:b/>
           <w:bCs/>
         </w:rPr>
@@ -1882,6 +2413,11 @@
       </w:r>
     </w:p>
     <w:p>
+      <w:pPr>
+        <w:rPr>
+          <w:rFonts w:hint="eastAsia"/>
+        </w:rPr>
+      </w:pPr>
       <w:r>
         <w:rPr>
           <w:b/>
@@ -1901,6 +2437,11 @@
       </w:r>
     </w:p>
     <w:p>
+      <w:pPr>
+        <w:rPr>
+          <w:rFonts w:hint="eastAsia"/>
+        </w:rPr>
+      </w:pPr>
       <w:r>
         <w:t xml:space="preserve">Position this section clearly: BioGPT is evaluated as a </w:t>
       </w:r>
@@ -1916,6 +2457,11 @@
       </w:r>
     </w:p>
     <w:p>
+      <w:pPr>
+        <w:rPr>
+          <w:rFonts w:hint="eastAsia"/>
+        </w:rPr>
+      </w:pPr>
       <w:r>
         <w:rPr>
           <w:b/>
@@ -1930,6 +2476,9 @@
           <w:ilvl w:val="0"/>
           <w:numId w:val="12"/>
         </w:numPr>
+        <w:rPr>
+          <w:rFonts w:hint="eastAsia"/>
+        </w:rPr>
       </w:pPr>
       <w:r>
         <w:t>Model: microsoft/biogpt; pre-trained only, no PubMedQA exposure</w:t>
@@ -1941,6 +2490,9 @@
           <w:ilvl w:val="0"/>
           <w:numId w:val="12"/>
         </w:numPr>
+        <w:rPr>
+          <w:rFonts w:hint="eastAsia"/>
+        </w:rPr>
       </w:pPr>
       <w:r>
         <w:t>Classification via logit scoring: the log-probability of the first token for each candidate label (yes / no / maybe) is used as the score; the highest-scoring label is selected</w:t>
@@ -1952,6 +2504,9 @@
           <w:ilvl w:val="0"/>
           <w:numId w:val="12"/>
         </w:numPr>
+        <w:rPr>
+          <w:rFonts w:hint="eastAsia"/>
+        </w:rPr>
       </w:pPr>
       <w:r>
         <w:t>Input: natural language prompt (question + concatenated context), max 1024 tokens</w:t>
@@ -1963,12 +2518,20 @@
           <w:ilvl w:val="0"/>
           <w:numId w:val="12"/>
         </w:numPr>
+        <w:rPr>
+          <w:rFonts w:hint="eastAsia"/>
+        </w:rPr>
       </w:pPr>
       <w:r>
         <w:t>No training required; this tests whether domain-pretrained biomedical language knowledge alone is sufficient</w:t>
       </w:r>
     </w:p>
     <w:p>
+      <w:pPr>
+        <w:rPr>
+          <w:rFonts w:hint="eastAsia"/>
+        </w:rPr>
+      </w:pPr>
       <w:r>
         <w:rPr>
           <w:b/>
@@ -1983,6 +2546,9 @@
           <w:ilvl w:val="0"/>
           <w:numId w:val="13"/>
         </w:numPr>
+        <w:rPr>
+          <w:rFonts w:hint="eastAsia"/>
+        </w:rPr>
       </w:pPr>
       <w:r>
         <w:t>Model: same BioGPT architecture, parameter-efficient fine-tuning via LoRA</w:t>
@@ -1994,6 +2560,9 @@
           <w:ilvl w:val="0"/>
           <w:numId w:val="13"/>
         </w:numPr>
+        <w:rPr>
+          <w:rFonts w:hint="eastAsia"/>
+        </w:rPr>
       </w:pPr>
       <w:r>
         <w:t>Training data: PubMedQA train split</w:t>
@@ -2005,6 +2574,9 @@
           <w:ilvl w:val="0"/>
           <w:numId w:val="13"/>
         </w:numPr>
+        <w:rPr>
+          <w:rFonts w:hint="eastAsia"/>
+        </w:rPr>
       </w:pPr>
       <w:r>
         <w:t>Describe LoRA rank, target modules, training setup</w:t>
@@ -2016,21 +2588,30 @@
           <w:ilvl w:val="0"/>
           <w:numId w:val="13"/>
         </w:numPr>
+        <w:rPr>
+          <w:rFonts w:hint="eastAsia"/>
+        </w:rPr>
       </w:pPr>
       <w:r>
         <w:t>Note: prior adjustment not applied to LoRA results at this stage (to be discussed in limitations)</w:t>
       </w:r>
     </w:p>
     <w:p>
+      <w:pPr>
+        <w:rPr>
+          <w:rFonts w:hint="eastAsia"/>
+        </w:rPr>
+      </w:pPr>
       <w:r>
         <w:pict w14:anchorId="42163745">
-          <v:rect id="_x0000_i1071" style="width:0;height:1.5pt" o:hralign="center" o:hrstd="t" o:hr="t" fillcolor="#a0a0a0" stroked="f"/>
+          <v:rect id="_x0000_i1029" style="width:0;height:1.5pt" o:hralign="center" o:hrstd="t" o:hr="t" fillcolor="#a0a0a0" stroked="f"/>
         </w:pict>
       </w:r>
     </w:p>
     <w:p>
       <w:pPr>
         <w:rPr>
+          <w:rFonts w:hint="eastAsia"/>
           <w:b/>
           <w:bCs/>
         </w:rPr>
@@ -2044,6 +2625,11 @@
       </w:r>
     </w:p>
     <w:p>
+      <w:pPr>
+        <w:rPr>
+          <w:rFonts w:hint="eastAsia"/>
+        </w:rPr>
+      </w:pPr>
       <w:r>
         <w:rPr>
           <w:b/>
@@ -2055,6 +2641,7 @@
     <w:p>
       <w:pPr>
         <w:rPr>
+          <w:rFonts w:hint="eastAsia"/>
           <w:b/>
           <w:bCs/>
         </w:rPr>
@@ -2068,6 +2655,11 @@
       </w:r>
     </w:p>
     <w:p>
+      <w:pPr>
+        <w:rPr>
+          <w:rFonts w:hint="eastAsia"/>
+        </w:rPr>
+      </w:pPr>
       <w:r>
         <w:rPr>
           <w:b/>
@@ -2092,6 +2684,9 @@
           <w:ilvl w:val="0"/>
           <w:numId w:val="14"/>
         </w:numPr>
+        <w:rPr>
+          <w:rFonts w:hint="eastAsia"/>
+        </w:rPr>
       </w:pPr>
       <w:r>
         <w:rPr>
@@ -2110,6 +2705,9 @@
           <w:ilvl w:val="0"/>
           <w:numId w:val="14"/>
         </w:numPr>
+        <w:rPr>
+          <w:rFonts w:hint="eastAsia"/>
+        </w:rPr>
       </w:pPr>
       <w:r>
         <w:rPr>
@@ -2138,6 +2736,9 @@
           <w:ilvl w:val="0"/>
           <w:numId w:val="14"/>
         </w:numPr>
+        <w:rPr>
+          <w:rFonts w:hint="eastAsia"/>
+        </w:rPr>
       </w:pPr>
       <w:r>
         <w:rPr>
@@ -2156,6 +2757,9 @@
           <w:ilvl w:val="0"/>
           <w:numId w:val="14"/>
         </w:numPr>
+        <w:rPr>
+          <w:rFonts w:hint="eastAsia"/>
+        </w:rPr>
       </w:pPr>
       <w:r>
         <w:t>Briefly justify why Macro F1 is preferred over Weighted F1 here: the "maybe" class is clinically meaningful and should not be down-weighted</w:t>
@@ -2164,6 +2768,7 @@
     <w:p>
       <w:pPr>
         <w:rPr>
+          <w:rFonts w:hint="eastAsia"/>
           <w:b/>
           <w:bCs/>
         </w:rPr>
@@ -2177,6 +2782,11 @@
       </w:r>
     </w:p>
     <w:p>
+      <w:pPr>
+        <w:rPr>
+          <w:rFonts w:hint="eastAsia"/>
+        </w:rPr>
+      </w:pPr>
       <w:r>
         <w:rPr>
           <w:b/>
@@ -2196,6 +2806,11 @@
       </w:r>
     </w:p>
     <w:p>
+      <w:pPr>
+        <w:rPr>
+          <w:rFonts w:hint="eastAsia"/>
+        </w:rPr>
+      </w:pPr>
       <w:r>
         <w:t>Present as a concise table or structured paragraph:</w:t>
       </w:r>
@@ -2206,6 +2821,9 @@
           <w:ilvl w:val="0"/>
           <w:numId w:val="15"/>
         </w:numPr>
+        <w:rPr>
+          <w:rFonts w:hint="eastAsia"/>
+        </w:rPr>
       </w:pPr>
       <w:r>
         <w:t>Dataset splits: pqal_fold0 train and dev; fixed test set (500 samples); test labels from test_ground_truth.json</w:t>
@@ -2217,6 +2835,9 @@
           <w:ilvl w:val="0"/>
           <w:numId w:val="15"/>
         </w:numPr>
+        <w:rPr>
+          <w:rFonts w:hint="eastAsia"/>
+        </w:rPr>
       </w:pPr>
       <w:r>
         <w:t>Each person adds their key hyperparameters (model name / HuggingFace link, learning rate, batch size, etc.)</w:t>
@@ -2228,6 +2849,9 @@
           <w:ilvl w:val="0"/>
           <w:numId w:val="15"/>
         </w:numPr>
+        <w:rPr>
+          <w:rFonts w:hint="eastAsia"/>
+        </w:rPr>
       </w:pPr>
       <w:r>
         <w:t>Hardware / runtime notes where relevant (e.g., BioGPT inference: ~3m 43s for 500 samples on CUDA)</w:t>
@@ -2239,6 +2863,9 @@
           <w:ilvl w:val="0"/>
           <w:numId w:val="15"/>
         </w:numPr>
+        <w:rPr>
+          <w:rFonts w:hint="eastAsia"/>
+        </w:rPr>
       </w:pPr>
       <w:r>
         <w:t>Random seeds fixed for reproducibility</w:t>
@@ -2247,6 +2874,7 @@
     <w:p>
       <w:pPr>
         <w:rPr>
+          <w:rFonts w:hint="eastAsia"/>
           <w:b/>
           <w:bCs/>
         </w:rPr>
@@ -2260,6 +2888,11 @@
       </w:r>
     </w:p>
     <w:p>
+      <w:pPr>
+        <w:rPr>
+          <w:rFonts w:hint="eastAsia"/>
+        </w:rPr>
+      </w:pPr>
       <w:r>
         <w:rPr>
           <w:b/>
@@ -2289,6 +2922,7 @@
     <w:p>
       <w:pPr>
         <w:rPr>
+          <w:rFonts w:hint="eastAsia"/>
           <w:b/>
           <w:bCs/>
         </w:rPr>
@@ -2302,6 +2936,11 @@
       </w:r>
     </w:p>
     <w:p>
+      <w:pPr>
+        <w:rPr>
+          <w:rFonts w:hint="eastAsia"/>
+        </w:rPr>
+      </w:pPr>
       <w:r>
         <w:t xml:space="preserve">Present a </w:t>
       </w:r>
@@ -2329,14 +2968,14 @@
         <w:tblLook w:val="04A0" w:firstRow="1" w:lastRow="0" w:firstColumn="1" w:lastColumn="0" w:noHBand="0" w:noVBand="1"/>
       </w:tblPr>
       <w:tblGrid>
-        <w:gridCol w:w="1606"/>
+        <w:gridCol w:w="1598"/>
         <w:gridCol w:w="1507"/>
-        <w:gridCol w:w="1187"/>
+        <w:gridCol w:w="1185"/>
         <w:gridCol w:w="914"/>
-        <w:gridCol w:w="891"/>
-        <w:gridCol w:w="635"/>
-        <w:gridCol w:w="587"/>
-        <w:gridCol w:w="979"/>
+        <w:gridCol w:w="888"/>
+        <w:gridCol w:w="643"/>
+        <w:gridCol w:w="595"/>
+        <w:gridCol w:w="976"/>
       </w:tblGrid>
       <w:tr>
         <w:trPr>
@@ -2352,6 +2991,7 @@
           <w:p>
             <w:pPr>
               <w:rPr>
+                <w:rFonts w:hint="eastAsia"/>
                 <w:b/>
                 <w:bCs/>
               </w:rPr>
@@ -2374,6 +3014,7 @@
           <w:p>
             <w:pPr>
               <w:rPr>
+                <w:rFonts w:hint="eastAsia"/>
                 <w:b/>
                 <w:bCs/>
               </w:rPr>
@@ -2396,6 +3037,7 @@
           <w:p>
             <w:pPr>
               <w:rPr>
+                <w:rFonts w:hint="eastAsia"/>
                 <w:b/>
                 <w:bCs/>
               </w:rPr>
@@ -2418,6 +3060,7 @@
           <w:p>
             <w:pPr>
               <w:rPr>
+                <w:rFonts w:hint="eastAsia"/>
                 <w:b/>
                 <w:bCs/>
               </w:rPr>
@@ -2440,6 +3083,7 @@
           <w:p>
             <w:pPr>
               <w:rPr>
+                <w:rFonts w:hint="eastAsia"/>
                 <w:b/>
                 <w:bCs/>
               </w:rPr>
@@ -2462,6 +3106,7 @@
           <w:p>
             <w:pPr>
               <w:rPr>
+                <w:rFonts w:hint="eastAsia"/>
                 <w:b/>
                 <w:bCs/>
               </w:rPr>
@@ -2484,6 +3129,7 @@
           <w:p>
             <w:pPr>
               <w:rPr>
+                <w:rFonts w:hint="eastAsia"/>
                 <w:b/>
                 <w:bCs/>
               </w:rPr>
@@ -2506,6 +3152,7 @@
           <w:p>
             <w:pPr>
               <w:rPr>
+                <w:rFonts w:hint="eastAsia"/>
                 <w:b/>
                 <w:bCs/>
               </w:rPr>
@@ -2531,6 +3178,11 @@
             <w:hideMark/>
           </w:tcPr>
           <w:p>
+            <w:pPr>
+              <w:rPr>
+                <w:rFonts w:hint="eastAsia"/>
+              </w:rPr>
+            </w:pPr>
             <w:r>
               <w:t>Baseline</w:t>
             </w:r>
@@ -2543,6 +3195,11 @@
             <w:hideMark/>
           </w:tcPr>
           <w:p>
+            <w:pPr>
+              <w:rPr>
+                <w:rFonts w:hint="eastAsia"/>
+              </w:rPr>
+            </w:pPr>
             <w:r>
               <w:t>TF-IDF</w:t>
             </w:r>
@@ -2555,6 +3212,11 @@
             <w:hideMark/>
           </w:tcPr>
           <w:p>
+            <w:pPr>
+              <w:rPr>
+                <w:rFonts w:hint="eastAsia"/>
+              </w:rPr>
+            </w:pPr>
             <w:r>
               <w:t>Logistic Reg.</w:t>
             </w:r>
@@ -2567,6 +3229,11 @@
             <w:hideMark/>
           </w:tcPr>
           <w:p>
+            <w:pPr>
+              <w:rPr>
+                <w:rFonts w:hint="eastAsia"/>
+              </w:rPr>
+            </w:pPr>
             <w:r>
               <w:t>—</w:t>
             </w:r>
@@ -2579,6 +3246,11 @@
             <w:hideMark/>
           </w:tcPr>
           <w:p>
+            <w:pPr>
+              <w:rPr>
+                <w:rFonts w:hint="eastAsia"/>
+              </w:rPr>
+            </w:pPr>
             <w:r>
               <w:t>—</w:t>
             </w:r>
@@ -2591,6 +3263,11 @@
             <w:hideMark/>
           </w:tcPr>
           <w:p>
+            <w:pPr>
+              <w:rPr>
+                <w:rFonts w:hint="eastAsia"/>
+              </w:rPr>
+            </w:pPr>
             <w:r>
               <w:t>—</w:t>
             </w:r>
@@ -2603,6 +3280,11 @@
             <w:hideMark/>
           </w:tcPr>
           <w:p>
+            <w:pPr>
+              <w:rPr>
+                <w:rFonts w:hint="eastAsia"/>
+              </w:rPr>
+            </w:pPr>
             <w:r>
               <w:t>—</w:t>
             </w:r>
@@ -2615,6 +3297,11 @@
             <w:hideMark/>
           </w:tcPr>
           <w:p>
+            <w:pPr>
+              <w:rPr>
+                <w:rFonts w:hint="eastAsia"/>
+              </w:rPr>
+            </w:pPr>
             <w:r>
               <w:t>—</w:t>
             </w:r>
@@ -2632,30 +3319,51 @@
             <w:hideMark/>
           </w:tcPr>
           <w:p>
-            <w:r>
-              <w:t>P1</w:t>
-            </w:r>
-          </w:p>
-        </w:tc>
-        <w:tc>
-          <w:tcPr>
-            <w:tcW w:w="0" w:type="auto"/>
-            <w:vAlign w:val="center"/>
-            <w:hideMark/>
-          </w:tcPr>
-          <w:p>
-            <w:r>
-              <w:t>TF-IDF</w:t>
-            </w:r>
-          </w:p>
-        </w:tc>
-        <w:tc>
-          <w:tcPr>
-            <w:tcW w:w="0" w:type="auto"/>
-            <w:vAlign w:val="center"/>
-            <w:hideMark/>
-          </w:tcPr>
-          <w:p>
+            <w:pPr>
+              <w:rPr>
+                <w:rFonts w:hint="eastAsia"/>
+              </w:rPr>
+            </w:pPr>
+            <w:r>
+              <w:t>P</w:t>
+            </w:r>
+            <w:r>
+              <w:rPr>
+                <w:rFonts w:hint="eastAsia"/>
+              </w:rPr>
+              <w:t>1</w:t>
+            </w:r>
+          </w:p>
+        </w:tc>
+        <w:tc>
+          <w:tcPr>
+            <w:tcW w:w="0" w:type="auto"/>
+            <w:vAlign w:val="center"/>
+            <w:hideMark/>
+          </w:tcPr>
+          <w:p>
+            <w:pPr>
+              <w:rPr>
+                <w:rFonts w:hint="eastAsia"/>
+              </w:rPr>
+            </w:pPr>
+            <w:r>
+              <w:t>TF-IDF +MeSH</w:t>
+            </w:r>
+          </w:p>
+        </w:tc>
+        <w:tc>
+          <w:tcPr>
+            <w:tcW w:w="0" w:type="auto"/>
+            <w:vAlign w:val="center"/>
+            <w:hideMark/>
+          </w:tcPr>
+          <w:p>
+            <w:pPr>
+              <w:rPr>
+                <w:rFonts w:hint="eastAsia"/>
+              </w:rPr>
+            </w:pPr>
             <w:r>
               <w:t>SVM</w:t>
             </w:r>
@@ -2668,6 +3376,11 @@
             <w:hideMark/>
           </w:tcPr>
           <w:p>
+            <w:pPr>
+              <w:rPr>
+                <w:rFonts w:hint="eastAsia"/>
+              </w:rPr>
+            </w:pPr>
             <w:r>
               <w:t>—</w:t>
             </w:r>
@@ -2680,6 +3393,11 @@
             <w:hideMark/>
           </w:tcPr>
           <w:p>
+            <w:pPr>
+              <w:rPr>
+                <w:rFonts w:hint="eastAsia"/>
+              </w:rPr>
+            </w:pPr>
             <w:r>
               <w:t>—</w:t>
             </w:r>
@@ -2692,6 +3410,11 @@
             <w:hideMark/>
           </w:tcPr>
           <w:p>
+            <w:pPr>
+              <w:rPr>
+                <w:rFonts w:hint="eastAsia"/>
+              </w:rPr>
+            </w:pPr>
             <w:r>
               <w:t>—</w:t>
             </w:r>
@@ -2704,6 +3427,11 @@
             <w:hideMark/>
           </w:tcPr>
           <w:p>
+            <w:pPr>
+              <w:rPr>
+                <w:rFonts w:hint="eastAsia"/>
+              </w:rPr>
+            </w:pPr>
             <w:r>
               <w:t>—</w:t>
             </w:r>
@@ -2716,6 +3444,11 @@
             <w:hideMark/>
           </w:tcPr>
           <w:p>
+            <w:pPr>
+              <w:rPr>
+                <w:rFonts w:hint="eastAsia"/>
+              </w:rPr>
+            </w:pPr>
             <w:r>
               <w:t>—</w:t>
             </w:r>
@@ -2733,18 +3466,34 @@
             <w:hideMark/>
           </w:tcPr>
           <w:p>
-            <w:r>
-              <w:t>P2</w:t>
-            </w:r>
-          </w:p>
-        </w:tc>
-        <w:tc>
-          <w:tcPr>
-            <w:tcW w:w="0" w:type="auto"/>
-            <w:vAlign w:val="center"/>
-            <w:hideMark/>
-          </w:tcPr>
-          <w:p>
+            <w:pPr>
+              <w:rPr>
+                <w:rFonts w:hint="eastAsia"/>
+              </w:rPr>
+            </w:pPr>
+            <w:r>
+              <w:t>P</w:t>
+            </w:r>
+            <w:r>
+              <w:rPr>
+                <w:rFonts w:hint="eastAsia"/>
+              </w:rPr>
+              <w:t>2</w:t>
+            </w:r>
+          </w:p>
+        </w:tc>
+        <w:tc>
+          <w:tcPr>
+            <w:tcW w:w="0" w:type="auto"/>
+            <w:vAlign w:val="center"/>
+            <w:hideMark/>
+          </w:tcPr>
+          <w:p>
+            <w:pPr>
+              <w:rPr>
+                <w:rFonts w:hint="eastAsia"/>
+              </w:rPr>
+            </w:pPr>
             <w:r>
               <w:t>TF-IDF +MeSH</w:t>
             </w:r>
@@ -2757,18 +3506,28 @@
             <w:hideMark/>
           </w:tcPr>
           <w:p>
-            <w:r>
-              <w:t>SVM</w:t>
-            </w:r>
-          </w:p>
-        </w:tc>
-        <w:tc>
-          <w:tcPr>
-            <w:tcW w:w="0" w:type="auto"/>
-            <w:vAlign w:val="center"/>
-            <w:hideMark/>
-          </w:tcPr>
-          <w:p>
+            <w:pPr>
+              <w:rPr>
+                <w:rFonts w:hint="eastAsia"/>
+              </w:rPr>
+            </w:pPr>
+            <w:r>
+              <w:t>MLP</w:t>
+            </w:r>
+          </w:p>
+        </w:tc>
+        <w:tc>
+          <w:tcPr>
+            <w:tcW w:w="0" w:type="auto"/>
+            <w:vAlign w:val="center"/>
+            <w:hideMark/>
+          </w:tcPr>
+          <w:p>
+            <w:pPr>
+              <w:rPr>
+                <w:rFonts w:hint="eastAsia"/>
+              </w:rPr>
+            </w:pPr>
             <w:r>
               <w:t>—</w:t>
             </w:r>
@@ -2781,6 +3540,11 @@
             <w:hideMark/>
           </w:tcPr>
           <w:p>
+            <w:pPr>
+              <w:rPr>
+                <w:rFonts w:hint="eastAsia"/>
+              </w:rPr>
+            </w:pPr>
             <w:r>
               <w:t>—</w:t>
             </w:r>
@@ -2793,6 +3557,11 @@
             <w:hideMark/>
           </w:tcPr>
           <w:p>
+            <w:pPr>
+              <w:rPr>
+                <w:rFonts w:hint="eastAsia"/>
+              </w:rPr>
+            </w:pPr>
             <w:r>
               <w:t>—</w:t>
             </w:r>
@@ -2805,6 +3574,11 @@
             <w:hideMark/>
           </w:tcPr>
           <w:p>
+            <w:pPr>
+              <w:rPr>
+                <w:rFonts w:hint="eastAsia"/>
+              </w:rPr>
+            </w:pPr>
             <w:r>
               <w:t>—</w:t>
             </w:r>
@@ -2817,6 +3591,11 @@
             <w:hideMark/>
           </w:tcPr>
           <w:p>
+            <w:pPr>
+              <w:rPr>
+                <w:rFonts w:hint="eastAsia"/>
+              </w:rPr>
+            </w:pPr>
             <w:r>
               <w:t>—</w:t>
             </w:r>
@@ -2834,30 +3613,51 @@
             <w:hideMark/>
           </w:tcPr>
           <w:p>
-            <w:r>
-              <w:t>P3</w:t>
-            </w:r>
-          </w:p>
-        </w:tc>
-        <w:tc>
-          <w:tcPr>
-            <w:tcW w:w="0" w:type="auto"/>
-            <w:vAlign w:val="center"/>
-            <w:hideMark/>
-          </w:tcPr>
-          <w:p>
-            <w:r>
-              <w:t>TF-IDF</w:t>
-            </w:r>
-          </w:p>
-        </w:tc>
-        <w:tc>
-          <w:tcPr>
-            <w:tcW w:w="0" w:type="auto"/>
-            <w:vAlign w:val="center"/>
-            <w:hideMark/>
-          </w:tcPr>
-          <w:p>
+            <w:pPr>
+              <w:rPr>
+                <w:rFonts w:hint="eastAsia"/>
+              </w:rPr>
+            </w:pPr>
+            <w:r>
+              <w:t>P</w:t>
+            </w:r>
+            <w:r>
+              <w:rPr>
+                <w:rFonts w:hint="eastAsia"/>
+              </w:rPr>
+              <w:t>3</w:t>
+            </w:r>
+          </w:p>
+        </w:tc>
+        <w:tc>
+          <w:tcPr>
+            <w:tcW w:w="0" w:type="auto"/>
+            <w:vAlign w:val="center"/>
+            <w:hideMark/>
+          </w:tcPr>
+          <w:p>
+            <w:pPr>
+              <w:rPr>
+                <w:rFonts w:hint="eastAsia"/>
+              </w:rPr>
+            </w:pPr>
+            <w:r>
+              <w:t>BioWordVec</w:t>
+            </w:r>
+          </w:p>
+        </w:tc>
+        <w:tc>
+          <w:tcPr>
+            <w:tcW w:w="0" w:type="auto"/>
+            <w:vAlign w:val="center"/>
+            <w:hideMark/>
+          </w:tcPr>
+          <w:p>
+            <w:pPr>
+              <w:rPr>
+                <w:rFonts w:hint="eastAsia"/>
+              </w:rPr>
+            </w:pPr>
             <w:r>
               <w:t>MLP</w:t>
             </w:r>
@@ -2870,56 +3670,96 @@
             <w:hideMark/>
           </w:tcPr>
           <w:p>
-            <w:r>
-              <w:t>—</w:t>
-            </w:r>
-          </w:p>
-        </w:tc>
-        <w:tc>
-          <w:tcPr>
-            <w:tcW w:w="0" w:type="auto"/>
-            <w:vAlign w:val="center"/>
-            <w:hideMark/>
-          </w:tcPr>
-          <w:p>
-            <w:r>
-              <w:t>—</w:t>
-            </w:r>
-          </w:p>
-        </w:tc>
-        <w:tc>
-          <w:tcPr>
-            <w:tcW w:w="0" w:type="auto"/>
-            <w:vAlign w:val="center"/>
-            <w:hideMark/>
-          </w:tcPr>
-          <w:p>
-            <w:r>
-              <w:t>—</w:t>
-            </w:r>
-          </w:p>
-        </w:tc>
-        <w:tc>
-          <w:tcPr>
-            <w:tcW w:w="0" w:type="auto"/>
-            <w:vAlign w:val="center"/>
-            <w:hideMark/>
-          </w:tcPr>
-          <w:p>
-            <w:r>
-              <w:t>—</w:t>
-            </w:r>
-          </w:p>
-        </w:tc>
-        <w:tc>
-          <w:tcPr>
-            <w:tcW w:w="0" w:type="auto"/>
-            <w:vAlign w:val="center"/>
-            <w:hideMark/>
-          </w:tcPr>
-          <w:p>
-            <w:r>
-              <w:t>—</w:t>
+            <w:pPr>
+              <w:rPr>
+                <w:rFonts w:hint="eastAsia"/>
+              </w:rPr>
+            </w:pPr>
+            <w:r>
+              <w:rPr>
+                <w:rFonts w:hint="eastAsia"/>
+              </w:rPr>
+              <w:t>0.16</w:t>
+            </w:r>
+          </w:p>
+        </w:tc>
+        <w:tc>
+          <w:tcPr>
+            <w:tcW w:w="0" w:type="auto"/>
+            <w:vAlign w:val="center"/>
+            <w:hideMark/>
+          </w:tcPr>
+          <w:p>
+            <w:pPr>
+              <w:rPr>
+                <w:rFonts w:hint="eastAsia"/>
+              </w:rPr>
+            </w:pPr>
+            <w:r>
+              <w:rPr>
+                <w:rFonts w:hint="eastAsia"/>
+              </w:rPr>
+              <w:t>0.15</w:t>
+            </w:r>
+          </w:p>
+        </w:tc>
+        <w:tc>
+          <w:tcPr>
+            <w:tcW w:w="0" w:type="auto"/>
+            <w:vAlign w:val="center"/>
+            <w:hideMark/>
+          </w:tcPr>
+          <w:p>
+            <w:pPr>
+              <w:rPr>
+                <w:rFonts w:hint="eastAsia"/>
+              </w:rPr>
+            </w:pPr>
+            <w:r>
+              <w:rPr>
+                <w:rFonts w:hint="eastAsia"/>
+              </w:rPr>
+              <w:t>0</w:t>
+            </w:r>
+          </w:p>
+        </w:tc>
+        <w:tc>
+          <w:tcPr>
+            <w:tcW w:w="0" w:type="auto"/>
+            <w:vAlign w:val="center"/>
+            <w:hideMark/>
+          </w:tcPr>
+          <w:p>
+            <w:pPr>
+              <w:rPr>
+                <w:rFonts w:hint="eastAsia"/>
+              </w:rPr>
+            </w:pPr>
+            <w:r>
+              <w:rPr>
+                <w:rFonts w:hint="eastAsia"/>
+              </w:rPr>
+              <w:t>0.25</w:t>
+            </w:r>
+          </w:p>
+        </w:tc>
+        <w:tc>
+          <w:tcPr>
+            <w:tcW w:w="0" w:type="auto"/>
+            <w:vAlign w:val="center"/>
+            <w:hideMark/>
+          </w:tcPr>
+          <w:p>
+            <w:pPr>
+              <w:rPr>
+                <w:rFonts w:hint="eastAsia"/>
+              </w:rPr>
+            </w:pPr>
+            <w:r>
+              <w:rPr>
+                <w:rFonts w:hint="eastAsia"/>
+              </w:rPr>
+              <w:t>0.21</w:t>
             </w:r>
           </w:p>
         </w:tc>
@@ -2935,30 +3775,51 @@
             <w:hideMark/>
           </w:tcPr>
           <w:p>
-            <w:r>
-              <w:t>P4</w:t>
-            </w:r>
-          </w:p>
-        </w:tc>
-        <w:tc>
-          <w:tcPr>
-            <w:tcW w:w="0" w:type="auto"/>
-            <w:vAlign w:val="center"/>
-            <w:hideMark/>
-          </w:tcPr>
-          <w:p>
-            <w:r>
-              <w:t>TF-IDF +MeSH</w:t>
-            </w:r>
-          </w:p>
-        </w:tc>
-        <w:tc>
-          <w:tcPr>
-            <w:tcW w:w="0" w:type="auto"/>
-            <w:vAlign w:val="center"/>
-            <w:hideMark/>
-          </w:tcPr>
-          <w:p>
+            <w:pPr>
+              <w:rPr>
+                <w:rFonts w:hint="eastAsia"/>
+              </w:rPr>
+            </w:pPr>
+            <w:r>
+              <w:t>P</w:t>
+            </w:r>
+            <w:r>
+              <w:rPr>
+                <w:rFonts w:hint="eastAsia"/>
+              </w:rPr>
+              <w:t>4</w:t>
+            </w:r>
+          </w:p>
+        </w:tc>
+        <w:tc>
+          <w:tcPr>
+            <w:tcW w:w="0" w:type="auto"/>
+            <w:vAlign w:val="center"/>
+            <w:hideMark/>
+          </w:tcPr>
+          <w:p>
+            <w:pPr>
+              <w:rPr>
+                <w:rFonts w:hint="eastAsia"/>
+              </w:rPr>
+            </w:pPr>
+            <w:r>
+              <w:t>PubMedBERT</w:t>
+            </w:r>
+          </w:p>
+        </w:tc>
+        <w:tc>
+          <w:tcPr>
+            <w:tcW w:w="0" w:type="auto"/>
+            <w:vAlign w:val="center"/>
+            <w:hideMark/>
+          </w:tcPr>
+          <w:p>
+            <w:pPr>
+              <w:rPr>
+                <w:rFonts w:hint="eastAsia"/>
+              </w:rPr>
+            </w:pPr>
             <w:r>
               <w:t>MLP</w:t>
             </w:r>
@@ -2971,6 +3832,11 @@
             <w:hideMark/>
           </w:tcPr>
           <w:p>
+            <w:pPr>
+              <w:rPr>
+                <w:rFonts w:hint="eastAsia"/>
+              </w:rPr>
+            </w:pPr>
             <w:r>
               <w:t>—</w:t>
             </w:r>
@@ -2983,6 +3849,11 @@
             <w:hideMark/>
           </w:tcPr>
           <w:p>
+            <w:pPr>
+              <w:rPr>
+                <w:rFonts w:hint="eastAsia"/>
+              </w:rPr>
+            </w:pPr>
             <w:r>
               <w:t>—</w:t>
             </w:r>
@@ -2995,6 +3866,11 @@
             <w:hideMark/>
           </w:tcPr>
           <w:p>
+            <w:pPr>
+              <w:rPr>
+                <w:rFonts w:hint="eastAsia"/>
+              </w:rPr>
+            </w:pPr>
             <w:r>
               <w:t>—</w:t>
             </w:r>
@@ -3007,6 +3883,11 @@
             <w:hideMark/>
           </w:tcPr>
           <w:p>
+            <w:pPr>
+              <w:rPr>
+                <w:rFonts w:hint="eastAsia"/>
+              </w:rPr>
+            </w:pPr>
             <w:r>
               <w:t>—</w:t>
             </w:r>
@@ -3019,6 +3900,11 @@
             <w:hideMark/>
           </w:tcPr>
           <w:p>
+            <w:pPr>
+              <w:rPr>
+                <w:rFonts w:hint="eastAsia"/>
+              </w:rPr>
+            </w:pPr>
             <w:r>
               <w:t>—</w:t>
             </w:r>
@@ -3033,106 +3919,94 @@
           <w:tcPr>
             <w:tcW w:w="0" w:type="auto"/>
             <w:vAlign w:val="center"/>
-            <w:hideMark/>
-          </w:tcPr>
-          <w:p>
-            <w:pPr>
-              <w:rPr>
-                <w:rFonts w:hint="eastAsia"/>
-              </w:rPr>
-            </w:pPr>
-            <w:r>
-              <w:t>P</w:t>
-            </w:r>
-            <w:r>
-              <w:rPr>
-                <w:rFonts w:hint="eastAsia"/>
-              </w:rPr>
-              <w:t>5</w:t>
-            </w:r>
-          </w:p>
-        </w:tc>
-        <w:tc>
-          <w:tcPr>
-            <w:tcW w:w="0" w:type="auto"/>
-            <w:vAlign w:val="center"/>
-            <w:hideMark/>
-          </w:tcPr>
-          <w:p>
-            <w:r>
-              <w:t>BioWordVec</w:t>
-            </w:r>
-          </w:p>
-        </w:tc>
-        <w:tc>
-          <w:tcPr>
-            <w:tcW w:w="0" w:type="auto"/>
-            <w:vAlign w:val="center"/>
-            <w:hideMark/>
-          </w:tcPr>
-          <w:p>
-            <w:r>
-              <w:t>MLP</w:t>
-            </w:r>
-          </w:p>
-        </w:tc>
-        <w:tc>
-          <w:tcPr>
-            <w:tcW w:w="0" w:type="auto"/>
-            <w:vAlign w:val="center"/>
-            <w:hideMark/>
-          </w:tcPr>
-          <w:p>
-            <w:r>
-              <w:t>—</w:t>
-            </w:r>
-          </w:p>
-        </w:tc>
-        <w:tc>
-          <w:tcPr>
-            <w:tcW w:w="0" w:type="auto"/>
-            <w:vAlign w:val="center"/>
-            <w:hideMark/>
-          </w:tcPr>
-          <w:p>
-            <w:r>
-              <w:t>—</w:t>
-            </w:r>
-          </w:p>
-        </w:tc>
-        <w:tc>
-          <w:tcPr>
-            <w:tcW w:w="0" w:type="auto"/>
-            <w:vAlign w:val="center"/>
-            <w:hideMark/>
-          </w:tcPr>
-          <w:p>
-            <w:r>
-              <w:t>—</w:t>
-            </w:r>
-          </w:p>
-        </w:tc>
-        <w:tc>
-          <w:tcPr>
-            <w:tcW w:w="0" w:type="auto"/>
-            <w:vAlign w:val="center"/>
-            <w:hideMark/>
-          </w:tcPr>
-          <w:p>
-            <w:r>
-              <w:t>—</w:t>
-            </w:r>
-          </w:p>
-        </w:tc>
-        <w:tc>
-          <w:tcPr>
-            <w:tcW w:w="0" w:type="auto"/>
-            <w:vAlign w:val="center"/>
-            <w:hideMark/>
-          </w:tcPr>
-          <w:p>
-            <w:r>
-              <w:t>—</w:t>
+          </w:tcPr>
+          <w:p>
+            <w:pPr>
+              <w:rPr>
+                <w:rFonts w:hint="eastAsia"/>
+              </w:rPr>
+            </w:pPr>
+            <w:r>
+              <w:rPr>
+                <w:rFonts w:hint="eastAsia"/>
+              </w:rPr>
+              <w:t>P5</w:t>
+            </w:r>
+          </w:p>
+        </w:tc>
+        <w:tc>
+          <w:tcPr>
+            <w:tcW w:w="0" w:type="auto"/>
+            <w:vAlign w:val="center"/>
+          </w:tcPr>
+          <w:p>
+            <w:pPr>
+              <w:rPr>
+                <w:rFonts w:hint="eastAsia"/>
+              </w:rPr>
+            </w:pPr>
+            <w:r>
+              <w:rPr>
+                <w:rFonts w:hint="eastAsia"/>
+              </w:rPr>
+              <w:t>PubMedBERT</w:t>
+            </w:r>
+          </w:p>
+        </w:tc>
+        <w:tc>
+          <w:tcPr>
+            <w:tcW w:w="0" w:type="auto"/>
+            <w:vAlign w:val="center"/>
+          </w:tcPr>
+          <w:p>
+            <w:pPr>
+              <w:rPr>
+                <w:rFonts w:hint="eastAsia"/>
+              </w:rPr>
+            </w:pPr>
+            <w:r>
+              <w:rPr>
+                <w:rFonts w:hint="eastAsia"/>
+              </w:rPr>
+              <w:t>SVM</w:t>
+            </w:r>
+          </w:p>
+        </w:tc>
+        <w:tc>
+          <w:tcPr>
+            <w:tcW w:w="0" w:type="auto"/>
+            <w:gridSpan w:val="5"/>
+            <w:vAlign w:val="center"/>
+          </w:tcPr>
+          <w:p>
+            <w:pPr>
+              <w:rPr>
+                <w:rFonts w:hint="eastAsia"/>
+              </w:rPr>
+            </w:pPr>
+            <w:r>
+              <w:rPr>
+                <w:rFonts w:hint="eastAsia"/>
+              </w:rPr>
+              <w:t>Not included</w:t>
+            </w:r>
+            <w:r>
+              <w:rPr>
+                <w:rFonts w:hint="eastAsia"/>
+              </w:rPr>
+              <w:t>.</w:t>
+            </w:r>
+            <w:r>
+              <w:rPr>
+                <w:rFonts w:hint="eastAsia"/>
+              </w:rPr>
+              <w:t xml:space="preserve"> Need explanation</w:t>
+            </w:r>
+            <w:r>
+              <w:rPr>
+                <w:rFonts w:hint="eastAsia"/>
+              </w:rPr>
+              <w:t>.</w:t>
             </w:r>
           </w:p>
         </w:tc>
@@ -3154,47 +4028,22 @@
               </w:rPr>
             </w:pPr>
             <w:r>
-              <w:t>P</w:t>
-            </w:r>
-            <w:r>
-              <w:rPr>
-                <w:rFonts w:hint="eastAsia"/>
-              </w:rPr>
-              <w:t>6</w:t>
-            </w:r>
-          </w:p>
-        </w:tc>
-        <w:tc>
-          <w:tcPr>
-            <w:tcW w:w="0" w:type="auto"/>
-            <w:vAlign w:val="center"/>
-            <w:hideMark/>
-          </w:tcPr>
-          <w:p>
-            <w:r>
-              <w:t>PubMedBERT</w:t>
-            </w:r>
-          </w:p>
-        </w:tc>
-        <w:tc>
-          <w:tcPr>
-            <w:tcW w:w="0" w:type="auto"/>
-            <w:vAlign w:val="center"/>
-            <w:hideMark/>
-          </w:tcPr>
-          <w:p>
-            <w:r>
-              <w:t>MLP</w:t>
-            </w:r>
-          </w:p>
-        </w:tc>
-        <w:tc>
-          <w:tcPr>
-            <w:tcW w:w="0" w:type="auto"/>
-            <w:vAlign w:val="center"/>
-            <w:hideMark/>
-          </w:tcPr>
-          <w:p>
+              <w:t>BioGPT (zero-shot)</w:t>
+            </w:r>
+          </w:p>
+        </w:tc>
+        <w:tc>
+          <w:tcPr>
+            <w:tcW w:w="0" w:type="auto"/>
+            <w:vAlign w:val="center"/>
+            <w:hideMark/>
+          </w:tcPr>
+          <w:p>
+            <w:pPr>
+              <w:rPr>
+                <w:rFonts w:hint="eastAsia"/>
+              </w:rPr>
+            </w:pPr>
             <w:r>
               <w:t>—</w:t>
             </w:r>
@@ -3207,44 +4056,113 @@
             <w:hideMark/>
           </w:tcPr>
           <w:p>
-            <w:r>
-              <w:t>—</w:t>
-            </w:r>
-          </w:p>
-        </w:tc>
-        <w:tc>
-          <w:tcPr>
-            <w:tcW w:w="0" w:type="auto"/>
-            <w:vAlign w:val="center"/>
-            <w:hideMark/>
-          </w:tcPr>
-          <w:p>
-            <w:r>
-              <w:t>—</w:t>
-            </w:r>
-          </w:p>
-        </w:tc>
-        <w:tc>
-          <w:tcPr>
-            <w:tcW w:w="0" w:type="auto"/>
-            <w:vAlign w:val="center"/>
-            <w:hideMark/>
-          </w:tcPr>
-          <w:p>
-            <w:r>
-              <w:t>—</w:t>
-            </w:r>
-          </w:p>
-        </w:tc>
-        <w:tc>
-          <w:tcPr>
-            <w:tcW w:w="0" w:type="auto"/>
-            <w:vAlign w:val="center"/>
-            <w:hideMark/>
-          </w:tcPr>
-          <w:p>
-            <w:r>
-              <w:t>—</w:t>
+            <w:pPr>
+              <w:rPr>
+                <w:rFonts w:hint="eastAsia"/>
+              </w:rPr>
+            </w:pPr>
+            <w:r>
+              <w:t>Logit scoring</w:t>
+            </w:r>
+          </w:p>
+        </w:tc>
+        <w:tc>
+          <w:tcPr>
+            <w:tcW w:w="0" w:type="auto"/>
+            <w:vAlign w:val="center"/>
+            <w:hideMark/>
+          </w:tcPr>
+          <w:p>
+            <w:pPr>
+              <w:rPr>
+                <w:rFonts w:hint="eastAsia"/>
+              </w:rPr>
+            </w:pPr>
+            <w:r>
+              <w:rPr>
+                <w:rFonts w:hint="eastAsia"/>
+              </w:rPr>
+              <w:t>0.36</w:t>
+            </w:r>
+          </w:p>
+        </w:tc>
+        <w:tc>
+          <w:tcPr>
+            <w:tcW w:w="0" w:type="auto"/>
+            <w:vAlign w:val="center"/>
+            <w:hideMark/>
+          </w:tcPr>
+          <w:p>
+            <w:pPr>
+              <w:rPr>
+                <w:rFonts w:hint="eastAsia"/>
+              </w:rPr>
+            </w:pPr>
+            <w:r>
+              <w:rPr>
+                <w:rFonts w:hint="eastAsia"/>
+              </w:rPr>
+              <w:t>0.21</w:t>
+            </w:r>
+          </w:p>
+        </w:tc>
+        <w:tc>
+          <w:tcPr>
+            <w:tcW w:w="0" w:type="auto"/>
+            <w:vAlign w:val="center"/>
+            <w:hideMark/>
+          </w:tcPr>
+          <w:p>
+            <w:pPr>
+              <w:rPr>
+                <w:rFonts w:hint="eastAsia"/>
+              </w:rPr>
+            </w:pPr>
+            <w:r>
+              <w:rPr>
+                <w:rFonts w:hint="eastAsia"/>
+              </w:rPr>
+              <w:t>0.12</w:t>
+            </w:r>
+          </w:p>
+        </w:tc>
+        <w:tc>
+          <w:tcPr>
+            <w:tcW w:w="0" w:type="auto"/>
+            <w:vAlign w:val="center"/>
+            <w:hideMark/>
+          </w:tcPr>
+          <w:p>
+            <w:pPr>
+              <w:rPr>
+                <w:rFonts w:hint="eastAsia"/>
+              </w:rPr>
+            </w:pPr>
+            <w:r>
+              <w:rPr>
+                <w:rFonts w:hint="eastAsia"/>
+              </w:rPr>
+              <w:t>0.51</w:t>
+            </w:r>
+          </w:p>
+        </w:tc>
+        <w:tc>
+          <w:tcPr>
+            <w:tcW w:w="0" w:type="auto"/>
+            <w:vAlign w:val="center"/>
+            <w:hideMark/>
+          </w:tcPr>
+          <w:p>
+            <w:pPr>
+              <w:rPr>
+                <w:rFonts w:hint="eastAsia"/>
+              </w:rPr>
+            </w:pPr>
+            <w:r>
+              <w:rPr>
+                <w:rFonts w:hint="eastAsia"/>
+              </w:rPr>
+              <w:t>0</w:t>
             </w:r>
           </w:p>
         </w:tc>
@@ -3260,18 +4178,28 @@
             <w:hideMark/>
           </w:tcPr>
           <w:p>
-            <w:r>
-              <w:t>BioGPT (zero-shot)</w:t>
-            </w:r>
-          </w:p>
-        </w:tc>
-        <w:tc>
-          <w:tcPr>
-            <w:tcW w:w="0" w:type="auto"/>
-            <w:vAlign w:val="center"/>
-            <w:hideMark/>
-          </w:tcPr>
-          <w:p>
+            <w:pPr>
+              <w:rPr>
+                <w:rFonts w:hint="eastAsia"/>
+              </w:rPr>
+            </w:pPr>
+            <w:r>
+              <w:t>BioGPT (LoRA)</w:t>
+            </w:r>
+          </w:p>
+        </w:tc>
+        <w:tc>
+          <w:tcPr>
+            <w:tcW w:w="0" w:type="auto"/>
+            <w:vAlign w:val="center"/>
+            <w:hideMark/>
+          </w:tcPr>
+          <w:p>
+            <w:pPr>
+              <w:rPr>
+                <w:rFonts w:hint="eastAsia"/>
+              </w:rPr>
+            </w:pPr>
             <w:r>
               <w:t>—</w:t>
             </w:r>
@@ -3284,18 +4212,28 @@
             <w:hideMark/>
           </w:tcPr>
           <w:p>
-            <w:r>
-              <w:t>Logit scoring</w:t>
-            </w:r>
-          </w:p>
-        </w:tc>
-        <w:tc>
-          <w:tcPr>
-            <w:tcW w:w="0" w:type="auto"/>
-            <w:vAlign w:val="center"/>
-            <w:hideMark/>
-          </w:tcPr>
-          <w:p>
+            <w:pPr>
+              <w:rPr>
+                <w:rFonts w:hint="eastAsia"/>
+              </w:rPr>
+            </w:pPr>
+            <w:r>
+              <w:t>Generative</w:t>
+            </w:r>
+          </w:p>
+        </w:tc>
+        <w:tc>
+          <w:tcPr>
+            <w:tcW w:w="0" w:type="auto"/>
+            <w:vAlign w:val="center"/>
+            <w:hideMark/>
+          </w:tcPr>
+          <w:p>
+            <w:pPr>
+              <w:rPr>
+                <w:rFonts w:hint="eastAsia"/>
+              </w:rPr>
+            </w:pPr>
             <w:r>
               <w:t>—</w:t>
             </w:r>
@@ -3308,6 +4246,11 @@
             <w:hideMark/>
           </w:tcPr>
           <w:p>
+            <w:pPr>
+              <w:rPr>
+                <w:rFonts w:hint="eastAsia"/>
+              </w:rPr>
+            </w:pPr>
             <w:r>
               <w:t>—</w:t>
             </w:r>
@@ -3320,6 +4263,11 @@
             <w:hideMark/>
           </w:tcPr>
           <w:p>
+            <w:pPr>
+              <w:rPr>
+                <w:rFonts w:hint="eastAsia"/>
+              </w:rPr>
+            </w:pPr>
             <w:r>
               <w:t>—</w:t>
             </w:r>
@@ -3332,6 +4280,11 @@
             <w:hideMark/>
           </w:tcPr>
           <w:p>
+            <w:pPr>
+              <w:rPr>
+                <w:rFonts w:hint="eastAsia"/>
+              </w:rPr>
+            </w:pPr>
             <w:r>
               <w:t>—</w:t>
             </w:r>
@@ -3344,107 +4297,11 @@
             <w:hideMark/>
           </w:tcPr>
           <w:p>
-            <w:r>
-              <w:t>—</w:t>
-            </w:r>
-          </w:p>
-        </w:tc>
-      </w:tr>
-      <w:tr>
-        <w:trPr>
-          <w:tblCellSpacing w:w="15" w:type="dxa"/>
-        </w:trPr>
-        <w:tc>
-          <w:tcPr>
-            <w:tcW w:w="0" w:type="auto"/>
-            <w:vAlign w:val="center"/>
-            <w:hideMark/>
-          </w:tcPr>
-          <w:p>
-            <w:r>
-              <w:t>BioGPT (LoRA)</w:t>
-            </w:r>
-          </w:p>
-        </w:tc>
-        <w:tc>
-          <w:tcPr>
-            <w:tcW w:w="0" w:type="auto"/>
-            <w:vAlign w:val="center"/>
-            <w:hideMark/>
-          </w:tcPr>
-          <w:p>
-            <w:r>
-              <w:t>—</w:t>
-            </w:r>
-          </w:p>
-        </w:tc>
-        <w:tc>
-          <w:tcPr>
-            <w:tcW w:w="0" w:type="auto"/>
-            <w:vAlign w:val="center"/>
-            <w:hideMark/>
-          </w:tcPr>
-          <w:p>
-            <w:r>
-              <w:t>Generative</w:t>
-            </w:r>
-          </w:p>
-        </w:tc>
-        <w:tc>
-          <w:tcPr>
-            <w:tcW w:w="0" w:type="auto"/>
-            <w:vAlign w:val="center"/>
-            <w:hideMark/>
-          </w:tcPr>
-          <w:p>
-            <w:r>
-              <w:t>—</w:t>
-            </w:r>
-          </w:p>
-        </w:tc>
-        <w:tc>
-          <w:tcPr>
-            <w:tcW w:w="0" w:type="auto"/>
-            <w:vAlign w:val="center"/>
-            <w:hideMark/>
-          </w:tcPr>
-          <w:p>
-            <w:r>
-              <w:t>—</w:t>
-            </w:r>
-          </w:p>
-        </w:tc>
-        <w:tc>
-          <w:tcPr>
-            <w:tcW w:w="0" w:type="auto"/>
-            <w:vAlign w:val="center"/>
-            <w:hideMark/>
-          </w:tcPr>
-          <w:p>
-            <w:r>
-              <w:t>—</w:t>
-            </w:r>
-          </w:p>
-        </w:tc>
-        <w:tc>
-          <w:tcPr>
-            <w:tcW w:w="0" w:type="auto"/>
-            <w:vAlign w:val="center"/>
-            <w:hideMark/>
-          </w:tcPr>
-          <w:p>
-            <w:r>
-              <w:t>—</w:t>
-            </w:r>
-          </w:p>
-        </w:tc>
-        <w:tc>
-          <w:tcPr>
-            <w:tcW w:w="0" w:type="auto"/>
-            <w:vAlign w:val="center"/>
-            <w:hideMark/>
-          </w:tcPr>
-          <w:p>
+            <w:pPr>
+              <w:rPr>
+                <w:rFonts w:hint="eastAsia"/>
+              </w:rPr>
+            </w:pPr>
             <w:r>
               <w:t>—</w:t>
             </w:r>
@@ -3453,6 +4310,11 @@
       </w:tr>
     </w:tbl>
     <w:p>
+      <w:pPr>
+        <w:rPr>
+          <w:rFonts w:hint="eastAsia"/>
+        </w:rPr>
+      </w:pPr>
       <w:r>
         <w:t>Bold the best result per metric column.</w:t>
       </w:r>
@@ -3460,6 +4322,7 @@
     <w:p>
       <w:pPr>
         <w:rPr>
+          <w:rFonts w:hint="eastAsia"/>
           <w:b/>
           <w:bCs/>
         </w:rPr>
@@ -3473,11 +4336,21 @@
       </w:r>
     </w:p>
     <w:p>
+      <w:pPr>
+        <w:rPr>
+          <w:rFonts w:hint="eastAsia"/>
+        </w:rPr>
+      </w:pPr>
       <w:r>
         <w:t>Each person writes ~2–3 sentences for their method following this structure:</w:t>
       </w:r>
     </w:p>
     <w:p>
+      <w:pPr>
+        <w:rPr>
+          <w:rFonts w:hint="eastAsia"/>
+        </w:rPr>
+      </w:pPr>
       <w:r>
         <w:rPr>
           <w:i/>
@@ -3492,6 +4365,9 @@
           <w:ilvl w:val="0"/>
           <w:numId w:val="16"/>
         </w:numPr>
+        <w:rPr>
+          <w:rFonts w:hint="eastAsia"/>
+        </w:rPr>
       </w:pPr>
       <w:r>
         <w:rPr>
@@ -3510,6 +4386,9 @@
           <w:ilvl w:val="0"/>
           <w:numId w:val="16"/>
         </w:numPr>
+        <w:rPr>
+          <w:rFonts w:hint="eastAsia"/>
+        </w:rPr>
       </w:pPr>
       <w:r>
         <w:rPr>
@@ -3528,6 +4407,9 @@
           <w:ilvl w:val="0"/>
           <w:numId w:val="16"/>
         </w:numPr>
+        <w:rPr>
+          <w:rFonts w:hint="eastAsia"/>
+        </w:rPr>
       </w:pPr>
       <w:r>
         <w:rPr>
@@ -3546,6 +4428,9 @@
           <w:ilvl w:val="0"/>
           <w:numId w:val="16"/>
         </w:numPr>
+        <w:rPr>
+          <w:rFonts w:hint="eastAsia"/>
+        </w:rPr>
       </w:pPr>
       <w:r>
         <w:rPr>
@@ -3561,6 +4446,7 @@
     <w:p>
       <w:pPr>
         <w:rPr>
+          <w:rFonts w:hint="eastAsia"/>
           <w:b/>
           <w:bCs/>
         </w:rPr>
@@ -3574,6 +4460,11 @@
       </w:r>
     </w:p>
     <w:p>
+      <w:pPr>
+        <w:rPr>
+          <w:rFonts w:hint="eastAsia"/>
+        </w:rPr>
+      </w:pPr>
       <w:r>
         <w:rPr>
           <w:b/>
@@ -3593,6 +4484,11 @@
       </w:r>
     </w:p>
     <w:p>
+      <w:pPr>
+        <w:rPr>
+          <w:rFonts w:hint="eastAsia"/>
+        </w:rPr>
+      </w:pPr>
       <w:r>
         <w:t xml:space="preserve">Each person analyses their own method's errors following this </w:t>
       </w:r>
@@ -3610,6 +4506,7 @@
     <w:p>
       <w:pPr>
         <w:rPr>
+          <w:rFonts w:hint="eastAsia"/>
           <w:b/>
           <w:bCs/>
         </w:rPr>
@@ -3628,6 +4525,9 @@
           <w:ilvl w:val="0"/>
           <w:numId w:val="17"/>
         </w:numPr>
+        <w:rPr>
+          <w:rFonts w:hint="eastAsia"/>
+        </w:rPr>
       </w:pPr>
       <w:r>
         <w:t>Include one confusion matrix per method (or a 2×4 panel figure for compactness)</w:t>
@@ -3639,6 +4539,9 @@
           <w:ilvl w:val="0"/>
           <w:numId w:val="17"/>
         </w:numPr>
+        <w:rPr>
+          <w:rFonts w:hint="eastAsia"/>
+        </w:rPr>
       </w:pPr>
       <w:r>
         <w:t>Identify which class pair is most confused</w:t>
@@ -3650,6 +4553,9 @@
           <w:ilvl w:val="0"/>
           <w:numId w:val="17"/>
         </w:numPr>
+        <w:rPr>
+          <w:rFonts w:hint="eastAsia"/>
+        </w:rPr>
       </w:pPr>
       <w:r>
         <w:t>Note whether the "maybe" class is systematically under-predicted (expected given class imbalance)</w:t>
@@ -3658,6 +4564,7 @@
     <w:p>
       <w:pPr>
         <w:rPr>
+          <w:rFonts w:hint="eastAsia"/>
           <w:b/>
           <w:bCs/>
         </w:rPr>
@@ -3671,11 +4578,21 @@
       </w:r>
     </w:p>
     <w:p>
+      <w:pPr>
+        <w:rPr>
+          <w:rFonts w:hint="eastAsia"/>
+        </w:rPr>
+      </w:pPr>
       <w:r>
         <w:t>Each person writes one paragraph (~3–4 sentences) for their method:</w:t>
       </w:r>
     </w:p>
     <w:p>
+      <w:pPr>
+        <w:rPr>
+          <w:rFonts w:hint="eastAsia"/>
+        </w:rPr>
+      </w:pPr>
       <w:r>
         <w:rPr>
           <w:i/>
@@ -3685,6 +4602,11 @@
       </w:r>
     </w:p>
     <w:p>
+      <w:pPr>
+        <w:rPr>
+          <w:rFonts w:hint="eastAsia"/>
+        </w:rPr>
+      </w:pPr>
       <w:r>
         <w:t>Additional method-specific analysis:</w:t>
       </w:r>
@@ -3695,17 +4617,23 @@
           <w:ilvl w:val="0"/>
           <w:numId w:val="18"/>
         </w:numPr>
-      </w:pPr>
-      <w:r>
-        <w:rPr>
-          <w:b/>
-          <w:bCs/>
-        </w:rPr>
+        <w:rPr>
+          <w:rFonts w:hint="eastAsia"/>
+        </w:rPr>
+      </w:pPr>
+      <w:r>
+        <w:rPr>
+          <w:b/>
+          <w:bCs/>
+        </w:rPr>
+        <w:t>BioWordVec</w:t>
+      </w:r>
+      <w:r>
+        <w:t xml:space="preserve"> (Haoran): OOV rate analysis — what proportion of test tokens were not </w:t>
+      </w:r>
+      <w:r>
         <w:lastRenderedPageBreak/>
-        <w:t>BioWordVec</w:t>
-      </w:r>
-      <w:r>
-        <w:t xml:space="preserve"> (Haoran): OOV rate analysis — what proportion of test tokens were not in the BioWordVec vocabulary? Were errors correlated with high OOV rate?</w:t>
+        <w:t>in the BioWordVec vocabulary? Were errors correlated with high OOV rate?</w:t>
       </w:r>
     </w:p>
     <w:p>
@@ -3714,6 +4642,9 @@
           <w:ilvl w:val="0"/>
           <w:numId w:val="18"/>
         </w:numPr>
+        <w:rPr>
+          <w:rFonts w:hint="eastAsia"/>
+        </w:rPr>
       </w:pPr>
       <w:r>
         <w:rPr>
@@ -3741,6 +4672,9 @@
           <w:ilvl w:val="0"/>
           <w:numId w:val="18"/>
         </w:numPr>
+        <w:rPr>
+          <w:rFonts w:hint="eastAsia"/>
+        </w:rPr>
       </w:pPr>
       <w:r>
         <w:rPr>
@@ -3756,6 +4690,7 @@
     <w:p>
       <w:pPr>
         <w:rPr>
+          <w:rFonts w:hint="eastAsia"/>
           <w:b/>
           <w:bCs/>
         </w:rPr>
@@ -3774,6 +4709,9 @@
           <w:ilvl w:val="0"/>
           <w:numId w:val="19"/>
         </w:numPr>
+        <w:rPr>
+          <w:rFonts w:hint="eastAsia"/>
+        </w:rPr>
       </w:pPr>
       <w:r>
         <w:t xml:space="preserve">Identify questions that </w:t>
@@ -3795,6 +4733,9 @@
           <w:ilvl w:val="0"/>
           <w:numId w:val="19"/>
         </w:numPr>
+        <w:rPr>
+          <w:rFonts w:hint="eastAsia"/>
+        </w:rPr>
       </w:pPr>
       <w:r>
         <w:t>One short paragraph characterising these hard cases (e.g., "maybe" questions with strong contextual evidence that models misread as "yes")</w:t>
@@ -3803,6 +4744,7 @@
     <w:p>
       <w:pPr>
         <w:rPr>
+          <w:rFonts w:hint="eastAsia"/>
           <w:b/>
           <w:bCs/>
         </w:rPr>
@@ -3816,6 +4758,11 @@
       </w:r>
     </w:p>
     <w:p>
+      <w:pPr>
+        <w:rPr>
+          <w:rFonts w:hint="eastAsia"/>
+        </w:rPr>
+      </w:pPr>
       <w:r>
         <w:rPr>
           <w:b/>
@@ -3835,6 +4782,11 @@
       </w:r>
     </w:p>
     <w:p>
+      <w:pPr>
+        <w:rPr>
+          <w:rFonts w:hint="eastAsia"/>
+        </w:rPr>
+      </w:pPr>
       <w:r>
         <w:rPr>
           <w:i/>
@@ -3849,6 +4801,9 @@
           <w:ilvl w:val="0"/>
           <w:numId w:val="20"/>
         </w:numPr>
+        <w:rPr>
+          <w:rFonts w:hint="eastAsia"/>
+        </w:rPr>
       </w:pPr>
       <w:r>
         <w:rPr>
@@ -3867,6 +4822,9 @@
           <w:ilvl w:val="0"/>
           <w:numId w:val="20"/>
         </w:numPr>
+        <w:rPr>
+          <w:rFonts w:hint="eastAsia"/>
+        </w:rPr>
       </w:pPr>
       <w:r>
         <w:rPr>
@@ -3885,6 +4843,9 @@
           <w:ilvl w:val="0"/>
           <w:numId w:val="20"/>
         </w:numPr>
+        <w:rPr>
+          <w:rFonts w:hint="eastAsia"/>
+        </w:rPr>
       </w:pPr>
       <w:r>
         <w:rPr>
@@ -3903,6 +4864,9 @@
           <w:ilvl w:val="0"/>
           <w:numId w:val="20"/>
         </w:numPr>
+        <w:rPr>
+          <w:rFonts w:hint="eastAsia"/>
+        </w:rPr>
       </w:pPr>
       <w:r>
         <w:rPr>
@@ -3921,6 +4885,9 @@
           <w:ilvl w:val="0"/>
           <w:numId w:val="20"/>
         </w:numPr>
+        <w:rPr>
+          <w:rFonts w:hint="eastAsia"/>
+        </w:rPr>
       </w:pPr>
       <w:r>
         <w:rPr>
@@ -3939,6 +4906,9 @@
           <w:ilvl w:val="0"/>
           <w:numId w:val="20"/>
         </w:numPr>
+        <w:rPr>
+          <w:rFonts w:hint="eastAsia"/>
+        </w:rPr>
       </w:pPr>
       <w:r>
         <w:t>If results are preliminary, present what has been done and note limitations</w:t>
@@ -3947,6 +4917,7 @@
     <w:p>
       <w:pPr>
         <w:rPr>
+          <w:rFonts w:hint="eastAsia"/>
           <w:b/>
           <w:bCs/>
         </w:rPr>
@@ -3960,6 +4931,11 @@
       </w:r>
     </w:p>
     <w:p>
+      <w:pPr>
+        <w:rPr>
+          <w:rFonts w:hint="eastAsia"/>
+        </w:rPr>
+      </w:pPr>
       <w:r>
         <w:rPr>
           <w:b/>
@@ -3987,6 +4963,11 @@
       </w:r>
     </w:p>
     <w:p>
+      <w:pPr>
+        <w:rPr>
+          <w:rFonts w:hint="eastAsia"/>
+        </w:rPr>
+      </w:pPr>
       <w:r>
         <w:t>Structured around three questions:</w:t>
       </w:r>
@@ -3997,6 +4978,9 @@
           <w:ilvl w:val="0"/>
           <w:numId w:val="21"/>
         </w:numPr>
+        <w:rPr>
+          <w:rFonts w:hint="eastAsia"/>
+        </w:rPr>
       </w:pPr>
       <w:r>
         <w:rPr>
@@ -4023,6 +5007,9 @@
           <w:ilvl w:val="0"/>
           <w:numId w:val="21"/>
         </w:numPr>
+        <w:rPr>
+          <w:rFonts w:hint="eastAsia"/>
+        </w:rPr>
       </w:pPr>
       <w:r>
         <w:rPr>
@@ -4049,6 +5036,9 @@
           <w:ilvl w:val="0"/>
           <w:numId w:val="21"/>
         </w:numPr>
+        <w:rPr>
+          <w:rFonts w:hint="eastAsia"/>
+        </w:rPr>
       </w:pPr>
       <w:r>
         <w:rPr>
@@ -4070,15 +5060,21 @@
       </w:r>
     </w:p>
     <w:p>
+      <w:pPr>
+        <w:rPr>
+          <w:rFonts w:hint="eastAsia"/>
+        </w:rPr>
+      </w:pPr>
       <w:r>
         <w:pict w14:anchorId="69533977">
-          <v:rect id="_x0000_i1072" style="width:0;height:1.5pt" o:hralign="center" o:hrstd="t" o:hr="t" fillcolor="#a0a0a0" stroked="f"/>
+          <v:rect id="_x0000_i1030" style="width:0;height:1.5pt" o:hralign="center" o:hrstd="t" o:hr="t" fillcolor="#a0a0a0" stroked="f"/>
         </w:pict>
       </w:r>
     </w:p>
     <w:p>
       <w:pPr>
         <w:rPr>
+          <w:rFonts w:hint="eastAsia"/>
           <w:b/>
           <w:bCs/>
         </w:rPr>
@@ -4092,6 +5088,11 @@
       </w:r>
     </w:p>
     <w:p>
+      <w:pPr>
+        <w:rPr>
+          <w:rFonts w:hint="eastAsia"/>
+        </w:rPr>
+      </w:pPr>
       <w:r>
         <w:rPr>
           <w:b/>
@@ -4111,17 +5112,27 @@
       </w:r>
     </w:p>
     <w:p>
-      <w:r>
+      <w:pPr>
+        <w:rPr>
+          <w:rFonts w:hint="eastAsia"/>
+        </w:rPr>
+      </w:pPr>
+      <w:r>
+        <w:t>Structure as three paragraphs:</w:t>
+      </w:r>
+    </w:p>
+    <w:p>
+      <w:pPr>
+        <w:rPr>
+          <w:rFonts w:hint="eastAsia"/>
+        </w:rPr>
+      </w:pPr>
+      <w:r>
+        <w:rPr>
+          <w:b/>
+          <w:bCs/>
+        </w:rPr>
         <w:lastRenderedPageBreak/>
-        <w:t>Structure as three paragraphs:</w:t>
-      </w:r>
-    </w:p>
-    <w:p>
-      <w:r>
-        <w:rPr>
-          <w:b/>
-          <w:bCs/>
-        </w:rPr>
         <w:t>Paragraph 1 — What worked:</w:t>
       </w:r>
       <w:r>
@@ -4129,6 +5140,11 @@
       </w:r>
     </w:p>
     <w:p>
+      <w:pPr>
+        <w:rPr>
+          <w:rFonts w:hint="eastAsia"/>
+        </w:rPr>
+      </w:pPr>
       <w:r>
         <w:rPr>
           <w:b/>
@@ -4141,6 +5157,11 @@
       </w:r>
     </w:p>
     <w:p>
+      <w:pPr>
+        <w:rPr>
+          <w:rFonts w:hint="eastAsia"/>
+        </w:rPr>
+      </w:pPr>
       <w:r>
         <w:rPr>
           <w:b/>
@@ -4153,15 +5174,21 @@
       </w:r>
     </w:p>
     <w:p>
+      <w:pPr>
+        <w:rPr>
+          <w:rFonts w:hint="eastAsia"/>
+        </w:rPr>
+      </w:pPr>
       <w:r>
         <w:pict w14:anchorId="38D07D8C">
-          <v:rect id="_x0000_i1073" style="width:0;height:1.5pt" o:hralign="center" o:hrstd="t" o:hr="t" fillcolor="#a0a0a0" stroked="f"/>
+          <v:rect id="_x0000_i1031" style="width:0;height:1.5pt" o:hralign="center" o:hrstd="t" o:hr="t" fillcolor="#a0a0a0" stroked="f"/>
         </w:pict>
       </w:r>
     </w:p>
     <w:p>
       <w:pPr>
         <w:rPr>
+          <w:rFonts w:hint="eastAsia"/>
           <w:b/>
           <w:bCs/>
         </w:rPr>
@@ -4180,6 +5207,9 @@
           <w:ilvl w:val="0"/>
           <w:numId w:val="22"/>
         </w:numPr>
+        <w:rPr>
+          <w:rFonts w:hint="eastAsia"/>
+        </w:rPr>
       </w:pPr>
       <w:r>
         <w:t>All figures have axis labels and are readable without zoom</w:t>
@@ -4191,6 +5221,9 @@
           <w:ilvl w:val="0"/>
           <w:numId w:val="22"/>
         </w:numPr>
+        <w:rPr>
+          <w:rFonts w:hint="eastAsia"/>
+        </w:rPr>
       </w:pPr>
       <w:r>
         <w:t>All HuggingFace models are cited with links (BioWordVec, PubMedBERT, BioGPT)</w:t>
@@ -4202,6 +5235,9 @@
           <w:ilvl w:val="0"/>
           <w:numId w:val="22"/>
         </w:numPr>
+        <w:rPr>
+          <w:rFonts w:hint="eastAsia"/>
+        </w:rPr>
       </w:pPr>
       <w:r>
         <w:t>Results table uses bold for best results per column</w:t>
@@ -4213,6 +5249,9 @@
           <w:ilvl w:val="0"/>
           <w:numId w:val="22"/>
         </w:numPr>
+        <w:rPr>
+          <w:rFonts w:hint="eastAsia"/>
+        </w:rPr>
       </w:pPr>
       <w:r>
         <w:t>Every design decision is linked to a hypothesis (Methods) and a result (Evaluation)</w:t>
@@ -4224,6 +5263,9 @@
           <w:ilvl w:val="0"/>
           <w:numId w:val="22"/>
         </w:numPr>
+        <w:rPr>
+          <w:rFonts w:hint="eastAsia"/>
+        </w:rPr>
       </w:pPr>
       <w:r>
         <w:t>GitHub repository link included in the report</w:t>
@@ -4235,6 +5277,9 @@
           <w:ilvl w:val="0"/>
           <w:numId w:val="22"/>
         </w:numPr>
+        <w:rPr>
+          <w:rFonts w:hint="eastAsia"/>
+        </w:rPr>
       </w:pPr>
       <w:r>
         <w:t>Total length ≤ 10 pages (excluding references)</w:t>
@@ -4246,6 +5291,9 @@
           <w:ilvl w:val="0"/>
           <w:numId w:val="22"/>
         </w:numPr>
+        <w:rPr>
+          <w:rFonts w:hint="eastAsia"/>
+        </w:rPr>
       </w:pPr>
       <w:r>
         <w:t>Formatted using NeurIPS or ACL Overleaf template</w:t>
@@ -8183,6 +9231,7 @@
   <w:style w:type="character" w:default="1" w:styleId="a0">
     <w:name w:val="Default Paragraph Font"/>
     <w:uiPriority w:val="1"/>
+    <w:semiHidden/>
     <w:unhideWhenUsed/>
   </w:style>
   <w:style w:type="table" w:default="1" w:styleId="a1">
@@ -8797,4 +9846,16 @@
     </a:ext>
   </a:extLst>
 </a:theme>
+</file>
+
+<file path=customXml/item1.xml><?xml version="1.0" encoding="utf-8"?>
+<b:Sources xmlns:b="http://schemas.openxmlformats.org/officeDocument/2006/bibliography" xmlns="http://schemas.openxmlformats.org/officeDocument/2006/bibliography" SelectedStyle="\APASixthEditionOfficeOnline.xsl" StyleName="APA" Version="6"/>
+</file>
+
+<file path=customXml/itemProps1.xml><?xml version="1.0" encoding="utf-8"?>
+<ds:datastoreItem xmlns:ds="http://schemas.openxmlformats.org/officeDocument/2006/customXml" ds:itemID="{0449672C-C4AD-4FEB-B991-F64AB5C10219}">
+  <ds:schemaRefs>
+    <ds:schemaRef ds:uri="http://schemas.openxmlformats.org/officeDocument/2006/bibliography"/>
+  </ds:schemaRefs>
+</ds:datastoreItem>
 </file>
</xml_diff>

<commit_message>
fill the expriments results
</commit_message>
<xml_diff>
--- a/Group_Report_Allocation.docx
+++ b/Group_Report_Allocation.docx
@@ -577,13 +577,8 @@
               <w:t>3</w:t>
             </w:r>
             <w:r>
-              <w:t xml:space="preserve"> Generative Comparison: </w:t>
-            </w:r>
-            <w:proofErr w:type="spellStart"/>
-            <w:r>
-              <w:t>BioGPT</w:t>
-            </w:r>
-            <w:proofErr w:type="spellEnd"/>
+              <w:t xml:space="preserve"> Generative Comparison: BioGPT</w:t>
+            </w:r>
           </w:p>
         </w:tc>
         <w:tc>
@@ -1241,13 +1236,8 @@
         </w:rPr>
       </w:pPr>
       <w:r>
-        <w:t xml:space="preserve">The task: 3-class answer classification on </w:t>
-      </w:r>
-      <w:proofErr w:type="spellStart"/>
-      <w:r>
-        <w:t>PubMedQA</w:t>
-      </w:r>
-      <w:proofErr w:type="spellEnd"/>
+        <w:t>The task: 3-class answer classification on PubMedQA</w:t>
+      </w:r>
     </w:p>
     <w:p>
       <w:pPr>
@@ -1274,15 +1264,7 @@
         </w:rPr>
       </w:pPr>
       <w:r>
-        <w:t>The generative comparison (</w:t>
-      </w:r>
-      <w:proofErr w:type="spellStart"/>
-      <w:r>
-        <w:t>BioGPT</w:t>
-      </w:r>
-      <w:proofErr w:type="spellEnd"/>
-      <w:r>
-        <w:t>)</w:t>
+        <w:t>The generative comparison (BioGPT)</w:t>
       </w:r>
     </w:p>
     <w:p>
@@ -1444,15 +1426,7 @@
         </w:rPr>
       </w:pPr>
       <w:r>
-        <w:t xml:space="preserve">Brief overview of the </w:t>
-      </w:r>
-      <w:proofErr w:type="spellStart"/>
-      <w:r>
-        <w:t>PubMedQA</w:t>
-      </w:r>
-      <w:proofErr w:type="spellEnd"/>
-      <w:r>
-        <w:t xml:space="preserve"> dataset and its relevance to real-world clinical decision support</w:t>
+        <w:t>Brief overview of the PubMedQA dataset and its relevance to real-world clinical decision support</w:t>
       </w:r>
     </w:p>
     <w:p>
@@ -1489,31 +1463,7 @@
         </w:rPr>
       </w:pPr>
       <w:r>
-        <w:t xml:space="preserve">Cite 3–5 relevant works (e.g., the original </w:t>
-      </w:r>
-      <w:proofErr w:type="spellStart"/>
-      <w:r>
-        <w:t>PubMedQA</w:t>
-      </w:r>
-      <w:proofErr w:type="spellEnd"/>
-      <w:r>
-        <w:t xml:space="preserve"> paper, </w:t>
-      </w:r>
-      <w:proofErr w:type="spellStart"/>
-      <w:r>
-        <w:t>BioWordVec</w:t>
-      </w:r>
-      <w:proofErr w:type="spellEnd"/>
-      <w:r>
-        <w:t xml:space="preserve">, </w:t>
-      </w:r>
-      <w:proofErr w:type="spellStart"/>
-      <w:r>
-        <w:t>PubMedBERT</w:t>
-      </w:r>
-      <w:proofErr w:type="spellEnd"/>
-      <w:r>
-        <w:t xml:space="preserve"> papers)</w:t>
+        <w:t>Cite 3–5 relevant works (e.g., the original PubMedQA paper, BioWordVec, PubMedBERT papers)</w:t>
       </w:r>
     </w:p>
     <w:p>
@@ -1577,15 +1527,7 @@
         </w:rPr>
       </w:pPr>
       <w:r>
-        <w:t>Dataset statistics: total samples, train/dev/test split sizes, source (</w:t>
-      </w:r>
-      <w:proofErr w:type="spellStart"/>
-      <w:r>
-        <w:t>PubMedQA</w:t>
-      </w:r>
-      <w:proofErr w:type="spellEnd"/>
-      <w:r>
-        <w:t xml:space="preserve"> PQA-L, 1000 labelled samples)</w:t>
+        <w:t>Dataset statistics: total samples, train/dev/test split sizes, source (PubMedQA PQA-L, 1000 labelled samples)</w:t>
       </w:r>
     </w:p>
     <w:p>
@@ -1635,15 +1577,7 @@
         <w:t>Figure 2</w:t>
       </w:r>
       <w:r>
-        <w:t xml:space="preserve">: Token length distribution across samples — note the distribution relative to model limits (512 for BERT, 1024 for </w:t>
-      </w:r>
-      <w:proofErr w:type="spellStart"/>
-      <w:r>
-        <w:t>BioGPT</w:t>
-      </w:r>
-      <w:proofErr w:type="spellEnd"/>
-      <w:r>
-        <w:t>)</w:t>
+        <w:t>: Token length distribution across samples — note the distribution relative to model limits (512 for BERT, 1024 for BioGPT)</w:t>
       </w:r>
     </w:p>
     <w:p>
@@ -1746,50 +1680,10 @@
           <w:b/>
           <w:bCs/>
         </w:rPr>
-        <w:t xml:space="preserve">Axis 1 (TF-IDF / </w:t>
-      </w:r>
-      <w:proofErr w:type="spellStart"/>
-      <w:r>
-        <w:rPr>
-          <w:b/>
-          <w:bCs/>
-        </w:rPr>
-        <w:t>BioWordVec</w:t>
-      </w:r>
-      <w:proofErr w:type="spellEnd"/>
-      <w:r>
-        <w:rPr>
-          <w:b/>
-          <w:bCs/>
-        </w:rPr>
-        <w:t xml:space="preserve"> / </w:t>
-      </w:r>
-      <w:proofErr w:type="spellStart"/>
-      <w:r>
-        <w:rPr>
-          <w:b/>
-          <w:bCs/>
-        </w:rPr>
-        <w:t>PubMedBERT</w:t>
-      </w:r>
-      <w:proofErr w:type="spellEnd"/>
-      <w:r>
-        <w:rPr>
-          <w:b/>
-          <w:bCs/>
-        </w:rPr>
-        <w:t>) × Axis 2 (SVM / MLP)</w:t>
-      </w:r>
-      <w:r>
-        <w:t xml:space="preserve">, plus </w:t>
-      </w:r>
-      <w:proofErr w:type="spellStart"/>
-      <w:r>
-        <w:t>BioGPT</w:t>
-      </w:r>
-      <w:proofErr w:type="spellEnd"/>
-      <w:r>
-        <w:t xml:space="preserve"> as an independent generative comparison group</w:t>
+        <w:t>Axis 1 (TF-IDF / BioWordVec / PubMedBERT) × Axis 2 (SVM / MLP)</w:t>
+      </w:r>
+      <w:r>
+        <w:t>, plus BioGPT as an independent generative comparison group</w:t>
       </w:r>
     </w:p>
     <w:p>
@@ -2054,11 +1948,9 @@
                 <w:rFonts w:hint="eastAsia"/>
               </w:rPr>
             </w:pPr>
-            <w:proofErr w:type="spellStart"/>
             <w:r>
               <w:t>BioWordVec</w:t>
             </w:r>
-            <w:proofErr w:type="spellEnd"/>
           </w:p>
         </w:tc>
         <w:tc>
@@ -2121,11 +2013,9 @@
                 <w:rFonts w:hint="eastAsia"/>
               </w:rPr>
             </w:pPr>
-            <w:proofErr w:type="spellStart"/>
             <w:r>
               <w:t>PubMedBERT</w:t>
             </w:r>
-            <w:proofErr w:type="spellEnd"/>
           </w:p>
         </w:tc>
         <w:tc>
@@ -2483,7 +2373,6 @@
           <w:rFonts w:hint="eastAsia"/>
         </w:rPr>
       </w:pPr>
-      <w:proofErr w:type="spellStart"/>
       <w:r>
         <w:rPr>
           <w:b/>
@@ -2491,7 +2380,6 @@
         </w:rPr>
         <w:t>BioWordVec</w:t>
       </w:r>
-      <w:proofErr w:type="spellEnd"/>
     </w:p>
     <w:p>
       <w:pPr>
@@ -2546,7 +2434,6 @@
           <w:rFonts w:hint="eastAsia"/>
         </w:rPr>
       </w:pPr>
-      <w:proofErr w:type="spellStart"/>
       <w:r>
         <w:rPr>
           <w:b/>
@@ -2554,7 +2441,6 @@
         </w:rPr>
         <w:t>PubMedBERT</w:t>
       </w:r>
-      <w:proofErr w:type="spellEnd"/>
     </w:p>
     <w:p>
       <w:pPr>
@@ -2803,41 +2689,24 @@
         </w:rPr>
       </w:pPr>
       <w:r>
-        <w:t xml:space="preserve">Note MLP hyperparameter tuning conducted for </w:t>
-      </w:r>
-      <w:proofErr w:type="spellStart"/>
-      <w:r>
-        <w:t>BioWordVec</w:t>
-      </w:r>
-      <w:proofErr w:type="spellEnd"/>
-      <w:r>
-        <w:t xml:space="preserve"> pipeline (Haoran); describe the search space and criterion</w:t>
-      </w:r>
-    </w:p>
-    <w:p>
-      <w:pPr>
-        <w:rPr>
-          <w:rFonts w:hint="eastAsia"/>
-          <w:b/>
-          <w:bCs/>
-        </w:rPr>
-      </w:pPr>
-      <w:r>
-        <w:rPr>
-          <w:b/>
-          <w:bCs/>
-        </w:rPr>
-        <w:t xml:space="preserve">3.5 Generative Comparison: </w:t>
-      </w:r>
-      <w:proofErr w:type="spellStart"/>
-      <w:r>
-        <w:rPr>
-          <w:b/>
-          <w:bCs/>
-        </w:rPr>
-        <w:t>BioGPT</w:t>
-      </w:r>
-      <w:proofErr w:type="spellEnd"/>
+        <w:t>Note MLP hyperparameter tuning conducted for BioWordVec pipeline (Haoran); describe the search space and criterion</w:t>
+      </w:r>
+    </w:p>
+    <w:p>
+      <w:pPr>
+        <w:rPr>
+          <w:rFonts w:hint="eastAsia"/>
+          <w:b/>
+          <w:bCs/>
+        </w:rPr>
+      </w:pPr>
+      <w:r>
+        <w:rPr>
+          <w:b/>
+          <w:bCs/>
+        </w:rPr>
+        <w:t>3.5 Generative Comparison: BioGPT</w:t>
+      </w:r>
     </w:p>
     <w:p>
       <w:pPr>
@@ -2902,15 +2771,7 @@
         </w:rPr>
       </w:pPr>
       <w:r>
-        <w:t xml:space="preserve">Position this section clearly: </w:t>
-      </w:r>
-      <w:proofErr w:type="spellStart"/>
-      <w:r>
-        <w:t>BioGPT</w:t>
-      </w:r>
-      <w:proofErr w:type="spellEnd"/>
-      <w:r>
-        <w:t xml:space="preserve"> is evaluated as a </w:t>
+        <w:t xml:space="preserve">Position this section clearly: BioGPT is evaluated as a </w:t>
       </w:r>
       <w:r>
         <w:rPr>
@@ -2964,15 +2825,7 @@
       </w:r>
       <w:proofErr w:type="spellEnd"/>
       <w:r>
-        <w:t xml:space="preserve">; pre-trained only, no </w:t>
-      </w:r>
-      <w:proofErr w:type="spellStart"/>
-      <w:r>
-        <w:t>PubMedQA</w:t>
-      </w:r>
-      <w:proofErr w:type="spellEnd"/>
-      <w:r>
-        <w:t xml:space="preserve"> exposure</w:t>
+        <w:t>; pre-trained only, no PubMedQA exposure</w:t>
       </w:r>
     </w:p>
     <w:p>
@@ -3069,15 +2922,7 @@
         </w:rPr>
       </w:pPr>
       <w:r>
-        <w:t xml:space="preserve">Model: same </w:t>
-      </w:r>
-      <w:proofErr w:type="spellStart"/>
-      <w:r>
-        <w:t>BioGPT</w:t>
-      </w:r>
-      <w:proofErr w:type="spellEnd"/>
-      <w:r>
-        <w:t xml:space="preserve"> architecture, parameter-efficient fine-tuning via </w:t>
+        <w:t xml:space="preserve">Model: same BioGPT architecture, parameter-efficient fine-tuning via </w:t>
       </w:r>
       <w:proofErr w:type="spellStart"/>
       <w:r>
@@ -3096,15 +2941,7 @@
         </w:rPr>
       </w:pPr>
       <w:r>
-        <w:t xml:space="preserve">Training data: </w:t>
-      </w:r>
-      <w:proofErr w:type="spellStart"/>
-      <w:r>
-        <w:t>PubMedQA</w:t>
-      </w:r>
-      <w:proofErr w:type="spellEnd"/>
-      <w:r>
-        <w:t xml:space="preserve"> train split</w:t>
+        <w:t>Training data: PubMedQA train split</w:t>
       </w:r>
     </w:p>
     <w:p>
@@ -3441,15 +3278,7 @@
         </w:rPr>
       </w:pPr>
       <w:r>
-        <w:t xml:space="preserve">Hardware / runtime notes where relevant (e.g., </w:t>
-      </w:r>
-      <w:proofErr w:type="spellStart"/>
-      <w:r>
-        <w:t>BioGPT</w:t>
-      </w:r>
-      <w:proofErr w:type="spellEnd"/>
-      <w:r>
-        <w:t xml:space="preserve"> inference: ~3m 43s for 500 samples on CUDA)</w:t>
+        <w:t>Hardware / runtime notes where relevant (e.g., BioGPT inference: ~3m 43s for 500 samples on CUDA)</w:t>
       </w:r>
     </w:p>
     <w:p>
@@ -3554,6 +3383,10 @@
       <w:tblPr>
         <w:tblW w:w="0" w:type="auto"/>
         <w:tblCellSpacing w:w="15" w:type="dxa"/>
+        <w:tblBorders>
+          <w:bottom w:val="single" w:sz="4" w:space="0" w:color="156082" w:themeColor="accent1"/>
+          <w:insideH w:val="single" w:sz="4" w:space="0" w:color="156082" w:themeColor="accent1"/>
+        </w:tblBorders>
         <w:tblCellMar>
           <w:top w:w="15" w:type="dxa"/>
           <w:left w:w="15" w:type="dxa"/>
@@ -3563,14 +3396,14 @@
         <w:tblLook w:val="04A0" w:firstRow="1" w:lastRow="0" w:firstColumn="1" w:lastColumn="0" w:noHBand="0" w:noVBand="1"/>
       </w:tblPr>
       <w:tblGrid>
-        <w:gridCol w:w="1598"/>
-        <w:gridCol w:w="1507"/>
-        <w:gridCol w:w="1185"/>
+        <w:gridCol w:w="1423"/>
+        <w:gridCol w:w="1911"/>
+        <w:gridCol w:w="1149"/>
         <w:gridCol w:w="914"/>
-        <w:gridCol w:w="888"/>
-        <w:gridCol w:w="643"/>
-        <w:gridCol w:w="595"/>
-        <w:gridCol w:w="976"/>
+        <w:gridCol w:w="838"/>
+        <w:gridCol w:w="596"/>
+        <w:gridCol w:w="559"/>
+        <w:gridCol w:w="916"/>
       </w:tblGrid>
       <w:tr>
         <w:trPr>
@@ -3965,6 +3798,12 @@
               <w:t>MeSH</w:t>
             </w:r>
             <w:proofErr w:type="spellEnd"/>
+            <w:r>
+              <w:rPr>
+                <w:rFonts w:hint="eastAsia"/>
+              </w:rPr>
+              <w:t>(PCA)</w:t>
+            </w:r>
           </w:p>
         </w:tc>
         <w:tc>
@@ -3997,75 +3836,96 @@
               </w:rPr>
             </w:pPr>
             <w:r>
-              <w:t>—</w:t>
-            </w:r>
-          </w:p>
-        </w:tc>
-        <w:tc>
-          <w:tcPr>
-            <w:tcW w:w="0" w:type="auto"/>
-            <w:vAlign w:val="center"/>
-            <w:hideMark/>
-          </w:tcPr>
-          <w:p>
-            <w:pPr>
-              <w:rPr>
-                <w:rFonts w:hint="eastAsia"/>
-              </w:rPr>
-            </w:pPr>
-            <w:r>
-              <w:t>—</w:t>
-            </w:r>
-          </w:p>
-        </w:tc>
-        <w:tc>
-          <w:tcPr>
-            <w:tcW w:w="0" w:type="auto"/>
-            <w:vAlign w:val="center"/>
-            <w:hideMark/>
-          </w:tcPr>
-          <w:p>
-            <w:pPr>
-              <w:rPr>
-                <w:rFonts w:hint="eastAsia"/>
-              </w:rPr>
-            </w:pPr>
-            <w:r>
-              <w:t>—</w:t>
-            </w:r>
-          </w:p>
-        </w:tc>
-        <w:tc>
-          <w:tcPr>
-            <w:tcW w:w="0" w:type="auto"/>
-            <w:vAlign w:val="center"/>
-            <w:hideMark/>
-          </w:tcPr>
-          <w:p>
-            <w:pPr>
-              <w:rPr>
-                <w:rFonts w:hint="eastAsia"/>
-              </w:rPr>
-            </w:pPr>
-            <w:r>
-              <w:t>—</w:t>
-            </w:r>
-          </w:p>
-        </w:tc>
-        <w:tc>
-          <w:tcPr>
-            <w:tcW w:w="0" w:type="auto"/>
-            <w:vAlign w:val="center"/>
-            <w:hideMark/>
-          </w:tcPr>
-          <w:p>
-            <w:pPr>
-              <w:rPr>
-                <w:rFonts w:hint="eastAsia"/>
-              </w:rPr>
-            </w:pPr>
-            <w:r>
-              <w:t>—</w:t>
+              <w:rPr>
+                <w:rFonts w:hint="eastAsia"/>
+              </w:rPr>
+              <w:t>0.49</w:t>
+            </w:r>
+          </w:p>
+        </w:tc>
+        <w:tc>
+          <w:tcPr>
+            <w:tcW w:w="0" w:type="auto"/>
+            <w:vAlign w:val="center"/>
+            <w:hideMark/>
+          </w:tcPr>
+          <w:p>
+            <w:pPr>
+              <w:rPr>
+                <w:rFonts w:hint="eastAsia"/>
+              </w:rPr>
+            </w:pPr>
+            <w:r>
+              <w:rPr>
+                <w:rFonts w:hint="eastAsia"/>
+              </w:rPr>
+              <w:t>0.</w:t>
+            </w:r>
+            <w:r>
+              <w:rPr>
+                <w:rFonts w:hint="eastAsia"/>
+              </w:rPr>
+              <w:t>36</w:t>
+            </w:r>
+          </w:p>
+        </w:tc>
+        <w:tc>
+          <w:tcPr>
+            <w:tcW w:w="0" w:type="auto"/>
+            <w:vAlign w:val="center"/>
+            <w:hideMark/>
+          </w:tcPr>
+          <w:p>
+            <w:pPr>
+              <w:rPr>
+                <w:rFonts w:hint="eastAsia"/>
+              </w:rPr>
+            </w:pPr>
+            <w:r>
+              <w:rPr>
+                <w:rFonts w:hint="eastAsia"/>
+              </w:rPr>
+              <w:t>0.62</w:t>
+            </w:r>
+          </w:p>
+        </w:tc>
+        <w:tc>
+          <w:tcPr>
+            <w:tcW w:w="0" w:type="auto"/>
+            <w:vAlign w:val="center"/>
+            <w:hideMark/>
+          </w:tcPr>
+          <w:p>
+            <w:pPr>
+              <w:rPr>
+                <w:rFonts w:hint="eastAsia"/>
+              </w:rPr>
+            </w:pPr>
+            <w:r>
+              <w:rPr>
+                <w:rFonts w:hint="eastAsia"/>
+              </w:rPr>
+              <w:t>0.36</w:t>
+            </w:r>
+          </w:p>
+        </w:tc>
+        <w:tc>
+          <w:tcPr>
+            <w:tcW w:w="0" w:type="auto"/>
+            <w:vAlign w:val="center"/>
+            <w:hideMark/>
+          </w:tcPr>
+          <w:p>
+            <w:pPr>
+              <w:rPr>
+                <w:rFonts w:hint="eastAsia"/>
+              </w:rPr>
+            </w:pPr>
+            <w:r>
+              <w:rPr>
+                <w:rFonts w:hint="eastAsia"/>
+              </w:rPr>
+              <w:t>0.11</w:t>
             </w:r>
           </w:p>
         </w:tc>
@@ -4078,37 +3938,15 @@
           <w:tcPr>
             <w:tcW w:w="0" w:type="auto"/>
             <w:vAlign w:val="center"/>
-            <w:hideMark/>
-          </w:tcPr>
-          <w:p>
-            <w:pPr>
-              <w:rPr>
-                <w:rFonts w:hint="eastAsia"/>
-              </w:rPr>
-            </w:pPr>
-            <w:r>
-              <w:t>P</w:t>
-            </w:r>
-            <w:r>
-              <w:rPr>
-                <w:rFonts w:hint="eastAsia"/>
-              </w:rPr>
-              <w:t>2</w:t>
-            </w:r>
-          </w:p>
-        </w:tc>
-        <w:tc>
-          <w:tcPr>
-            <w:tcW w:w="0" w:type="auto"/>
-            <w:vAlign w:val="center"/>
-            <w:hideMark/>
-          </w:tcPr>
-          <w:p>
-            <w:pPr>
-              <w:rPr>
-                <w:rFonts w:hint="eastAsia"/>
-              </w:rPr>
-            </w:pPr>
+          </w:tcPr>
+          <w:p/>
+        </w:tc>
+        <w:tc>
+          <w:tcPr>
+            <w:tcW w:w="0" w:type="auto"/>
+            <w:vAlign w:val="center"/>
+          </w:tcPr>
+          <w:p>
             <w:r>
               <w:t>TF-IDF +</w:t>
             </w:r>
@@ -4123,101 +3961,113 @@
           <w:tcPr>
             <w:tcW w:w="0" w:type="auto"/>
             <w:vAlign w:val="center"/>
-            <w:hideMark/>
-          </w:tcPr>
-          <w:p>
-            <w:pPr>
-              <w:rPr>
-                <w:rFonts w:hint="eastAsia"/>
-              </w:rPr>
-            </w:pPr>
-            <w:r>
-              <w:t>MLP</w:t>
-            </w:r>
-          </w:p>
-        </w:tc>
-        <w:tc>
-          <w:tcPr>
-            <w:tcW w:w="0" w:type="auto"/>
-            <w:vAlign w:val="center"/>
-            <w:hideMark/>
-          </w:tcPr>
-          <w:p>
-            <w:pPr>
-              <w:rPr>
-                <w:rFonts w:hint="eastAsia"/>
-              </w:rPr>
-            </w:pPr>
-            <w:r>
-              <w:t>—</w:t>
-            </w:r>
-          </w:p>
-        </w:tc>
-        <w:tc>
-          <w:tcPr>
-            <w:tcW w:w="0" w:type="auto"/>
-            <w:vAlign w:val="center"/>
-            <w:hideMark/>
-          </w:tcPr>
-          <w:p>
-            <w:pPr>
-              <w:rPr>
-                <w:rFonts w:hint="eastAsia"/>
-              </w:rPr>
-            </w:pPr>
-            <w:r>
-              <w:t>—</w:t>
-            </w:r>
-          </w:p>
-        </w:tc>
-        <w:tc>
-          <w:tcPr>
-            <w:tcW w:w="0" w:type="auto"/>
-            <w:vAlign w:val="center"/>
-            <w:hideMark/>
-          </w:tcPr>
-          <w:p>
-            <w:pPr>
-              <w:rPr>
-                <w:rFonts w:hint="eastAsia"/>
-              </w:rPr>
-            </w:pPr>
-            <w:r>
-              <w:t>—</w:t>
-            </w:r>
-          </w:p>
-        </w:tc>
-        <w:tc>
-          <w:tcPr>
-            <w:tcW w:w="0" w:type="auto"/>
-            <w:vAlign w:val="center"/>
-            <w:hideMark/>
-          </w:tcPr>
-          <w:p>
-            <w:pPr>
-              <w:rPr>
-                <w:rFonts w:hint="eastAsia"/>
-              </w:rPr>
-            </w:pPr>
-            <w:r>
-              <w:t>—</w:t>
-            </w:r>
-          </w:p>
-        </w:tc>
-        <w:tc>
-          <w:tcPr>
-            <w:tcW w:w="0" w:type="auto"/>
-            <w:vAlign w:val="center"/>
-            <w:hideMark/>
-          </w:tcPr>
-          <w:p>
-            <w:pPr>
-              <w:rPr>
-                <w:rFonts w:hint="eastAsia"/>
-              </w:rPr>
-            </w:pPr>
-            <w:r>
-              <w:t>—</w:t>
+          </w:tcPr>
+          <w:p>
+            <w:pPr>
+              <w:rPr>
+                <w:rFonts w:hint="eastAsia"/>
+              </w:rPr>
+            </w:pPr>
+            <w:r>
+              <w:rPr>
+                <w:rFonts w:hint="eastAsia"/>
+              </w:rPr>
+              <w:t>SVM</w:t>
+            </w:r>
+          </w:p>
+        </w:tc>
+        <w:tc>
+          <w:tcPr>
+            <w:tcW w:w="0" w:type="auto"/>
+            <w:vAlign w:val="center"/>
+          </w:tcPr>
+          <w:p>
+            <w:pPr>
+              <w:rPr>
+                <w:rFonts w:hint="eastAsia"/>
+              </w:rPr>
+            </w:pPr>
+            <w:r>
+              <w:rPr>
+                <w:rFonts w:hint="eastAsia"/>
+              </w:rPr>
+              <w:t>0.53</w:t>
+            </w:r>
+          </w:p>
+        </w:tc>
+        <w:tc>
+          <w:tcPr>
+            <w:tcW w:w="0" w:type="auto"/>
+            <w:vAlign w:val="center"/>
+          </w:tcPr>
+          <w:p>
+            <w:pPr>
+              <w:rPr>
+                <w:rFonts w:hint="eastAsia"/>
+              </w:rPr>
+            </w:pPr>
+            <w:r>
+              <w:rPr>
+                <w:rFonts w:hint="eastAsia"/>
+              </w:rPr>
+              <w:t>0.36</w:t>
+            </w:r>
+          </w:p>
+        </w:tc>
+        <w:tc>
+          <w:tcPr>
+            <w:tcW w:w="0" w:type="auto"/>
+            <w:vAlign w:val="center"/>
+          </w:tcPr>
+          <w:p>
+            <w:pPr>
+              <w:rPr>
+                <w:rFonts w:hint="eastAsia"/>
+              </w:rPr>
+            </w:pPr>
+            <w:r>
+              <w:rPr>
+                <w:rFonts w:hint="eastAsia"/>
+              </w:rPr>
+              <w:t>0.65</w:t>
+            </w:r>
+          </w:p>
+        </w:tc>
+        <w:tc>
+          <w:tcPr>
+            <w:tcW w:w="0" w:type="auto"/>
+            <w:vAlign w:val="center"/>
+          </w:tcPr>
+          <w:p>
+            <w:pPr>
+              <w:rPr>
+                <w:rFonts w:hint="eastAsia"/>
+              </w:rPr>
+            </w:pPr>
+            <w:r>
+              <w:rPr>
+                <w:rFonts w:hint="eastAsia"/>
+              </w:rPr>
+              <w:t>0.35</w:t>
+            </w:r>
+          </w:p>
+        </w:tc>
+        <w:tc>
+          <w:tcPr>
+            <w:tcW w:w="0" w:type="auto"/>
+            <w:vAlign w:val="center"/>
+          </w:tcPr>
+          <w:p>
+            <w:pPr>
+              <w:rPr>
+                <w:rFonts w:hint="eastAsia"/>
+              </w:rPr>
+            </w:pPr>
+            <w:r>
+              <w:rPr>
+                <w:rFonts w:hint="eastAsia"/>
+              </w:rPr>
+              <w:t>0.09</w:t>
             </w:r>
           </w:p>
         </w:tc>
@@ -4245,25 +4095,28 @@
               <w:rPr>
                 <w:rFonts w:hint="eastAsia"/>
               </w:rPr>
-              <w:t>3</w:t>
-            </w:r>
-          </w:p>
-        </w:tc>
-        <w:tc>
-          <w:tcPr>
-            <w:tcW w:w="0" w:type="auto"/>
-            <w:vAlign w:val="center"/>
-            <w:hideMark/>
-          </w:tcPr>
-          <w:p>
-            <w:pPr>
-              <w:rPr>
-                <w:rFonts w:hint="eastAsia"/>
-              </w:rPr>
-            </w:pPr>
+              <w:t>2</w:t>
+            </w:r>
+          </w:p>
+        </w:tc>
+        <w:tc>
+          <w:tcPr>
+            <w:tcW w:w="0" w:type="auto"/>
+            <w:vAlign w:val="center"/>
+            <w:hideMark/>
+          </w:tcPr>
+          <w:p>
+            <w:pPr>
+              <w:rPr>
+                <w:rFonts w:hint="eastAsia"/>
+              </w:rPr>
+            </w:pPr>
+            <w:r>
+              <w:t>TF-IDF +</w:t>
+            </w:r>
             <w:proofErr w:type="spellStart"/>
             <w:r>
-              <w:t>BioWordVec</w:t>
+              <w:t>MeSH</w:t>
             </w:r>
             <w:proofErr w:type="spellEnd"/>
           </w:p>
@@ -4301,27 +4154,47 @@
               <w:rPr>
                 <w:rFonts w:hint="eastAsia"/>
               </w:rPr>
-              <w:t>0.16</w:t>
-            </w:r>
-          </w:p>
-        </w:tc>
-        <w:tc>
-          <w:tcPr>
-            <w:tcW w:w="0" w:type="auto"/>
-            <w:vAlign w:val="center"/>
-            <w:hideMark/>
-          </w:tcPr>
-          <w:p>
-            <w:pPr>
-              <w:rPr>
-                <w:rFonts w:hint="eastAsia"/>
-              </w:rPr>
-            </w:pPr>
-            <w:r>
-              <w:rPr>
-                <w:rFonts w:hint="eastAsia"/>
-              </w:rPr>
-              <w:t>0.15</w:t>
+              <w:t>0.55</w:t>
+            </w:r>
+          </w:p>
+        </w:tc>
+        <w:tc>
+          <w:tcPr>
+            <w:tcW w:w="0" w:type="auto"/>
+            <w:vAlign w:val="center"/>
+            <w:hideMark/>
+          </w:tcPr>
+          <w:p>
+            <w:pPr>
+              <w:rPr>
+                <w:rFonts w:hint="eastAsia"/>
+              </w:rPr>
+            </w:pPr>
+            <w:r>
+              <w:rPr>
+                <w:rFonts w:hint="eastAsia"/>
+              </w:rPr>
+              <w:t>0.24</w:t>
+            </w:r>
+          </w:p>
+        </w:tc>
+        <w:tc>
+          <w:tcPr>
+            <w:tcW w:w="0" w:type="auto"/>
+            <w:vAlign w:val="center"/>
+            <w:hideMark/>
+          </w:tcPr>
+          <w:p>
+            <w:pPr>
+              <w:rPr>
+                <w:rFonts w:hint="eastAsia"/>
+              </w:rPr>
+            </w:pPr>
+            <w:r>
+              <w:rPr>
+                <w:rFonts w:hint="eastAsia"/>
+              </w:rPr>
+              <w:t>0.71</w:t>
             </w:r>
           </w:p>
         </w:tc>
@@ -4361,27 +4234,7 @@
               <w:rPr>
                 <w:rFonts w:hint="eastAsia"/>
               </w:rPr>
-              <w:t>0.25</w:t>
-            </w:r>
-          </w:p>
-        </w:tc>
-        <w:tc>
-          <w:tcPr>
-            <w:tcW w:w="0" w:type="auto"/>
-            <w:vAlign w:val="center"/>
-            <w:hideMark/>
-          </w:tcPr>
-          <w:p>
-            <w:pPr>
-              <w:rPr>
-                <w:rFonts w:hint="eastAsia"/>
-              </w:rPr>
-            </w:pPr>
-            <w:r>
-              <w:rPr>
-                <w:rFonts w:hint="eastAsia"/>
-              </w:rPr>
-              <w:t>0.21</w:t>
+              <w:t>0</w:t>
             </w:r>
           </w:p>
         </w:tc>
@@ -4394,133 +4247,156 @@
           <w:tcPr>
             <w:tcW w:w="0" w:type="auto"/>
             <w:vAlign w:val="center"/>
-          </w:tcPr>
-          <w:p/>
-        </w:tc>
-        <w:tc>
-          <w:tcPr>
-            <w:tcW w:w="0" w:type="auto"/>
-            <w:gridSpan w:val="2"/>
-            <w:vAlign w:val="center"/>
-          </w:tcPr>
-          <w:p>
-            <w:pPr>
-              <w:rPr>
-                <w:rFonts w:hint="eastAsia"/>
-              </w:rPr>
-            </w:pPr>
-            <w:r>
-              <w:rPr>
-                <w:rFonts w:hint="eastAsia"/>
-              </w:rPr>
-              <w:t xml:space="preserve">PCA </w:t>
-            </w:r>
-            <w:r>
-              <w:rPr>
-                <w:rFonts w:hint="eastAsia"/>
-              </w:rPr>
-              <w:t>dim</w:t>
-            </w:r>
-            <w:r>
-              <w:rPr>
-                <w:rFonts w:hint="eastAsia"/>
-              </w:rPr>
-              <w:t>46</w:t>
-            </w:r>
-          </w:p>
-        </w:tc>
-        <w:tc>
-          <w:tcPr>
-            <w:tcW w:w="0" w:type="auto"/>
-            <w:vAlign w:val="center"/>
-          </w:tcPr>
-          <w:p>
-            <w:pPr>
-              <w:rPr>
-                <w:rFonts w:hint="eastAsia"/>
-              </w:rPr>
-            </w:pPr>
-            <w:r>
-              <w:rPr>
-                <w:rFonts w:hint="eastAsia"/>
-              </w:rPr>
-              <w:t>0.47</w:t>
-            </w:r>
-          </w:p>
-        </w:tc>
-        <w:tc>
-          <w:tcPr>
-            <w:tcW w:w="0" w:type="auto"/>
-            <w:vAlign w:val="center"/>
-          </w:tcPr>
-          <w:p>
-            <w:pPr>
-              <w:rPr>
-                <w:rFonts w:hint="eastAsia"/>
-              </w:rPr>
-            </w:pPr>
-            <w:r>
-              <w:rPr>
-                <w:rFonts w:hint="eastAsia"/>
-              </w:rPr>
-              <w:t>0.33</w:t>
-            </w:r>
-          </w:p>
-        </w:tc>
-        <w:tc>
-          <w:tcPr>
-            <w:tcW w:w="0" w:type="auto"/>
-            <w:vAlign w:val="center"/>
-          </w:tcPr>
-          <w:p>
-            <w:pPr>
-              <w:rPr>
-                <w:rFonts w:hint="eastAsia"/>
-              </w:rPr>
-            </w:pPr>
-            <w:r>
-              <w:rPr>
-                <w:rFonts w:hint="eastAsia"/>
-              </w:rPr>
-              <w:t>0.61</w:t>
-            </w:r>
-          </w:p>
-        </w:tc>
-        <w:tc>
-          <w:tcPr>
-            <w:tcW w:w="0" w:type="auto"/>
-            <w:vAlign w:val="center"/>
-          </w:tcPr>
-          <w:p>
-            <w:pPr>
-              <w:rPr>
-                <w:rFonts w:hint="eastAsia"/>
-              </w:rPr>
-            </w:pPr>
-            <w:r>
-              <w:rPr>
-                <w:rFonts w:hint="eastAsia"/>
-              </w:rPr>
-              <w:t>0.28</w:t>
-            </w:r>
-          </w:p>
-        </w:tc>
-        <w:tc>
-          <w:tcPr>
-            <w:tcW w:w="0" w:type="auto"/>
-            <w:vAlign w:val="center"/>
-          </w:tcPr>
-          <w:p>
-            <w:pPr>
-              <w:rPr>
-                <w:rFonts w:hint="eastAsia"/>
-              </w:rPr>
-            </w:pPr>
-            <w:r>
-              <w:rPr>
-                <w:rFonts w:hint="eastAsia"/>
-              </w:rPr>
-              <w:t>0.11</w:t>
+            <w:hideMark/>
+          </w:tcPr>
+          <w:p>
+            <w:pPr>
+              <w:rPr>
+                <w:rFonts w:hint="eastAsia"/>
+              </w:rPr>
+            </w:pPr>
+            <w:r>
+              <w:t>P</w:t>
+            </w:r>
+            <w:r>
+              <w:rPr>
+                <w:rFonts w:hint="eastAsia"/>
+              </w:rPr>
+              <w:t>3</w:t>
+            </w:r>
+          </w:p>
+        </w:tc>
+        <w:tc>
+          <w:tcPr>
+            <w:tcW w:w="0" w:type="auto"/>
+            <w:vAlign w:val="center"/>
+            <w:hideMark/>
+          </w:tcPr>
+          <w:p>
+            <w:pPr>
+              <w:rPr>
+                <w:rFonts w:hint="eastAsia"/>
+              </w:rPr>
+            </w:pPr>
+            <w:r>
+              <w:t>BioWordVec</w:t>
+            </w:r>
+          </w:p>
+        </w:tc>
+        <w:tc>
+          <w:tcPr>
+            <w:tcW w:w="0" w:type="auto"/>
+            <w:vAlign w:val="center"/>
+            <w:hideMark/>
+          </w:tcPr>
+          <w:p>
+            <w:pPr>
+              <w:rPr>
+                <w:rFonts w:hint="eastAsia"/>
+              </w:rPr>
+            </w:pPr>
+            <w:r>
+              <w:t>MLP</w:t>
+            </w:r>
+          </w:p>
+        </w:tc>
+        <w:tc>
+          <w:tcPr>
+            <w:tcW w:w="0" w:type="auto"/>
+            <w:vAlign w:val="center"/>
+            <w:hideMark/>
+          </w:tcPr>
+          <w:p>
+            <w:pPr>
+              <w:rPr>
+                <w:rFonts w:hint="eastAsia"/>
+              </w:rPr>
+            </w:pPr>
+            <w:r>
+              <w:rPr>
+                <w:rFonts w:hint="eastAsia"/>
+              </w:rPr>
+              <w:t>0.16</w:t>
+            </w:r>
+          </w:p>
+        </w:tc>
+        <w:tc>
+          <w:tcPr>
+            <w:tcW w:w="0" w:type="auto"/>
+            <w:vAlign w:val="center"/>
+            <w:hideMark/>
+          </w:tcPr>
+          <w:p>
+            <w:pPr>
+              <w:rPr>
+                <w:rFonts w:hint="eastAsia"/>
+              </w:rPr>
+            </w:pPr>
+            <w:r>
+              <w:rPr>
+                <w:rFonts w:hint="eastAsia"/>
+              </w:rPr>
+              <w:t>0.15</w:t>
+            </w:r>
+          </w:p>
+        </w:tc>
+        <w:tc>
+          <w:tcPr>
+            <w:tcW w:w="0" w:type="auto"/>
+            <w:vAlign w:val="center"/>
+            <w:hideMark/>
+          </w:tcPr>
+          <w:p>
+            <w:pPr>
+              <w:rPr>
+                <w:rFonts w:hint="eastAsia"/>
+              </w:rPr>
+            </w:pPr>
+            <w:r>
+              <w:rPr>
+                <w:rFonts w:hint="eastAsia"/>
+              </w:rPr>
+              <w:t>0</w:t>
+            </w:r>
+          </w:p>
+        </w:tc>
+        <w:tc>
+          <w:tcPr>
+            <w:tcW w:w="0" w:type="auto"/>
+            <w:vAlign w:val="center"/>
+            <w:hideMark/>
+          </w:tcPr>
+          <w:p>
+            <w:pPr>
+              <w:rPr>
+                <w:rFonts w:hint="eastAsia"/>
+              </w:rPr>
+            </w:pPr>
+            <w:r>
+              <w:rPr>
+                <w:rFonts w:hint="eastAsia"/>
+              </w:rPr>
+              <w:t>0.25</w:t>
+            </w:r>
+          </w:p>
+        </w:tc>
+        <w:tc>
+          <w:tcPr>
+            <w:tcW w:w="0" w:type="auto"/>
+            <w:vAlign w:val="center"/>
+            <w:hideMark/>
+          </w:tcPr>
+          <w:p>
+            <w:pPr>
+              <w:rPr>
+                <w:rFonts w:hint="eastAsia"/>
+              </w:rPr>
+            </w:pPr>
+            <w:r>
+              <w:rPr>
+                <w:rFonts w:hint="eastAsia"/>
+              </w:rPr>
+              <w:t>0.21</w:t>
             </w:r>
           </w:p>
         </w:tc>
@@ -4534,7 +4410,13 @@
             <w:tcW w:w="0" w:type="auto"/>
             <w:vAlign w:val="center"/>
           </w:tcPr>
-          <w:p/>
+          <w:p>
+            <w:pPr>
+              <w:rPr>
+                <w:rFonts w:hint="eastAsia"/>
+              </w:rPr>
+            </w:pPr>
+          </w:p>
         </w:tc>
         <w:tc>
           <w:tcPr>
@@ -4548,83 +4430,131 @@
                 <w:rFonts w:hint="eastAsia"/>
               </w:rPr>
             </w:pPr>
-          </w:p>
-        </w:tc>
-        <w:tc>
-          <w:tcPr>
-            <w:tcW w:w="0" w:type="auto"/>
-            <w:vAlign w:val="center"/>
-          </w:tcPr>
-          <w:p>
-            <w:pPr>
-              <w:rPr>
-                <w:rFonts w:hint="eastAsia"/>
-              </w:rPr>
-            </w:pPr>
-            <w:r>
-              <w:rPr>
-                <w:rFonts w:hint="eastAsia"/>
-              </w:rPr>
-              <w:t>0.40</w:t>
-            </w:r>
-          </w:p>
-        </w:tc>
-        <w:tc>
-          <w:tcPr>
-            <w:tcW w:w="0" w:type="auto"/>
-            <w:vAlign w:val="center"/>
-          </w:tcPr>
-          <w:p>
-            <w:pPr>
-              <w:rPr>
-                <w:rFonts w:hint="eastAsia"/>
-              </w:rPr>
-            </w:pPr>
-            <w:r>
-              <w:rPr>
-                <w:rFonts w:hint="eastAsia"/>
-              </w:rPr>
-              <w:t>0.36</w:t>
-            </w:r>
-          </w:p>
-        </w:tc>
-        <w:tc>
-          <w:tcPr>
-            <w:tcW w:w="0" w:type="auto"/>
-            <w:vAlign w:val="center"/>
-          </w:tcPr>
-          <w:p>
-            <w:pPr>
-              <w:rPr>
-                <w:rFonts w:hint="eastAsia"/>
-              </w:rPr>
-            </w:pPr>
-          </w:p>
-        </w:tc>
-        <w:tc>
-          <w:tcPr>
-            <w:tcW w:w="0" w:type="auto"/>
-            <w:vAlign w:val="center"/>
-          </w:tcPr>
-          <w:p>
-            <w:pPr>
-              <w:rPr>
-                <w:rFonts w:hint="eastAsia"/>
-              </w:rPr>
-            </w:pPr>
-          </w:p>
-        </w:tc>
-        <w:tc>
-          <w:tcPr>
-            <w:tcW w:w="0" w:type="auto"/>
-            <w:vAlign w:val="center"/>
-          </w:tcPr>
-          <w:p>
-            <w:pPr>
-              <w:rPr>
-                <w:rFonts w:hint="eastAsia"/>
-              </w:rPr>
-            </w:pPr>
+            <w:r>
+              <w:rPr>
+                <w:rFonts w:hint="eastAsia"/>
+              </w:rPr>
+              <w:t xml:space="preserve">PCA </w:t>
+            </w:r>
+            <w:r>
+              <w:rPr>
+                <w:rFonts w:hint="eastAsia"/>
+              </w:rPr>
+              <w:t>dim</w:t>
+            </w:r>
+            <w:r>
+              <w:rPr>
+                <w:rFonts w:hint="eastAsia"/>
+              </w:rPr>
+              <w:t>46</w:t>
+            </w:r>
+            <w:r>
+              <w:rPr>
+                <w:rFonts w:hint="eastAsia"/>
+              </w:rPr>
+              <w:t xml:space="preserve"> ep</w:t>
+            </w:r>
+            <w:r>
+              <w:rPr>
+                <w:rFonts w:hint="eastAsia"/>
+              </w:rPr>
+              <w:t>och15</w:t>
+            </w:r>
+          </w:p>
+        </w:tc>
+        <w:tc>
+          <w:tcPr>
+            <w:tcW w:w="0" w:type="auto"/>
+            <w:vAlign w:val="center"/>
+          </w:tcPr>
+          <w:p>
+            <w:pPr>
+              <w:rPr>
+                <w:rFonts w:hint="eastAsia"/>
+              </w:rPr>
+            </w:pPr>
+            <w:r>
+              <w:rPr>
+                <w:rFonts w:hint="eastAsia"/>
+              </w:rPr>
+              <w:t>0.47</w:t>
+            </w:r>
+          </w:p>
+        </w:tc>
+        <w:tc>
+          <w:tcPr>
+            <w:tcW w:w="0" w:type="auto"/>
+            <w:vAlign w:val="center"/>
+          </w:tcPr>
+          <w:p>
+            <w:pPr>
+              <w:rPr>
+                <w:rFonts w:hint="eastAsia"/>
+              </w:rPr>
+            </w:pPr>
+            <w:r>
+              <w:rPr>
+                <w:rFonts w:hint="eastAsia"/>
+              </w:rPr>
+              <w:t>0.33</w:t>
+            </w:r>
+          </w:p>
+        </w:tc>
+        <w:tc>
+          <w:tcPr>
+            <w:tcW w:w="0" w:type="auto"/>
+            <w:vAlign w:val="center"/>
+          </w:tcPr>
+          <w:p>
+            <w:pPr>
+              <w:rPr>
+                <w:rFonts w:hint="eastAsia"/>
+              </w:rPr>
+            </w:pPr>
+            <w:r>
+              <w:rPr>
+                <w:rFonts w:hint="eastAsia"/>
+              </w:rPr>
+              <w:t>0.61</w:t>
+            </w:r>
+          </w:p>
+        </w:tc>
+        <w:tc>
+          <w:tcPr>
+            <w:tcW w:w="0" w:type="auto"/>
+            <w:vAlign w:val="center"/>
+          </w:tcPr>
+          <w:p>
+            <w:pPr>
+              <w:rPr>
+                <w:rFonts w:hint="eastAsia"/>
+              </w:rPr>
+            </w:pPr>
+            <w:r>
+              <w:rPr>
+                <w:rFonts w:hint="eastAsia"/>
+              </w:rPr>
+              <w:t>0.28</w:t>
+            </w:r>
+          </w:p>
+        </w:tc>
+        <w:tc>
+          <w:tcPr>
+            <w:tcW w:w="0" w:type="auto"/>
+            <w:vAlign w:val="center"/>
+          </w:tcPr>
+          <w:p>
+            <w:pPr>
+              <w:rPr>
+                <w:rFonts w:hint="eastAsia"/>
+              </w:rPr>
+            </w:pPr>
+            <w:r>
+              <w:rPr>
+                <w:rFonts w:hint="eastAsia"/>
+              </w:rPr>
+              <w:t>0.11</w:t>
+            </w:r>
           </w:p>
         </w:tc>
       </w:tr>
@@ -4636,143 +4566,127 @@
           <w:tcPr>
             <w:tcW w:w="0" w:type="auto"/>
             <w:vAlign w:val="center"/>
-            <w:hideMark/>
-          </w:tcPr>
-          <w:p>
-            <w:pPr>
-              <w:rPr>
-                <w:rFonts w:hint="eastAsia"/>
-              </w:rPr>
-            </w:pPr>
-            <w:r>
-              <w:t>P</w:t>
-            </w:r>
-            <w:r>
-              <w:rPr>
-                <w:rFonts w:hint="eastAsia"/>
-              </w:rPr>
-              <w:t>4</w:t>
-            </w:r>
-          </w:p>
-        </w:tc>
-        <w:tc>
-          <w:tcPr>
-            <w:tcW w:w="0" w:type="auto"/>
-            <w:vAlign w:val="center"/>
-            <w:hideMark/>
-          </w:tcPr>
-          <w:p>
-            <w:pPr>
-              <w:rPr>
-                <w:rFonts w:hint="eastAsia"/>
-              </w:rPr>
-            </w:pPr>
-            <w:proofErr w:type="spellStart"/>
-            <w:r>
-              <w:t>PubMedBERT</w:t>
-            </w:r>
-            <w:proofErr w:type="spellEnd"/>
-          </w:p>
-        </w:tc>
-        <w:tc>
-          <w:tcPr>
-            <w:tcW w:w="0" w:type="auto"/>
-            <w:vAlign w:val="center"/>
-            <w:hideMark/>
-          </w:tcPr>
-          <w:p>
-            <w:pPr>
-              <w:rPr>
-                <w:rFonts w:hint="eastAsia"/>
-              </w:rPr>
-            </w:pPr>
-            <w:r>
-              <w:t>MLP</w:t>
-            </w:r>
-          </w:p>
-        </w:tc>
-        <w:tc>
-          <w:tcPr>
-            <w:tcW w:w="0" w:type="auto"/>
-            <w:vAlign w:val="center"/>
-            <w:hideMark/>
-          </w:tcPr>
-          <w:p>
-            <w:pPr>
-              <w:rPr>
-                <w:rFonts w:hint="eastAsia"/>
-              </w:rPr>
-            </w:pPr>
-            <w:r>
-              <w:t>—</w:t>
-            </w:r>
-          </w:p>
-        </w:tc>
-        <w:tc>
-          <w:tcPr>
-            <w:tcW w:w="0" w:type="auto"/>
-            <w:vAlign w:val="center"/>
-            <w:hideMark/>
-          </w:tcPr>
-          <w:p>
-            <w:pPr>
-              <w:rPr>
-                <w:rFonts w:hint="eastAsia"/>
-              </w:rPr>
-            </w:pPr>
-            <w:r>
-              <w:t>—</w:t>
-            </w:r>
-          </w:p>
-        </w:tc>
-        <w:tc>
-          <w:tcPr>
-            <w:tcW w:w="0" w:type="auto"/>
-            <w:vAlign w:val="center"/>
-            <w:hideMark/>
-          </w:tcPr>
-          <w:p>
-            <w:pPr>
-              <w:rPr>
-                <w:rFonts w:hint="eastAsia"/>
-              </w:rPr>
-            </w:pPr>
-            <w:r>
-              <w:t>—</w:t>
-            </w:r>
-          </w:p>
-        </w:tc>
-        <w:tc>
-          <w:tcPr>
-            <w:tcW w:w="0" w:type="auto"/>
-            <w:vAlign w:val="center"/>
-            <w:hideMark/>
-          </w:tcPr>
-          <w:p>
-            <w:pPr>
-              <w:rPr>
-                <w:rFonts w:hint="eastAsia"/>
-              </w:rPr>
-            </w:pPr>
-            <w:r>
-              <w:t>—</w:t>
-            </w:r>
-          </w:p>
-        </w:tc>
-        <w:tc>
-          <w:tcPr>
-            <w:tcW w:w="0" w:type="auto"/>
-            <w:vAlign w:val="center"/>
-            <w:hideMark/>
-          </w:tcPr>
-          <w:p>
-            <w:pPr>
-              <w:rPr>
-                <w:rFonts w:hint="eastAsia"/>
-              </w:rPr>
-            </w:pPr>
-            <w:r>
-              <w:t>—</w:t>
+          </w:tcPr>
+          <w:p>
+            <w:pPr>
+              <w:rPr>
+                <w:rFonts w:hint="eastAsia"/>
+              </w:rPr>
+            </w:pPr>
+          </w:p>
+        </w:tc>
+        <w:tc>
+          <w:tcPr>
+            <w:tcW w:w="0" w:type="auto"/>
+            <w:gridSpan w:val="2"/>
+            <w:vAlign w:val="center"/>
+          </w:tcPr>
+          <w:p>
+            <w:pPr>
+              <w:rPr>
+                <w:rFonts w:hint="eastAsia"/>
+              </w:rPr>
+            </w:pPr>
+            <w:r>
+              <w:rPr>
+                <w:rFonts w:hint="eastAsia"/>
+              </w:rPr>
+              <w:t>PCA dim46 Epoch77</w:t>
+            </w:r>
+          </w:p>
+        </w:tc>
+        <w:tc>
+          <w:tcPr>
+            <w:tcW w:w="0" w:type="auto"/>
+            <w:vAlign w:val="center"/>
+          </w:tcPr>
+          <w:p>
+            <w:pPr>
+              <w:rPr>
+                <w:rFonts w:hint="eastAsia"/>
+              </w:rPr>
+            </w:pPr>
+            <w:r>
+              <w:rPr>
+                <w:rFonts w:hint="eastAsia"/>
+              </w:rPr>
+              <w:t>0.40</w:t>
+            </w:r>
+          </w:p>
+        </w:tc>
+        <w:tc>
+          <w:tcPr>
+            <w:tcW w:w="0" w:type="auto"/>
+            <w:vAlign w:val="center"/>
+          </w:tcPr>
+          <w:p>
+            <w:pPr>
+              <w:rPr>
+                <w:rFonts w:hint="eastAsia"/>
+              </w:rPr>
+            </w:pPr>
+            <w:r>
+              <w:rPr>
+                <w:rFonts w:hint="eastAsia"/>
+              </w:rPr>
+              <w:t>0.36</w:t>
+            </w:r>
+          </w:p>
+        </w:tc>
+        <w:tc>
+          <w:tcPr>
+            <w:tcW w:w="0" w:type="auto"/>
+            <w:vAlign w:val="center"/>
+          </w:tcPr>
+          <w:p>
+            <w:pPr>
+              <w:rPr>
+                <w:rFonts w:hint="eastAsia"/>
+              </w:rPr>
+            </w:pPr>
+            <w:r>
+              <w:rPr>
+                <w:rFonts w:hint="eastAsia"/>
+              </w:rPr>
+              <w:t>0.47</w:t>
+            </w:r>
+          </w:p>
+        </w:tc>
+        <w:tc>
+          <w:tcPr>
+            <w:tcW w:w="0" w:type="auto"/>
+            <w:vAlign w:val="center"/>
+          </w:tcPr>
+          <w:p>
+            <w:pPr>
+              <w:rPr>
+                <w:rFonts w:hint="eastAsia"/>
+              </w:rPr>
+            </w:pPr>
+            <w:r>
+              <w:rPr>
+                <w:rFonts w:hint="eastAsia"/>
+              </w:rPr>
+              <w:t>0.39</w:t>
+            </w:r>
+          </w:p>
+        </w:tc>
+        <w:tc>
+          <w:tcPr>
+            <w:tcW w:w="0" w:type="auto"/>
+            <w:vAlign w:val="center"/>
+          </w:tcPr>
+          <w:p>
+            <w:pPr>
+              <w:rPr>
+                <w:rFonts w:hint="eastAsia"/>
+              </w:rPr>
+            </w:pPr>
+            <w:r>
+              <w:rPr>
+                <w:rFonts w:hint="eastAsia"/>
+              </w:rPr>
+              <w:t>0.21</w:t>
             </w:r>
           </w:p>
         </w:tc>
@@ -4785,46 +4699,47 @@
           <w:tcPr>
             <w:tcW w:w="0" w:type="auto"/>
             <w:vAlign w:val="center"/>
-          </w:tcPr>
-          <w:p>
-            <w:pPr>
-              <w:rPr>
-                <w:rFonts w:hint="eastAsia"/>
-              </w:rPr>
-            </w:pPr>
-            <w:r>
-              <w:rPr>
-                <w:rFonts w:hint="eastAsia"/>
-              </w:rPr>
-              <w:t>P5</w:t>
-            </w:r>
-          </w:p>
-        </w:tc>
-        <w:tc>
-          <w:tcPr>
-            <w:tcW w:w="0" w:type="auto"/>
-            <w:vAlign w:val="center"/>
-          </w:tcPr>
-          <w:p>
-            <w:pPr>
-              <w:rPr>
-                <w:rFonts w:hint="eastAsia"/>
-              </w:rPr>
-            </w:pPr>
-            <w:proofErr w:type="spellStart"/>
-            <w:r>
-              <w:rPr>
-                <w:rFonts w:hint="eastAsia"/>
-              </w:rPr>
-              <w:t>PubMedBERT</w:t>
-            </w:r>
-            <w:proofErr w:type="spellEnd"/>
-          </w:p>
-        </w:tc>
-        <w:tc>
-          <w:tcPr>
-            <w:tcW w:w="0" w:type="auto"/>
-            <w:vAlign w:val="center"/>
+            <w:hideMark/>
+          </w:tcPr>
+          <w:p>
+            <w:pPr>
+              <w:rPr>
+                <w:rFonts w:hint="eastAsia"/>
+              </w:rPr>
+            </w:pPr>
+            <w:r>
+              <w:t>P</w:t>
+            </w:r>
+            <w:r>
+              <w:rPr>
+                <w:rFonts w:hint="eastAsia"/>
+              </w:rPr>
+              <w:t>4</w:t>
+            </w:r>
+          </w:p>
+        </w:tc>
+        <w:tc>
+          <w:tcPr>
+            <w:tcW w:w="0" w:type="auto"/>
+            <w:vAlign w:val="center"/>
+            <w:hideMark/>
+          </w:tcPr>
+          <w:p>
+            <w:pPr>
+              <w:rPr>
+                <w:rFonts w:hint="eastAsia"/>
+              </w:rPr>
+            </w:pPr>
+            <w:r>
+              <w:t>BioWordVec</w:t>
+            </w:r>
+          </w:p>
+        </w:tc>
+        <w:tc>
+          <w:tcPr>
+            <w:tcW w:w="0" w:type="auto"/>
+            <w:vAlign w:val="center"/>
+            <w:hideMark/>
           </w:tcPr>
           <w:p>
             <w:pPr>
@@ -4843,52 +4758,100 @@
         <w:tc>
           <w:tcPr>
             <w:tcW w:w="0" w:type="auto"/>
-            <w:gridSpan w:val="5"/>
-            <w:vAlign w:val="center"/>
-          </w:tcPr>
-          <w:p>
-            <w:pPr>
-              <w:rPr>
-                <w:rFonts w:hint="eastAsia"/>
-              </w:rPr>
-            </w:pPr>
-            <w:r>
-              <w:rPr>
-                <w:rFonts w:hint="eastAsia"/>
-              </w:rPr>
-              <w:t>Not included</w:t>
-            </w:r>
-            <w:r>
-              <w:rPr>
-                <w:rFonts w:hint="eastAsia"/>
-              </w:rPr>
-              <w:t>.</w:t>
-            </w:r>
-            <w:r>
-              <w:rPr>
-                <w:rFonts w:hint="eastAsia"/>
-              </w:rPr>
-              <w:t xml:space="preserve"> </w:t>
-            </w:r>
-            <w:proofErr w:type="gramStart"/>
-            <w:r>
-              <w:rPr>
-                <w:rFonts w:hint="eastAsia"/>
-              </w:rPr>
-              <w:t>Need</w:t>
-            </w:r>
-            <w:proofErr w:type="gramEnd"/>
-            <w:r>
-              <w:rPr>
-                <w:rFonts w:hint="eastAsia"/>
-              </w:rPr>
-              <w:t xml:space="preserve"> explanation</w:t>
-            </w:r>
-            <w:r>
-              <w:rPr>
-                <w:rFonts w:hint="eastAsia"/>
-              </w:rPr>
-              <w:t>.</w:t>
+            <w:vAlign w:val="center"/>
+            <w:hideMark/>
+          </w:tcPr>
+          <w:p>
+            <w:pPr>
+              <w:rPr>
+                <w:rFonts w:hint="eastAsia"/>
+              </w:rPr>
+            </w:pPr>
+            <w:r>
+              <w:rPr>
+                <w:rFonts w:hint="eastAsia"/>
+              </w:rPr>
+              <w:t>0.45</w:t>
+            </w:r>
+          </w:p>
+        </w:tc>
+        <w:tc>
+          <w:tcPr>
+            <w:tcW w:w="0" w:type="auto"/>
+            <w:vAlign w:val="center"/>
+            <w:hideMark/>
+          </w:tcPr>
+          <w:p>
+            <w:pPr>
+              <w:rPr>
+                <w:rFonts w:hint="eastAsia"/>
+              </w:rPr>
+            </w:pPr>
+            <w:r>
+              <w:rPr>
+                <w:rFonts w:hint="eastAsia"/>
+              </w:rPr>
+              <w:t>0.39</w:t>
+            </w:r>
+          </w:p>
+        </w:tc>
+        <w:tc>
+          <w:tcPr>
+            <w:tcW w:w="0" w:type="auto"/>
+            <w:vAlign w:val="center"/>
+            <w:hideMark/>
+          </w:tcPr>
+          <w:p>
+            <w:pPr>
+              <w:rPr>
+                <w:rFonts w:hint="eastAsia"/>
+              </w:rPr>
+            </w:pPr>
+            <w:r>
+              <w:rPr>
+                <w:rFonts w:hint="eastAsia"/>
+              </w:rPr>
+              <w:t>0.55</w:t>
+            </w:r>
+          </w:p>
+        </w:tc>
+        <w:tc>
+          <w:tcPr>
+            <w:tcW w:w="0" w:type="auto"/>
+            <w:vAlign w:val="center"/>
+            <w:hideMark/>
+          </w:tcPr>
+          <w:p>
+            <w:pPr>
+              <w:rPr>
+                <w:rFonts w:hint="eastAsia"/>
+              </w:rPr>
+            </w:pPr>
+            <w:r>
+              <w:rPr>
+                <w:rFonts w:hint="eastAsia"/>
+              </w:rPr>
+              <w:t>0.43</w:t>
+            </w:r>
+          </w:p>
+        </w:tc>
+        <w:tc>
+          <w:tcPr>
+            <w:tcW w:w="0" w:type="auto"/>
+            <w:vAlign w:val="center"/>
+            <w:hideMark/>
+          </w:tcPr>
+          <w:p>
+            <w:pPr>
+              <w:rPr>
+                <w:rFonts w:hint="eastAsia"/>
+              </w:rPr>
+            </w:pPr>
+            <w:r>
+              <w:rPr>
+                <w:rFonts w:hint="eastAsia"/>
+              </w:rPr>
+              <w:t>0.19</w:t>
             </w:r>
           </w:p>
         </w:tc>
@@ -4909,127 +4872,128 @@
                 <w:rFonts w:hint="eastAsia"/>
               </w:rPr>
             </w:pPr>
-            <w:proofErr w:type="spellStart"/>
-            <w:r>
-              <w:t>BioGPT</w:t>
-            </w:r>
-            <w:proofErr w:type="spellEnd"/>
-            <w:r>
-              <w:t xml:space="preserve"> (zero-shot)</w:t>
-            </w:r>
-          </w:p>
-        </w:tc>
-        <w:tc>
-          <w:tcPr>
-            <w:tcW w:w="0" w:type="auto"/>
-            <w:vAlign w:val="center"/>
-            <w:hideMark/>
-          </w:tcPr>
-          <w:p>
-            <w:pPr>
-              <w:rPr>
-                <w:rFonts w:hint="eastAsia"/>
-              </w:rPr>
-            </w:pPr>
-            <w:r>
-              <w:t>—</w:t>
-            </w:r>
-          </w:p>
-        </w:tc>
-        <w:tc>
-          <w:tcPr>
-            <w:tcW w:w="0" w:type="auto"/>
-            <w:vAlign w:val="center"/>
-            <w:hideMark/>
-          </w:tcPr>
-          <w:p>
-            <w:pPr>
-              <w:rPr>
-                <w:rFonts w:hint="eastAsia"/>
-              </w:rPr>
-            </w:pPr>
-            <w:r>
-              <w:t>Logit scoring</w:t>
-            </w:r>
-          </w:p>
-        </w:tc>
-        <w:tc>
-          <w:tcPr>
-            <w:tcW w:w="0" w:type="auto"/>
-            <w:vAlign w:val="center"/>
-            <w:hideMark/>
-          </w:tcPr>
-          <w:p>
-            <w:pPr>
-              <w:rPr>
-                <w:rFonts w:hint="eastAsia"/>
-              </w:rPr>
-            </w:pPr>
-            <w:r>
-              <w:rPr>
-                <w:rFonts w:hint="eastAsia"/>
-              </w:rPr>
-              <w:t>0.36</w:t>
-            </w:r>
-          </w:p>
-        </w:tc>
-        <w:tc>
-          <w:tcPr>
-            <w:tcW w:w="0" w:type="auto"/>
-            <w:vAlign w:val="center"/>
-            <w:hideMark/>
-          </w:tcPr>
-          <w:p>
-            <w:pPr>
-              <w:rPr>
-                <w:rFonts w:hint="eastAsia"/>
-              </w:rPr>
-            </w:pPr>
-            <w:r>
-              <w:rPr>
-                <w:rFonts w:hint="eastAsia"/>
-              </w:rPr>
-              <w:t>0.21</w:t>
-            </w:r>
-          </w:p>
-        </w:tc>
-        <w:tc>
-          <w:tcPr>
-            <w:tcW w:w="0" w:type="auto"/>
-            <w:vAlign w:val="center"/>
-            <w:hideMark/>
-          </w:tcPr>
-          <w:p>
-            <w:pPr>
-              <w:rPr>
-                <w:rFonts w:hint="eastAsia"/>
-              </w:rPr>
-            </w:pPr>
-            <w:r>
-              <w:rPr>
-                <w:rFonts w:hint="eastAsia"/>
-              </w:rPr>
-              <w:t>0.12</w:t>
-            </w:r>
-          </w:p>
-        </w:tc>
-        <w:tc>
-          <w:tcPr>
-            <w:tcW w:w="0" w:type="auto"/>
-            <w:vAlign w:val="center"/>
-            <w:hideMark/>
-          </w:tcPr>
-          <w:p>
-            <w:pPr>
-              <w:rPr>
-                <w:rFonts w:hint="eastAsia"/>
-              </w:rPr>
-            </w:pPr>
-            <w:r>
-              <w:rPr>
-                <w:rFonts w:hint="eastAsia"/>
-              </w:rPr>
-              <w:t>0.51</w:t>
+            <w:r>
+              <w:t>P</w:t>
+            </w:r>
+            <w:r>
+              <w:rPr>
+                <w:rFonts w:hint="eastAsia"/>
+              </w:rPr>
+              <w:t>5</w:t>
+            </w:r>
+          </w:p>
+        </w:tc>
+        <w:tc>
+          <w:tcPr>
+            <w:tcW w:w="0" w:type="auto"/>
+            <w:vAlign w:val="center"/>
+            <w:hideMark/>
+          </w:tcPr>
+          <w:p>
+            <w:pPr>
+              <w:rPr>
+                <w:rFonts w:hint="eastAsia"/>
+              </w:rPr>
+            </w:pPr>
+            <w:r>
+              <w:t>PubMedBERT</w:t>
+            </w:r>
+          </w:p>
+        </w:tc>
+        <w:tc>
+          <w:tcPr>
+            <w:tcW w:w="0" w:type="auto"/>
+            <w:vAlign w:val="center"/>
+            <w:hideMark/>
+          </w:tcPr>
+          <w:p>
+            <w:pPr>
+              <w:rPr>
+                <w:rFonts w:hint="eastAsia"/>
+              </w:rPr>
+            </w:pPr>
+            <w:r>
+              <w:t>MLP</w:t>
+            </w:r>
+          </w:p>
+        </w:tc>
+        <w:tc>
+          <w:tcPr>
+            <w:tcW w:w="0" w:type="auto"/>
+            <w:vAlign w:val="center"/>
+            <w:hideMark/>
+          </w:tcPr>
+          <w:p>
+            <w:pPr>
+              <w:rPr>
+                <w:rFonts w:hint="eastAsia"/>
+              </w:rPr>
+            </w:pPr>
+            <w:r>
+              <w:rPr>
+                <w:rFonts w:hint="eastAsia"/>
+              </w:rPr>
+              <w:t>0.57</w:t>
+            </w:r>
+          </w:p>
+        </w:tc>
+        <w:tc>
+          <w:tcPr>
+            <w:tcW w:w="0" w:type="auto"/>
+            <w:vAlign w:val="center"/>
+            <w:hideMark/>
+          </w:tcPr>
+          <w:p>
+            <w:pPr>
+              <w:rPr>
+                <w:rFonts w:hint="eastAsia"/>
+              </w:rPr>
+            </w:pPr>
+            <w:r>
+              <w:rPr>
+                <w:rFonts w:hint="eastAsia"/>
+              </w:rPr>
+              <w:t>0.31</w:t>
+            </w:r>
+          </w:p>
+        </w:tc>
+        <w:tc>
+          <w:tcPr>
+            <w:tcW w:w="0" w:type="auto"/>
+            <w:vAlign w:val="center"/>
+            <w:hideMark/>
+          </w:tcPr>
+          <w:p>
+            <w:pPr>
+              <w:rPr>
+                <w:rFonts w:hint="eastAsia"/>
+              </w:rPr>
+            </w:pPr>
+            <w:r>
+              <w:rPr>
+                <w:rFonts w:hint="eastAsia"/>
+              </w:rPr>
+              <w:t>0.71</w:t>
+            </w:r>
+          </w:p>
+        </w:tc>
+        <w:tc>
+          <w:tcPr>
+            <w:tcW w:w="0" w:type="auto"/>
+            <w:vAlign w:val="center"/>
+            <w:hideMark/>
+          </w:tcPr>
+          <w:p>
+            <w:pPr>
+              <w:rPr>
+                <w:rFonts w:hint="eastAsia"/>
+              </w:rPr>
+            </w:pPr>
+            <w:r>
+              <w:rPr>
+                <w:rFonts w:hint="eastAsia"/>
+              </w:rPr>
+              <w:t>0.20</w:t>
             </w:r>
           </w:p>
         </w:tc>
@@ -5062,124 +5026,150 @@
           <w:tcPr>
             <w:tcW w:w="0" w:type="auto"/>
             <w:vAlign w:val="center"/>
-          </w:tcPr>
-          <w:p/>
-        </w:tc>
-        <w:tc>
-          <w:tcPr>
-            <w:tcW w:w="0" w:type="auto"/>
-            <w:gridSpan w:val="2"/>
-            <w:vAlign w:val="center"/>
-          </w:tcPr>
-          <w:p>
-            <w:pPr>
-              <w:rPr>
-                <w:rFonts w:hint="eastAsia"/>
-              </w:rPr>
-            </w:pPr>
-            <w:r>
-              <w:rPr>
-                <w:rFonts w:hint="eastAsia"/>
-              </w:rPr>
-              <w:t>I</w:t>
-            </w:r>
-            <w:r>
-              <w:t>mproved</w:t>
-            </w:r>
-          </w:p>
-        </w:tc>
-        <w:tc>
-          <w:tcPr>
-            <w:tcW w:w="0" w:type="auto"/>
-            <w:vAlign w:val="center"/>
-          </w:tcPr>
-          <w:p>
-            <w:pPr>
-              <w:rPr>
-                <w:rFonts w:hint="eastAsia"/>
-              </w:rPr>
-            </w:pPr>
-            <w:r>
-              <w:rPr>
-                <w:rFonts w:hint="eastAsia"/>
-              </w:rPr>
-              <w:t>0.35</w:t>
-            </w:r>
-          </w:p>
-        </w:tc>
-        <w:tc>
-          <w:tcPr>
-            <w:tcW w:w="0" w:type="auto"/>
-            <w:vAlign w:val="center"/>
-          </w:tcPr>
-          <w:p>
-            <w:pPr>
-              <w:rPr>
-                <w:rFonts w:hint="eastAsia"/>
-              </w:rPr>
-            </w:pPr>
-            <w:r>
-              <w:rPr>
-                <w:rFonts w:hint="eastAsia"/>
-              </w:rPr>
-              <w:t>0.32</w:t>
-            </w:r>
-          </w:p>
-        </w:tc>
-        <w:tc>
-          <w:tcPr>
-            <w:tcW w:w="0" w:type="auto"/>
-            <w:vAlign w:val="center"/>
-          </w:tcPr>
-          <w:p>
-            <w:pPr>
-              <w:rPr>
-                <w:rFonts w:hint="eastAsia"/>
-              </w:rPr>
-            </w:pPr>
-            <w:r>
-              <w:rPr>
-                <w:rFonts w:hint="eastAsia"/>
-              </w:rPr>
-              <w:t>0.31</w:t>
-            </w:r>
-          </w:p>
-        </w:tc>
-        <w:tc>
-          <w:tcPr>
-            <w:tcW w:w="0" w:type="auto"/>
-            <w:vAlign w:val="center"/>
-          </w:tcPr>
-          <w:p>
-            <w:pPr>
-              <w:rPr>
-                <w:rFonts w:hint="eastAsia"/>
-              </w:rPr>
-            </w:pPr>
-            <w:r>
-              <w:rPr>
-                <w:rFonts w:hint="eastAsia"/>
-              </w:rPr>
-              <w:t>0.49</w:t>
-            </w:r>
-          </w:p>
-        </w:tc>
-        <w:tc>
-          <w:tcPr>
-            <w:tcW w:w="0" w:type="auto"/>
-            <w:vAlign w:val="center"/>
-          </w:tcPr>
-          <w:p>
-            <w:pPr>
-              <w:rPr>
-                <w:rFonts w:hint="eastAsia"/>
-              </w:rPr>
-            </w:pPr>
-            <w:r>
-              <w:rPr>
-                <w:rFonts w:hint="eastAsia"/>
-              </w:rPr>
-              <w:t>0.15</w:t>
+            <w:hideMark/>
+          </w:tcPr>
+          <w:p>
+            <w:pPr>
+              <w:rPr>
+                <w:rFonts w:hint="eastAsia"/>
+              </w:rPr>
+            </w:pPr>
+          </w:p>
+        </w:tc>
+        <w:tc>
+          <w:tcPr>
+            <w:tcW w:w="0" w:type="auto"/>
+            <w:vAlign w:val="center"/>
+            <w:hideMark/>
+          </w:tcPr>
+          <w:p>
+            <w:pPr>
+              <w:rPr>
+                <w:rFonts w:hint="eastAsia"/>
+              </w:rPr>
+            </w:pPr>
+            <w:proofErr w:type="spellStart"/>
+            <w:r>
+              <w:t>PubMedBERT</w:t>
+            </w:r>
+            <w:r>
+              <w:rPr>
+                <w:rFonts w:hint="eastAsia"/>
+              </w:rPr>
+              <w:t>+Mesh</w:t>
+            </w:r>
+            <w:proofErr w:type="spellEnd"/>
+          </w:p>
+        </w:tc>
+        <w:tc>
+          <w:tcPr>
+            <w:tcW w:w="0" w:type="auto"/>
+            <w:vAlign w:val="center"/>
+            <w:hideMark/>
+          </w:tcPr>
+          <w:p>
+            <w:pPr>
+              <w:rPr>
+                <w:rFonts w:hint="eastAsia"/>
+              </w:rPr>
+            </w:pPr>
+            <w:r>
+              <w:t>MLP</w:t>
+            </w:r>
+          </w:p>
+        </w:tc>
+        <w:tc>
+          <w:tcPr>
+            <w:tcW w:w="0" w:type="auto"/>
+            <w:vAlign w:val="center"/>
+          </w:tcPr>
+          <w:p>
+            <w:pPr>
+              <w:rPr>
+                <w:rFonts w:hint="eastAsia"/>
+              </w:rPr>
+            </w:pPr>
+            <w:r>
+              <w:rPr>
+                <w:rFonts w:hint="eastAsia"/>
+              </w:rPr>
+              <w:t>0.55</w:t>
+            </w:r>
+          </w:p>
+        </w:tc>
+        <w:tc>
+          <w:tcPr>
+            <w:tcW w:w="0" w:type="auto"/>
+            <w:vAlign w:val="center"/>
+          </w:tcPr>
+          <w:p>
+            <w:pPr>
+              <w:rPr>
+                <w:rFonts w:hint="eastAsia"/>
+              </w:rPr>
+            </w:pPr>
+            <w:r>
+              <w:rPr>
+                <w:rFonts w:hint="eastAsia"/>
+              </w:rPr>
+              <w:t>0.24</w:t>
+            </w:r>
+          </w:p>
+        </w:tc>
+        <w:tc>
+          <w:tcPr>
+            <w:tcW w:w="0" w:type="auto"/>
+            <w:vAlign w:val="center"/>
+          </w:tcPr>
+          <w:p>
+            <w:pPr>
+              <w:rPr>
+                <w:rFonts w:hint="eastAsia"/>
+              </w:rPr>
+            </w:pPr>
+            <w:r>
+              <w:rPr>
+                <w:rFonts w:hint="eastAsia"/>
+              </w:rPr>
+              <w:t>0.71</w:t>
+            </w:r>
+          </w:p>
+        </w:tc>
+        <w:tc>
+          <w:tcPr>
+            <w:tcW w:w="0" w:type="auto"/>
+            <w:vAlign w:val="center"/>
+          </w:tcPr>
+          <w:p>
+            <w:pPr>
+              <w:rPr>
+                <w:rFonts w:hint="eastAsia"/>
+              </w:rPr>
+            </w:pPr>
+            <w:r>
+              <w:rPr>
+                <w:rFonts w:hint="eastAsia"/>
+              </w:rPr>
+              <w:t>0</w:t>
+            </w:r>
+          </w:p>
+        </w:tc>
+        <w:tc>
+          <w:tcPr>
+            <w:tcW w:w="0" w:type="auto"/>
+            <w:vAlign w:val="center"/>
+          </w:tcPr>
+          <w:p>
+            <w:pPr>
+              <w:rPr>
+                <w:rFonts w:hint="eastAsia"/>
+              </w:rPr>
+            </w:pPr>
+            <w:r>
+              <w:rPr>
+                <w:rFonts w:hint="eastAsia"/>
+              </w:rPr>
+              <w:t>0</w:t>
             </w:r>
           </w:p>
         </w:tc>
@@ -5193,7 +5183,13 @@
             <w:tcW w:w="0" w:type="auto"/>
             <w:vAlign w:val="center"/>
           </w:tcPr>
-          <w:p/>
+          <w:p>
+            <w:pPr>
+              <w:rPr>
+                <w:rFonts w:hint="eastAsia"/>
+              </w:rPr>
+            </w:pPr>
+          </w:p>
         </w:tc>
         <w:tc>
           <w:tcPr>
@@ -5202,112 +5198,77 @@
             <w:vAlign w:val="center"/>
           </w:tcPr>
           <w:p>
-            <w:pPr>
-              <w:rPr>
-                <w:rFonts w:hint="eastAsia"/>
-              </w:rPr>
-            </w:pPr>
-            <w:r>
-              <w:rPr>
-                <w:rFonts w:hint="eastAsia"/>
-              </w:rPr>
-              <w:t>Prompt V0</w:t>
-            </w:r>
-          </w:p>
-        </w:tc>
-        <w:tc>
-          <w:tcPr>
-            <w:tcW w:w="0" w:type="auto"/>
-            <w:vAlign w:val="center"/>
-          </w:tcPr>
-          <w:p>
-            <w:pPr>
-              <w:rPr>
-                <w:rFonts w:hint="eastAsia"/>
-              </w:rPr>
-            </w:pPr>
-            <w:r>
-              <w:rPr>
-                <w:rFonts w:hint="eastAsia"/>
-              </w:rPr>
-              <w:t>0.34</w:t>
-            </w:r>
-          </w:p>
-        </w:tc>
-        <w:tc>
-          <w:tcPr>
-            <w:tcW w:w="0" w:type="auto"/>
-            <w:vAlign w:val="center"/>
-          </w:tcPr>
-          <w:p>
-            <w:pPr>
-              <w:rPr>
-                <w:rFonts w:hint="eastAsia"/>
-              </w:rPr>
-            </w:pPr>
-            <w:r>
-              <w:rPr>
-                <w:rFonts w:hint="eastAsia"/>
-              </w:rPr>
-              <w:t>0.19</w:t>
-            </w:r>
-          </w:p>
-        </w:tc>
-        <w:tc>
-          <w:tcPr>
-            <w:tcW w:w="0" w:type="auto"/>
-            <w:vAlign w:val="center"/>
-          </w:tcPr>
-          <w:p>
-            <w:pPr>
-              <w:rPr>
-                <w:rFonts w:hint="eastAsia"/>
-              </w:rPr>
-            </w:pPr>
-            <w:r>
-              <w:rPr>
-                <w:rFonts w:hint="eastAsia"/>
-              </w:rPr>
-              <w:t>0.05</w:t>
-            </w:r>
-          </w:p>
-        </w:tc>
-        <w:tc>
-          <w:tcPr>
-            <w:tcW w:w="0" w:type="auto"/>
-            <w:vAlign w:val="center"/>
-          </w:tcPr>
-          <w:p>
-            <w:pPr>
-              <w:rPr>
-                <w:rFonts w:hint="eastAsia"/>
-              </w:rPr>
-            </w:pPr>
-            <w:r>
-              <w:rPr>
-                <w:rFonts w:hint="eastAsia"/>
-              </w:rPr>
-              <w:t>0.51</w:t>
-            </w:r>
-          </w:p>
-        </w:tc>
-        <w:tc>
-          <w:tcPr>
-            <w:tcW w:w="0" w:type="auto"/>
-            <w:vAlign w:val="center"/>
-          </w:tcPr>
-          <w:p>
-            <w:pPr>
-              <w:rPr>
-                <w:rFonts w:hint="eastAsia"/>
-              </w:rPr>
-            </w:pPr>
-            <w:r>
-              <w:rPr>
-                <w:rFonts w:hint="eastAsia"/>
-              </w:rPr>
-              <w:t>0</w:t>
-            </w:r>
+            <w:r>
+              <w:rPr>
+                <w:rFonts w:hint="eastAsia"/>
+              </w:rPr>
+              <w:t>Improved</w:t>
+            </w:r>
+          </w:p>
+        </w:tc>
+        <w:tc>
+          <w:tcPr>
+            <w:tcW w:w="0" w:type="auto"/>
+            <w:vAlign w:val="center"/>
+          </w:tcPr>
+          <w:p>
+            <w:pPr>
+              <w:rPr>
+                <w:rFonts w:hint="eastAsia"/>
+              </w:rPr>
+            </w:pPr>
+          </w:p>
+        </w:tc>
+        <w:tc>
+          <w:tcPr>
+            <w:tcW w:w="0" w:type="auto"/>
+            <w:vAlign w:val="center"/>
+          </w:tcPr>
+          <w:p>
+            <w:pPr>
+              <w:rPr>
+                <w:rFonts w:hint="eastAsia"/>
+              </w:rPr>
+            </w:pPr>
+          </w:p>
+        </w:tc>
+        <w:tc>
+          <w:tcPr>
+            <w:tcW w:w="0" w:type="auto"/>
+            <w:vAlign w:val="center"/>
+          </w:tcPr>
+          <w:p>
+            <w:pPr>
+              <w:rPr>
+                <w:rFonts w:hint="eastAsia"/>
+              </w:rPr>
+            </w:pPr>
+          </w:p>
+        </w:tc>
+        <w:tc>
+          <w:tcPr>
+            <w:tcW w:w="0" w:type="auto"/>
+            <w:vAlign w:val="center"/>
+          </w:tcPr>
+          <w:p>
+            <w:pPr>
+              <w:rPr>
+                <w:rFonts w:hint="eastAsia"/>
+              </w:rPr>
+            </w:pPr>
+          </w:p>
+        </w:tc>
+        <w:tc>
+          <w:tcPr>
+            <w:tcW w:w="0" w:type="auto"/>
+            <w:vAlign w:val="center"/>
+          </w:tcPr>
+          <w:p>
+            <w:pPr>
+              <w:rPr>
+                <w:rFonts w:hint="eastAsia"/>
+              </w:rPr>
+            </w:pPr>
           </w:p>
         </w:tc>
       </w:tr>
@@ -5320,120 +5281,113 @@
             <w:tcW w:w="0" w:type="auto"/>
             <w:vAlign w:val="center"/>
           </w:tcPr>
-          <w:p/>
-        </w:tc>
-        <w:tc>
-          <w:tcPr>
-            <w:tcW w:w="0" w:type="auto"/>
-            <w:gridSpan w:val="2"/>
-            <w:vAlign w:val="center"/>
-          </w:tcPr>
-          <w:p>
-            <w:pPr>
-              <w:rPr>
-                <w:rFonts w:hint="eastAsia"/>
-              </w:rPr>
-            </w:pPr>
-            <w:r>
-              <w:rPr>
-                <w:rFonts w:hint="eastAsia"/>
-              </w:rPr>
-              <w:t>V0 improved</w:t>
-            </w:r>
-          </w:p>
-        </w:tc>
-        <w:tc>
-          <w:tcPr>
-            <w:tcW w:w="0" w:type="auto"/>
-            <w:vAlign w:val="center"/>
-          </w:tcPr>
-          <w:p>
-            <w:pPr>
-              <w:rPr>
-                <w:rFonts w:hint="eastAsia"/>
-              </w:rPr>
-            </w:pPr>
-            <w:r>
-              <w:rPr>
-                <w:rFonts w:hint="eastAsia"/>
-              </w:rPr>
-              <w:t>0.34</w:t>
-            </w:r>
-          </w:p>
-        </w:tc>
-        <w:tc>
-          <w:tcPr>
-            <w:tcW w:w="0" w:type="auto"/>
-            <w:vAlign w:val="center"/>
-          </w:tcPr>
-          <w:p>
-            <w:pPr>
-              <w:rPr>
-                <w:rFonts w:hint="eastAsia"/>
-              </w:rPr>
-            </w:pPr>
-            <w:r>
-              <w:rPr>
-                <w:rFonts w:hint="eastAsia"/>
-              </w:rPr>
-              <w:t>0.28</w:t>
-            </w:r>
-          </w:p>
-        </w:tc>
-        <w:tc>
-          <w:tcPr>
-            <w:tcW w:w="0" w:type="auto"/>
-            <w:vAlign w:val="center"/>
-          </w:tcPr>
-          <w:p>
-            <w:pPr>
-              <w:rPr>
-                <w:rFonts w:hint="eastAsia"/>
-              </w:rPr>
-            </w:pPr>
-            <w:r>
-              <w:rPr>
-                <w:rFonts w:hint="eastAsia"/>
-              </w:rPr>
-              <w:t>0.15</w:t>
-            </w:r>
-          </w:p>
-        </w:tc>
-        <w:tc>
-          <w:tcPr>
-            <w:tcW w:w="0" w:type="auto"/>
-            <w:vAlign w:val="center"/>
-          </w:tcPr>
-          <w:p>
-            <w:pPr>
-              <w:rPr>
-                <w:rFonts w:hint="eastAsia"/>
-              </w:rPr>
-            </w:pPr>
-            <w:r>
-              <w:rPr>
-                <w:rFonts w:hint="eastAsia"/>
-              </w:rPr>
-              <w:t>0.50</w:t>
-            </w:r>
-          </w:p>
-        </w:tc>
-        <w:tc>
-          <w:tcPr>
-            <w:tcW w:w="0" w:type="auto"/>
-            <w:vAlign w:val="center"/>
-          </w:tcPr>
-          <w:p>
-            <w:pPr>
-              <w:rPr>
-                <w:rFonts w:hint="eastAsia"/>
-              </w:rPr>
-            </w:pPr>
-            <w:r>
-              <w:rPr>
-                <w:rFonts w:hint="eastAsia"/>
-              </w:rPr>
-              <w:t>0.17</w:t>
+          <w:p>
+            <w:pPr>
+              <w:rPr>
+                <w:rFonts w:hint="eastAsia"/>
+              </w:rPr>
+            </w:pPr>
+            <w:r>
+              <w:rPr>
+                <w:rFonts w:hint="eastAsia"/>
+              </w:rPr>
+              <w:t>P</w:t>
+            </w:r>
+            <w:r>
+              <w:rPr>
+                <w:rFonts w:hint="eastAsia"/>
+              </w:rPr>
+              <w:t>7</w:t>
+            </w:r>
+          </w:p>
+        </w:tc>
+        <w:tc>
+          <w:tcPr>
+            <w:tcW w:w="0" w:type="auto"/>
+            <w:vAlign w:val="center"/>
+          </w:tcPr>
+          <w:p>
+            <w:pPr>
+              <w:rPr>
+                <w:rFonts w:hint="eastAsia"/>
+              </w:rPr>
+            </w:pPr>
+            <w:r>
+              <w:rPr>
+                <w:rFonts w:hint="eastAsia"/>
+              </w:rPr>
+              <w:t>PubMedBERT</w:t>
+            </w:r>
+          </w:p>
+        </w:tc>
+        <w:tc>
+          <w:tcPr>
+            <w:tcW w:w="0" w:type="auto"/>
+            <w:vAlign w:val="center"/>
+          </w:tcPr>
+          <w:p>
+            <w:pPr>
+              <w:rPr>
+                <w:rFonts w:hint="eastAsia"/>
+              </w:rPr>
+            </w:pPr>
+            <w:r>
+              <w:rPr>
+                <w:rFonts w:hint="eastAsia"/>
+              </w:rPr>
+              <w:t>SVM</w:t>
+            </w:r>
+          </w:p>
+        </w:tc>
+        <w:tc>
+          <w:tcPr>
+            <w:tcW w:w="0" w:type="auto"/>
+            <w:gridSpan w:val="5"/>
+            <w:vAlign w:val="center"/>
+          </w:tcPr>
+          <w:p>
+            <w:pPr>
+              <w:rPr>
+                <w:rFonts w:hint="eastAsia"/>
+              </w:rPr>
+            </w:pPr>
+            <w:r>
+              <w:rPr>
+                <w:rFonts w:hint="eastAsia"/>
+              </w:rPr>
+              <w:t>Not included</w:t>
+            </w:r>
+            <w:r>
+              <w:rPr>
+                <w:rFonts w:hint="eastAsia"/>
+              </w:rPr>
+              <w:t>.</w:t>
+            </w:r>
+            <w:r>
+              <w:rPr>
+                <w:rFonts w:hint="eastAsia"/>
+              </w:rPr>
+              <w:t xml:space="preserve"> </w:t>
+            </w:r>
+            <w:proofErr w:type="gramStart"/>
+            <w:r>
+              <w:rPr>
+                <w:rFonts w:hint="eastAsia"/>
+              </w:rPr>
+              <w:t>Need</w:t>
+            </w:r>
+            <w:proofErr w:type="gramEnd"/>
+            <w:r>
+              <w:rPr>
+                <w:rFonts w:hint="eastAsia"/>
+              </w:rPr>
+              <w:t xml:space="preserve"> explanation</w:t>
+            </w:r>
+            <w:r>
+              <w:rPr>
+                <w:rFonts w:hint="eastAsia"/>
+              </w:rPr>
+              <w:t>.</w:t>
             </w:r>
           </w:p>
         </w:tc>
@@ -5446,52 +5400,78 @@
           <w:tcPr>
             <w:tcW w:w="0" w:type="auto"/>
             <w:vAlign w:val="center"/>
-          </w:tcPr>
-          <w:p/>
-        </w:tc>
-        <w:tc>
-          <w:tcPr>
-            <w:tcW w:w="0" w:type="auto"/>
-            <w:gridSpan w:val="2"/>
-            <w:vAlign w:val="center"/>
-          </w:tcPr>
-          <w:p>
-            <w:pPr>
-              <w:rPr>
-                <w:rFonts w:hint="eastAsia"/>
-              </w:rPr>
-            </w:pPr>
-            <w:r>
-              <w:rPr>
-                <w:rFonts w:hint="eastAsia"/>
-              </w:rPr>
-              <w:t>Prompt V1</w:t>
-            </w:r>
-          </w:p>
-        </w:tc>
-        <w:tc>
-          <w:tcPr>
-            <w:tcW w:w="0" w:type="auto"/>
-            <w:vAlign w:val="center"/>
-          </w:tcPr>
-          <w:p>
-            <w:pPr>
-              <w:rPr>
-                <w:rFonts w:hint="eastAsia"/>
-              </w:rPr>
-            </w:pPr>
-            <w:r>
-              <w:rPr>
-                <w:rFonts w:hint="eastAsia"/>
-              </w:rPr>
-              <w:t>0.37</w:t>
-            </w:r>
-          </w:p>
-        </w:tc>
-        <w:tc>
-          <w:tcPr>
-            <w:tcW w:w="0" w:type="auto"/>
-            <w:vAlign w:val="center"/>
+            <w:hideMark/>
+          </w:tcPr>
+          <w:p>
+            <w:pPr>
+              <w:rPr>
+                <w:rFonts w:hint="eastAsia"/>
+              </w:rPr>
+            </w:pPr>
+            <w:r>
+              <w:t>BioGPT (zero-shot)</w:t>
+            </w:r>
+          </w:p>
+        </w:tc>
+        <w:tc>
+          <w:tcPr>
+            <w:tcW w:w="0" w:type="auto"/>
+            <w:vAlign w:val="center"/>
+            <w:hideMark/>
+          </w:tcPr>
+          <w:p>
+            <w:pPr>
+              <w:rPr>
+                <w:rFonts w:hint="eastAsia"/>
+              </w:rPr>
+            </w:pPr>
+            <w:r>
+              <w:t>—</w:t>
+            </w:r>
+          </w:p>
+        </w:tc>
+        <w:tc>
+          <w:tcPr>
+            <w:tcW w:w="0" w:type="auto"/>
+            <w:vAlign w:val="center"/>
+            <w:hideMark/>
+          </w:tcPr>
+          <w:p>
+            <w:pPr>
+              <w:rPr>
+                <w:rFonts w:hint="eastAsia"/>
+              </w:rPr>
+            </w:pPr>
+            <w:r>
+              <w:t>Logit scoring</w:t>
+            </w:r>
+          </w:p>
+        </w:tc>
+        <w:tc>
+          <w:tcPr>
+            <w:tcW w:w="0" w:type="auto"/>
+            <w:vAlign w:val="center"/>
+            <w:hideMark/>
+          </w:tcPr>
+          <w:p>
+            <w:pPr>
+              <w:rPr>
+                <w:rFonts w:hint="eastAsia"/>
+              </w:rPr>
+            </w:pPr>
+            <w:r>
+              <w:rPr>
+                <w:rFonts w:hint="eastAsia"/>
+              </w:rPr>
+              <w:t>0.36</w:t>
+            </w:r>
+          </w:p>
+        </w:tc>
+        <w:tc>
+          <w:tcPr>
+            <w:tcW w:w="0" w:type="auto"/>
+            <w:vAlign w:val="center"/>
+            <w:hideMark/>
           </w:tcPr>
           <w:p>
             <w:pPr>
@@ -5511,25 +5491,27 @@
           <w:tcPr>
             <w:tcW w:w="0" w:type="auto"/>
             <w:vAlign w:val="center"/>
-          </w:tcPr>
-          <w:p>
-            <w:pPr>
-              <w:rPr>
-                <w:rFonts w:hint="eastAsia"/>
-              </w:rPr>
-            </w:pPr>
-            <w:r>
-              <w:rPr>
-                <w:rFonts w:hint="eastAsia"/>
-              </w:rPr>
-              <w:t>0.13</w:t>
-            </w:r>
-          </w:p>
-        </w:tc>
-        <w:tc>
-          <w:tcPr>
-            <w:tcW w:w="0" w:type="auto"/>
-            <w:vAlign w:val="center"/>
+            <w:hideMark/>
+          </w:tcPr>
+          <w:p>
+            <w:pPr>
+              <w:rPr>
+                <w:rFonts w:hint="eastAsia"/>
+              </w:rPr>
+            </w:pPr>
+            <w:r>
+              <w:rPr>
+                <w:rFonts w:hint="eastAsia"/>
+              </w:rPr>
+              <w:t>0.12</w:t>
+            </w:r>
+          </w:p>
+        </w:tc>
+        <w:tc>
+          <w:tcPr>
+            <w:tcW w:w="0" w:type="auto"/>
+            <w:vAlign w:val="center"/>
+            <w:hideMark/>
           </w:tcPr>
           <w:p>
             <w:pPr>
@@ -5549,6 +5531,7 @@
           <w:tcPr>
             <w:tcW w:w="0" w:type="auto"/>
             <w:vAlign w:val="center"/>
+            <w:hideMark/>
           </w:tcPr>
           <w:p>
             <w:pPr>
@@ -5574,7 +5557,13 @@
             <w:tcW w:w="0" w:type="auto"/>
             <w:vAlign w:val="center"/>
           </w:tcPr>
-          <w:p/>
+          <w:p>
+            <w:pPr>
+              <w:rPr>
+                <w:rFonts w:hint="eastAsia"/>
+              </w:rPr>
+            </w:pPr>
+          </w:p>
         </w:tc>
         <w:tc>
           <w:tcPr>
@@ -5592,26 +5581,48 @@
               <w:rPr>
                 <w:rFonts w:hint="eastAsia"/>
               </w:rPr>
-              <w:t>V1 improved</w:t>
-            </w:r>
-          </w:p>
-        </w:tc>
-        <w:tc>
-          <w:tcPr>
-            <w:tcW w:w="0" w:type="auto"/>
-            <w:vAlign w:val="center"/>
-          </w:tcPr>
-          <w:p>
-            <w:pPr>
-              <w:rPr>
-                <w:rFonts w:hint="eastAsia"/>
-              </w:rPr>
-            </w:pPr>
-            <w:r>
-              <w:rPr>
-                <w:rFonts w:hint="eastAsia"/>
-              </w:rPr>
-              <w:t>0.34</w:t>
+              <w:t>I</w:t>
+            </w:r>
+            <w:r>
+              <w:t>mproved</w:t>
+            </w:r>
+          </w:p>
+        </w:tc>
+        <w:tc>
+          <w:tcPr>
+            <w:tcW w:w="0" w:type="auto"/>
+            <w:vAlign w:val="center"/>
+          </w:tcPr>
+          <w:p>
+            <w:pPr>
+              <w:rPr>
+                <w:rFonts w:hint="eastAsia"/>
+              </w:rPr>
+            </w:pPr>
+            <w:r>
+              <w:rPr>
+                <w:rFonts w:hint="eastAsia"/>
+              </w:rPr>
+              <w:t>0.35</w:t>
+            </w:r>
+          </w:p>
+        </w:tc>
+        <w:tc>
+          <w:tcPr>
+            <w:tcW w:w="0" w:type="auto"/>
+            <w:vAlign w:val="center"/>
+          </w:tcPr>
+          <w:p>
+            <w:pPr>
+              <w:rPr>
+                <w:rFonts w:hint="eastAsia"/>
+              </w:rPr>
+            </w:pPr>
+            <w:r>
+              <w:rPr>
+                <w:rFonts w:hint="eastAsia"/>
+              </w:rPr>
+              <w:t>0.32</w:t>
             </w:r>
           </w:p>
         </w:tc>
@@ -5649,45 +5660,26 @@
               <w:rPr>
                 <w:rFonts w:hint="eastAsia"/>
               </w:rPr>
-              <w:t>0.30</w:t>
-            </w:r>
-          </w:p>
-        </w:tc>
-        <w:tc>
-          <w:tcPr>
-            <w:tcW w:w="0" w:type="auto"/>
-            <w:vAlign w:val="center"/>
-          </w:tcPr>
-          <w:p>
-            <w:pPr>
-              <w:rPr>
-                <w:rFonts w:hint="eastAsia"/>
-              </w:rPr>
-            </w:pPr>
-            <w:r>
-              <w:rPr>
-                <w:rFonts w:hint="eastAsia"/>
-              </w:rPr>
-              <w:t>0.46</w:t>
-            </w:r>
-          </w:p>
-        </w:tc>
-        <w:tc>
-          <w:tcPr>
-            <w:tcW w:w="0" w:type="auto"/>
-            <w:vAlign w:val="center"/>
-          </w:tcPr>
-          <w:p>
-            <w:pPr>
-              <w:rPr>
-                <w:rFonts w:hint="eastAsia"/>
-              </w:rPr>
-            </w:pPr>
-            <w:r>
-              <w:rPr>
-                <w:rFonts w:hint="eastAsia"/>
-              </w:rPr>
-              <w:t>0.17</w:t>
+              <w:t>0.49</w:t>
+            </w:r>
+          </w:p>
+        </w:tc>
+        <w:tc>
+          <w:tcPr>
+            <w:tcW w:w="0" w:type="auto"/>
+            <w:vAlign w:val="center"/>
+          </w:tcPr>
+          <w:p>
+            <w:pPr>
+              <w:rPr>
+                <w:rFonts w:hint="eastAsia"/>
+              </w:rPr>
+            </w:pPr>
+            <w:r>
+              <w:rPr>
+                <w:rFonts w:hint="eastAsia"/>
+              </w:rPr>
+              <w:t>0.15</w:t>
             </w:r>
           </w:p>
         </w:tc>
@@ -5701,7 +5693,13 @@
             <w:tcW w:w="0" w:type="auto"/>
             <w:vAlign w:val="center"/>
           </w:tcPr>
-          <w:p/>
+          <w:p>
+            <w:pPr>
+              <w:rPr>
+                <w:rFonts w:hint="eastAsia"/>
+              </w:rPr>
+            </w:pPr>
+          </w:p>
         </w:tc>
         <w:tc>
           <w:tcPr>
@@ -5719,83 +5717,83 @@
               <w:rPr>
                 <w:rFonts w:hint="eastAsia"/>
               </w:rPr>
-              <w:t>Prompt V2</w:t>
-            </w:r>
-          </w:p>
-        </w:tc>
-        <w:tc>
-          <w:tcPr>
-            <w:tcW w:w="0" w:type="auto"/>
-            <w:vAlign w:val="center"/>
-          </w:tcPr>
-          <w:p>
-            <w:pPr>
-              <w:rPr>
-                <w:rFonts w:hint="eastAsia"/>
-              </w:rPr>
-            </w:pPr>
-            <w:r>
-              <w:rPr>
-                <w:rFonts w:hint="eastAsia"/>
-              </w:rPr>
-              <w:t>0.40</w:t>
-            </w:r>
-          </w:p>
-        </w:tc>
-        <w:tc>
-          <w:tcPr>
-            <w:tcW w:w="0" w:type="auto"/>
-            <w:vAlign w:val="center"/>
-          </w:tcPr>
-          <w:p>
-            <w:pPr>
-              <w:rPr>
-                <w:rFonts w:hint="eastAsia"/>
-              </w:rPr>
-            </w:pPr>
-            <w:r>
-              <w:rPr>
-                <w:rFonts w:hint="eastAsia"/>
-              </w:rPr>
-              <w:t>0.26</w:t>
-            </w:r>
-          </w:p>
-        </w:tc>
-        <w:tc>
-          <w:tcPr>
-            <w:tcW w:w="0" w:type="auto"/>
-            <w:vAlign w:val="center"/>
-          </w:tcPr>
-          <w:p>
-            <w:pPr>
-              <w:rPr>
-                <w:rFonts w:hint="eastAsia"/>
-              </w:rPr>
-            </w:pPr>
-            <w:r>
-              <w:rPr>
-                <w:rFonts w:hint="eastAsia"/>
-              </w:rPr>
-              <w:t>0.25</w:t>
-            </w:r>
-          </w:p>
-        </w:tc>
-        <w:tc>
-          <w:tcPr>
-            <w:tcW w:w="0" w:type="auto"/>
-            <w:vAlign w:val="center"/>
-          </w:tcPr>
-          <w:p>
-            <w:pPr>
-              <w:rPr>
-                <w:rFonts w:hint="eastAsia"/>
-              </w:rPr>
-            </w:pPr>
-            <w:r>
-              <w:rPr>
-                <w:rFonts w:hint="eastAsia"/>
-              </w:rPr>
-              <w:t>0.52</w:t>
+              <w:t>Prompt V0</w:t>
+            </w:r>
+          </w:p>
+        </w:tc>
+        <w:tc>
+          <w:tcPr>
+            <w:tcW w:w="0" w:type="auto"/>
+            <w:vAlign w:val="center"/>
+          </w:tcPr>
+          <w:p>
+            <w:pPr>
+              <w:rPr>
+                <w:rFonts w:hint="eastAsia"/>
+              </w:rPr>
+            </w:pPr>
+            <w:r>
+              <w:rPr>
+                <w:rFonts w:hint="eastAsia"/>
+              </w:rPr>
+              <w:t>0.34</w:t>
+            </w:r>
+          </w:p>
+        </w:tc>
+        <w:tc>
+          <w:tcPr>
+            <w:tcW w:w="0" w:type="auto"/>
+            <w:vAlign w:val="center"/>
+          </w:tcPr>
+          <w:p>
+            <w:pPr>
+              <w:rPr>
+                <w:rFonts w:hint="eastAsia"/>
+              </w:rPr>
+            </w:pPr>
+            <w:r>
+              <w:rPr>
+                <w:rFonts w:hint="eastAsia"/>
+              </w:rPr>
+              <w:t>0.19</w:t>
+            </w:r>
+          </w:p>
+        </w:tc>
+        <w:tc>
+          <w:tcPr>
+            <w:tcW w:w="0" w:type="auto"/>
+            <w:vAlign w:val="center"/>
+          </w:tcPr>
+          <w:p>
+            <w:pPr>
+              <w:rPr>
+                <w:rFonts w:hint="eastAsia"/>
+              </w:rPr>
+            </w:pPr>
+            <w:r>
+              <w:rPr>
+                <w:rFonts w:hint="eastAsia"/>
+              </w:rPr>
+              <w:t>0.05</w:t>
+            </w:r>
+          </w:p>
+        </w:tc>
+        <w:tc>
+          <w:tcPr>
+            <w:tcW w:w="0" w:type="auto"/>
+            <w:vAlign w:val="center"/>
+          </w:tcPr>
+          <w:p>
+            <w:pPr>
+              <w:rPr>
+                <w:rFonts w:hint="eastAsia"/>
+              </w:rPr>
+            </w:pPr>
+            <w:r>
+              <w:rPr>
+                <w:rFonts w:hint="eastAsia"/>
+              </w:rPr>
+              <w:t>0.51</w:t>
             </w:r>
           </w:p>
         </w:tc>
@@ -5828,7 +5826,13 @@
             <w:tcW w:w="0" w:type="auto"/>
             <w:vAlign w:val="center"/>
           </w:tcPr>
-          <w:p/>
+          <w:p>
+            <w:pPr>
+              <w:rPr>
+                <w:rFonts w:hint="eastAsia"/>
+              </w:rPr>
+            </w:pPr>
+          </w:p>
         </w:tc>
         <w:tc>
           <w:tcPr>
@@ -5846,45 +5850,26 @@
               <w:rPr>
                 <w:rFonts w:hint="eastAsia"/>
               </w:rPr>
-              <w:t>V2 improved</w:t>
-            </w:r>
-          </w:p>
-        </w:tc>
-        <w:tc>
-          <w:tcPr>
-            <w:tcW w:w="0" w:type="auto"/>
-            <w:vAlign w:val="center"/>
-          </w:tcPr>
-          <w:p>
-            <w:pPr>
-              <w:rPr>
-                <w:rFonts w:hint="eastAsia"/>
-              </w:rPr>
-            </w:pPr>
-            <w:r>
-              <w:rPr>
-                <w:rFonts w:hint="eastAsia"/>
-              </w:rPr>
-              <w:t>0.39</w:t>
-            </w:r>
-          </w:p>
-        </w:tc>
-        <w:tc>
-          <w:tcPr>
-            <w:tcW w:w="0" w:type="auto"/>
-            <w:vAlign w:val="center"/>
-          </w:tcPr>
-          <w:p>
-            <w:pPr>
-              <w:rPr>
-                <w:rFonts w:hint="eastAsia"/>
-              </w:rPr>
-            </w:pPr>
-            <w:r>
-              <w:rPr>
-                <w:rFonts w:hint="eastAsia"/>
-              </w:rPr>
-              <w:t>0.32</w:t>
+              <w:t>V0 improved</w:t>
+            </w:r>
+          </w:p>
+        </w:tc>
+        <w:tc>
+          <w:tcPr>
+            <w:tcW w:w="0" w:type="auto"/>
+            <w:vAlign w:val="center"/>
+          </w:tcPr>
+          <w:p>
+            <w:pPr>
+              <w:rPr>
+                <w:rFonts w:hint="eastAsia"/>
+              </w:rPr>
+            </w:pPr>
+            <w:r>
+              <w:rPr>
+                <w:rFonts w:hint="eastAsia"/>
+              </w:rPr>
+              <w:t>0.34</w:t>
             </w:r>
           </w:p>
         </w:tc>
@@ -5922,26 +5907,45 @@
               <w:rPr>
                 <w:rFonts w:hint="eastAsia"/>
               </w:rPr>
-              <w:t>0.56</w:t>
-            </w:r>
-          </w:p>
-        </w:tc>
-        <w:tc>
-          <w:tcPr>
-            <w:tcW w:w="0" w:type="auto"/>
-            <w:vAlign w:val="center"/>
-          </w:tcPr>
-          <w:p>
-            <w:pPr>
-              <w:rPr>
-                <w:rFonts w:hint="eastAsia"/>
-              </w:rPr>
-            </w:pPr>
-            <w:r>
-              <w:rPr>
-                <w:rFonts w:hint="eastAsia"/>
-              </w:rPr>
-              <w:t>0.11</w:t>
+              <w:t>0.15</w:t>
+            </w:r>
+          </w:p>
+        </w:tc>
+        <w:tc>
+          <w:tcPr>
+            <w:tcW w:w="0" w:type="auto"/>
+            <w:vAlign w:val="center"/>
+          </w:tcPr>
+          <w:p>
+            <w:pPr>
+              <w:rPr>
+                <w:rFonts w:hint="eastAsia"/>
+              </w:rPr>
+            </w:pPr>
+            <w:r>
+              <w:rPr>
+                <w:rFonts w:hint="eastAsia"/>
+              </w:rPr>
+              <w:t>0.50</w:t>
+            </w:r>
+          </w:p>
+        </w:tc>
+        <w:tc>
+          <w:tcPr>
+            <w:tcW w:w="0" w:type="auto"/>
+            <w:vAlign w:val="center"/>
+          </w:tcPr>
+          <w:p>
+            <w:pPr>
+              <w:rPr>
+                <w:rFonts w:hint="eastAsia"/>
+              </w:rPr>
+            </w:pPr>
+            <w:r>
+              <w:rPr>
+                <w:rFonts w:hint="eastAsia"/>
+              </w:rPr>
+              <w:t>0.17</w:t>
             </w:r>
           </w:p>
         </w:tc>
@@ -5954,21 +5958,548 @@
           <w:tcPr>
             <w:tcW w:w="0" w:type="auto"/>
             <w:vAlign w:val="center"/>
-            <w:hideMark/>
-          </w:tcPr>
-          <w:p>
-            <w:pPr>
-              <w:rPr>
-                <w:rFonts w:hint="eastAsia"/>
-              </w:rPr>
-            </w:pPr>
-            <w:proofErr w:type="spellStart"/>
-            <w:r>
-              <w:t>BioGPT</w:t>
-            </w:r>
-            <w:proofErr w:type="spellEnd"/>
-            <w:r>
-              <w:t xml:space="preserve"> (</w:t>
+          </w:tcPr>
+          <w:p>
+            <w:pPr>
+              <w:rPr>
+                <w:rFonts w:hint="eastAsia"/>
+              </w:rPr>
+            </w:pPr>
+          </w:p>
+        </w:tc>
+        <w:tc>
+          <w:tcPr>
+            <w:tcW w:w="0" w:type="auto"/>
+            <w:gridSpan w:val="2"/>
+            <w:vAlign w:val="center"/>
+          </w:tcPr>
+          <w:p>
+            <w:pPr>
+              <w:rPr>
+                <w:rFonts w:hint="eastAsia"/>
+              </w:rPr>
+            </w:pPr>
+            <w:r>
+              <w:rPr>
+                <w:rFonts w:hint="eastAsia"/>
+              </w:rPr>
+              <w:t>Prompt V1</w:t>
+            </w:r>
+          </w:p>
+        </w:tc>
+        <w:tc>
+          <w:tcPr>
+            <w:tcW w:w="0" w:type="auto"/>
+            <w:vAlign w:val="center"/>
+          </w:tcPr>
+          <w:p>
+            <w:pPr>
+              <w:rPr>
+                <w:rFonts w:hint="eastAsia"/>
+              </w:rPr>
+            </w:pPr>
+            <w:r>
+              <w:rPr>
+                <w:rFonts w:hint="eastAsia"/>
+              </w:rPr>
+              <w:t>0.37</w:t>
+            </w:r>
+          </w:p>
+        </w:tc>
+        <w:tc>
+          <w:tcPr>
+            <w:tcW w:w="0" w:type="auto"/>
+            <w:vAlign w:val="center"/>
+          </w:tcPr>
+          <w:p>
+            <w:pPr>
+              <w:rPr>
+                <w:rFonts w:hint="eastAsia"/>
+              </w:rPr>
+            </w:pPr>
+            <w:r>
+              <w:rPr>
+                <w:rFonts w:hint="eastAsia"/>
+              </w:rPr>
+              <w:t>0.21</w:t>
+            </w:r>
+          </w:p>
+        </w:tc>
+        <w:tc>
+          <w:tcPr>
+            <w:tcW w:w="0" w:type="auto"/>
+            <w:vAlign w:val="center"/>
+          </w:tcPr>
+          <w:p>
+            <w:pPr>
+              <w:rPr>
+                <w:rFonts w:hint="eastAsia"/>
+              </w:rPr>
+            </w:pPr>
+            <w:r>
+              <w:rPr>
+                <w:rFonts w:hint="eastAsia"/>
+              </w:rPr>
+              <w:t>0.13</w:t>
+            </w:r>
+          </w:p>
+        </w:tc>
+        <w:tc>
+          <w:tcPr>
+            <w:tcW w:w="0" w:type="auto"/>
+            <w:vAlign w:val="center"/>
+          </w:tcPr>
+          <w:p>
+            <w:pPr>
+              <w:rPr>
+                <w:rFonts w:hint="eastAsia"/>
+              </w:rPr>
+            </w:pPr>
+            <w:r>
+              <w:rPr>
+                <w:rFonts w:hint="eastAsia"/>
+              </w:rPr>
+              <w:t>0.51</w:t>
+            </w:r>
+          </w:p>
+        </w:tc>
+        <w:tc>
+          <w:tcPr>
+            <w:tcW w:w="0" w:type="auto"/>
+            <w:vAlign w:val="center"/>
+          </w:tcPr>
+          <w:p>
+            <w:pPr>
+              <w:rPr>
+                <w:rFonts w:hint="eastAsia"/>
+              </w:rPr>
+            </w:pPr>
+            <w:r>
+              <w:rPr>
+                <w:rFonts w:hint="eastAsia"/>
+              </w:rPr>
+              <w:t>0</w:t>
+            </w:r>
+          </w:p>
+        </w:tc>
+      </w:tr>
+      <w:tr>
+        <w:trPr>
+          <w:tblCellSpacing w:w="15" w:type="dxa"/>
+        </w:trPr>
+        <w:tc>
+          <w:tcPr>
+            <w:tcW w:w="0" w:type="auto"/>
+            <w:vAlign w:val="center"/>
+          </w:tcPr>
+          <w:p>
+            <w:pPr>
+              <w:rPr>
+                <w:rFonts w:hint="eastAsia"/>
+              </w:rPr>
+            </w:pPr>
+          </w:p>
+        </w:tc>
+        <w:tc>
+          <w:tcPr>
+            <w:tcW w:w="0" w:type="auto"/>
+            <w:gridSpan w:val="2"/>
+            <w:vAlign w:val="center"/>
+          </w:tcPr>
+          <w:p>
+            <w:pPr>
+              <w:rPr>
+                <w:rFonts w:hint="eastAsia"/>
+              </w:rPr>
+            </w:pPr>
+            <w:r>
+              <w:rPr>
+                <w:rFonts w:hint="eastAsia"/>
+              </w:rPr>
+              <w:t>V1 improved</w:t>
+            </w:r>
+          </w:p>
+        </w:tc>
+        <w:tc>
+          <w:tcPr>
+            <w:tcW w:w="0" w:type="auto"/>
+            <w:vAlign w:val="center"/>
+          </w:tcPr>
+          <w:p>
+            <w:pPr>
+              <w:rPr>
+                <w:rFonts w:hint="eastAsia"/>
+              </w:rPr>
+            </w:pPr>
+            <w:r>
+              <w:rPr>
+                <w:rFonts w:hint="eastAsia"/>
+              </w:rPr>
+              <w:t>0.34</w:t>
+            </w:r>
+          </w:p>
+        </w:tc>
+        <w:tc>
+          <w:tcPr>
+            <w:tcW w:w="0" w:type="auto"/>
+            <w:vAlign w:val="center"/>
+          </w:tcPr>
+          <w:p>
+            <w:pPr>
+              <w:rPr>
+                <w:rFonts w:hint="eastAsia"/>
+              </w:rPr>
+            </w:pPr>
+            <w:r>
+              <w:rPr>
+                <w:rFonts w:hint="eastAsia"/>
+              </w:rPr>
+              <w:t>0.31</w:t>
+            </w:r>
+          </w:p>
+        </w:tc>
+        <w:tc>
+          <w:tcPr>
+            <w:tcW w:w="0" w:type="auto"/>
+            <w:vAlign w:val="center"/>
+          </w:tcPr>
+          <w:p>
+            <w:pPr>
+              <w:rPr>
+                <w:rFonts w:hint="eastAsia"/>
+              </w:rPr>
+            </w:pPr>
+            <w:r>
+              <w:rPr>
+                <w:rFonts w:hint="eastAsia"/>
+              </w:rPr>
+              <w:t>0.30</w:t>
+            </w:r>
+          </w:p>
+        </w:tc>
+        <w:tc>
+          <w:tcPr>
+            <w:tcW w:w="0" w:type="auto"/>
+            <w:vAlign w:val="center"/>
+          </w:tcPr>
+          <w:p>
+            <w:pPr>
+              <w:rPr>
+                <w:rFonts w:hint="eastAsia"/>
+              </w:rPr>
+            </w:pPr>
+            <w:r>
+              <w:rPr>
+                <w:rFonts w:hint="eastAsia"/>
+              </w:rPr>
+              <w:t>0.46</w:t>
+            </w:r>
+          </w:p>
+        </w:tc>
+        <w:tc>
+          <w:tcPr>
+            <w:tcW w:w="0" w:type="auto"/>
+            <w:vAlign w:val="center"/>
+          </w:tcPr>
+          <w:p>
+            <w:pPr>
+              <w:rPr>
+                <w:rFonts w:hint="eastAsia"/>
+              </w:rPr>
+            </w:pPr>
+            <w:r>
+              <w:rPr>
+                <w:rFonts w:hint="eastAsia"/>
+              </w:rPr>
+              <w:t>0.17</w:t>
+            </w:r>
+          </w:p>
+        </w:tc>
+      </w:tr>
+      <w:tr>
+        <w:trPr>
+          <w:tblCellSpacing w:w="15" w:type="dxa"/>
+        </w:trPr>
+        <w:tc>
+          <w:tcPr>
+            <w:tcW w:w="0" w:type="auto"/>
+            <w:vAlign w:val="center"/>
+          </w:tcPr>
+          <w:p>
+            <w:pPr>
+              <w:rPr>
+                <w:rFonts w:hint="eastAsia"/>
+              </w:rPr>
+            </w:pPr>
+          </w:p>
+        </w:tc>
+        <w:tc>
+          <w:tcPr>
+            <w:tcW w:w="0" w:type="auto"/>
+            <w:gridSpan w:val="2"/>
+            <w:vAlign w:val="center"/>
+          </w:tcPr>
+          <w:p>
+            <w:pPr>
+              <w:rPr>
+                <w:rFonts w:hint="eastAsia"/>
+              </w:rPr>
+            </w:pPr>
+            <w:r>
+              <w:rPr>
+                <w:rFonts w:hint="eastAsia"/>
+              </w:rPr>
+              <w:t>Prompt V2</w:t>
+            </w:r>
+          </w:p>
+        </w:tc>
+        <w:tc>
+          <w:tcPr>
+            <w:tcW w:w="0" w:type="auto"/>
+            <w:vAlign w:val="center"/>
+          </w:tcPr>
+          <w:p>
+            <w:pPr>
+              <w:rPr>
+                <w:rFonts w:hint="eastAsia"/>
+              </w:rPr>
+            </w:pPr>
+            <w:r>
+              <w:rPr>
+                <w:rFonts w:hint="eastAsia"/>
+              </w:rPr>
+              <w:t>0.40</w:t>
+            </w:r>
+          </w:p>
+        </w:tc>
+        <w:tc>
+          <w:tcPr>
+            <w:tcW w:w="0" w:type="auto"/>
+            <w:vAlign w:val="center"/>
+          </w:tcPr>
+          <w:p>
+            <w:pPr>
+              <w:rPr>
+                <w:rFonts w:hint="eastAsia"/>
+              </w:rPr>
+            </w:pPr>
+            <w:r>
+              <w:rPr>
+                <w:rFonts w:hint="eastAsia"/>
+              </w:rPr>
+              <w:t>0.26</w:t>
+            </w:r>
+          </w:p>
+        </w:tc>
+        <w:tc>
+          <w:tcPr>
+            <w:tcW w:w="0" w:type="auto"/>
+            <w:vAlign w:val="center"/>
+          </w:tcPr>
+          <w:p>
+            <w:pPr>
+              <w:rPr>
+                <w:rFonts w:hint="eastAsia"/>
+              </w:rPr>
+            </w:pPr>
+            <w:r>
+              <w:rPr>
+                <w:rFonts w:hint="eastAsia"/>
+              </w:rPr>
+              <w:t>0.25</w:t>
+            </w:r>
+          </w:p>
+        </w:tc>
+        <w:tc>
+          <w:tcPr>
+            <w:tcW w:w="0" w:type="auto"/>
+            <w:vAlign w:val="center"/>
+          </w:tcPr>
+          <w:p>
+            <w:pPr>
+              <w:rPr>
+                <w:rFonts w:hint="eastAsia"/>
+              </w:rPr>
+            </w:pPr>
+            <w:r>
+              <w:rPr>
+                <w:rFonts w:hint="eastAsia"/>
+              </w:rPr>
+              <w:t>0.52</w:t>
+            </w:r>
+          </w:p>
+        </w:tc>
+        <w:tc>
+          <w:tcPr>
+            <w:tcW w:w="0" w:type="auto"/>
+            <w:vAlign w:val="center"/>
+          </w:tcPr>
+          <w:p>
+            <w:pPr>
+              <w:rPr>
+                <w:rFonts w:hint="eastAsia"/>
+              </w:rPr>
+            </w:pPr>
+            <w:r>
+              <w:rPr>
+                <w:rFonts w:hint="eastAsia"/>
+              </w:rPr>
+              <w:t>0</w:t>
+            </w:r>
+          </w:p>
+        </w:tc>
+      </w:tr>
+      <w:tr>
+        <w:trPr>
+          <w:tblCellSpacing w:w="15" w:type="dxa"/>
+        </w:trPr>
+        <w:tc>
+          <w:tcPr>
+            <w:tcW w:w="0" w:type="auto"/>
+            <w:vAlign w:val="center"/>
+          </w:tcPr>
+          <w:p>
+            <w:pPr>
+              <w:rPr>
+                <w:rFonts w:hint="eastAsia"/>
+              </w:rPr>
+            </w:pPr>
+          </w:p>
+        </w:tc>
+        <w:tc>
+          <w:tcPr>
+            <w:tcW w:w="0" w:type="auto"/>
+            <w:gridSpan w:val="2"/>
+            <w:vAlign w:val="center"/>
+          </w:tcPr>
+          <w:p>
+            <w:pPr>
+              <w:rPr>
+                <w:rFonts w:hint="eastAsia"/>
+              </w:rPr>
+            </w:pPr>
+            <w:r>
+              <w:rPr>
+                <w:rFonts w:hint="eastAsia"/>
+              </w:rPr>
+              <w:t>V2 improved</w:t>
+            </w:r>
+          </w:p>
+        </w:tc>
+        <w:tc>
+          <w:tcPr>
+            <w:tcW w:w="0" w:type="auto"/>
+            <w:vAlign w:val="center"/>
+          </w:tcPr>
+          <w:p>
+            <w:pPr>
+              <w:rPr>
+                <w:rFonts w:hint="eastAsia"/>
+              </w:rPr>
+            </w:pPr>
+            <w:r>
+              <w:rPr>
+                <w:rFonts w:hint="eastAsia"/>
+              </w:rPr>
+              <w:t>0.39</w:t>
+            </w:r>
+          </w:p>
+        </w:tc>
+        <w:tc>
+          <w:tcPr>
+            <w:tcW w:w="0" w:type="auto"/>
+            <w:vAlign w:val="center"/>
+          </w:tcPr>
+          <w:p>
+            <w:pPr>
+              <w:rPr>
+                <w:rFonts w:hint="eastAsia"/>
+              </w:rPr>
+            </w:pPr>
+            <w:r>
+              <w:rPr>
+                <w:rFonts w:hint="eastAsia"/>
+              </w:rPr>
+              <w:t>0.32</w:t>
+            </w:r>
+          </w:p>
+        </w:tc>
+        <w:tc>
+          <w:tcPr>
+            <w:tcW w:w="0" w:type="auto"/>
+            <w:vAlign w:val="center"/>
+          </w:tcPr>
+          <w:p>
+            <w:pPr>
+              <w:rPr>
+                <w:rFonts w:hint="eastAsia"/>
+              </w:rPr>
+            </w:pPr>
+            <w:r>
+              <w:rPr>
+                <w:rFonts w:hint="eastAsia"/>
+              </w:rPr>
+              <w:t>0.28</w:t>
+            </w:r>
+          </w:p>
+        </w:tc>
+        <w:tc>
+          <w:tcPr>
+            <w:tcW w:w="0" w:type="auto"/>
+            <w:vAlign w:val="center"/>
+          </w:tcPr>
+          <w:p>
+            <w:pPr>
+              <w:rPr>
+                <w:rFonts w:hint="eastAsia"/>
+              </w:rPr>
+            </w:pPr>
+            <w:r>
+              <w:rPr>
+                <w:rFonts w:hint="eastAsia"/>
+              </w:rPr>
+              <w:t>0.56</w:t>
+            </w:r>
+          </w:p>
+        </w:tc>
+        <w:tc>
+          <w:tcPr>
+            <w:tcW w:w="0" w:type="auto"/>
+            <w:vAlign w:val="center"/>
+          </w:tcPr>
+          <w:p>
+            <w:pPr>
+              <w:rPr>
+                <w:rFonts w:hint="eastAsia"/>
+              </w:rPr>
+            </w:pPr>
+            <w:r>
+              <w:rPr>
+                <w:rFonts w:hint="eastAsia"/>
+              </w:rPr>
+              <w:t>0.11</w:t>
+            </w:r>
+          </w:p>
+        </w:tc>
+      </w:tr>
+      <w:tr>
+        <w:trPr>
+          <w:tblCellSpacing w:w="15" w:type="dxa"/>
+        </w:trPr>
+        <w:tc>
+          <w:tcPr>
+            <w:tcW w:w="0" w:type="auto"/>
+            <w:vAlign w:val="center"/>
+            <w:hideMark/>
+          </w:tcPr>
+          <w:p>
+            <w:pPr>
+              <w:rPr>
+                <w:rFonts w:hint="eastAsia"/>
+              </w:rPr>
+            </w:pPr>
+            <w:r>
+              <w:t>BioGPT (</w:t>
             </w:r>
             <w:proofErr w:type="spellStart"/>
             <w:r>
@@ -6221,21 +6752,12 @@
           <w:rFonts w:hint="eastAsia"/>
         </w:rPr>
       </w:pPr>
-      <w:proofErr w:type="spellStart"/>
-      <w:r>
-        <w:rPr>
-          <w:b/>
-          <w:bCs/>
-        </w:rPr>
-        <w:t>BioWordVec</w:t>
-      </w:r>
-      <w:proofErr w:type="spellEnd"/>
-      <w:r>
-        <w:rPr>
-          <w:b/>
-          <w:bCs/>
-        </w:rPr>
-        <w:t xml:space="preserve"> results</w:t>
+      <w:r>
+        <w:rPr>
+          <w:b/>
+          <w:bCs/>
+        </w:rPr>
+        <w:t>BioWordVec results</w:t>
       </w:r>
       <w:r>
         <w:t xml:space="preserve"> (Haoran): compare SVM vs. MLP; how does it compare to TF-IDF?</w:t>
@@ -6251,21 +6773,12 @@
           <w:rFonts w:hint="eastAsia"/>
         </w:rPr>
       </w:pPr>
-      <w:proofErr w:type="spellStart"/>
-      <w:r>
-        <w:rPr>
-          <w:b/>
-          <w:bCs/>
-        </w:rPr>
-        <w:t>PubMedBERT</w:t>
-      </w:r>
-      <w:proofErr w:type="spellEnd"/>
-      <w:r>
-        <w:rPr>
-          <w:b/>
-          <w:bCs/>
-        </w:rPr>
-        <w:t xml:space="preserve"> results</w:t>
+      <w:r>
+        <w:rPr>
+          <w:b/>
+          <w:bCs/>
+        </w:rPr>
+        <w:t>PubMedBERT results</w:t>
       </w:r>
       <w:r>
         <w:t xml:space="preserve"> (</w:t>
@@ -6277,15 +6790,7 @@
         <w:t>Anis</w:t>
       </w:r>
       <w:r>
-        <w:t xml:space="preserve">): compare to </w:t>
-      </w:r>
-      <w:proofErr w:type="spellStart"/>
-      <w:r>
-        <w:t>BioWordVec</w:t>
-      </w:r>
-      <w:proofErr w:type="spellEnd"/>
-      <w:r>
-        <w:t>; did contextual embeddings justify the cost?</w:t>
+        <w:t>): compare to BioWordVec; did contextual embeddings justify the cost?</w:t>
       </w:r>
     </w:p>
     <w:p>
@@ -6298,40 +6803,35 @@
           <w:rFonts w:hint="eastAsia"/>
         </w:rPr>
       </w:pPr>
+      <w:r>
+        <w:rPr>
+          <w:b/>
+          <w:bCs/>
+        </w:rPr>
+        <w:t>BioGPT results</w:t>
+      </w:r>
+      <w:r>
+        <w:t xml:space="preserve"> (Haoran + </w:t>
+      </w:r>
       <w:proofErr w:type="spellStart"/>
       <w:r>
-        <w:rPr>
-          <w:b/>
-          <w:bCs/>
-        </w:rPr>
-        <w:t>BioGPT</w:t>
+        <w:t>Lingshi</w:t>
       </w:r>
       <w:proofErr w:type="spellEnd"/>
       <w:r>
-        <w:rPr>
-          <w:b/>
-          <w:bCs/>
-        </w:rPr>
-        <w:t xml:space="preserve"> results</w:t>
-      </w:r>
-      <w:r>
-        <w:t xml:space="preserve"> (Haoran + </w:t>
+        <w:t xml:space="preserve">): compare zero-shot vs. </w:t>
       </w:r>
       <w:proofErr w:type="spellStart"/>
       <w:r>
-        <w:t>Lingshi</w:t>
+        <w:t>LoRA</w:t>
       </w:r>
       <w:proofErr w:type="spellEnd"/>
       <w:r>
-        <w:t xml:space="preserve">): compare zero-shot vs. </w:t>
-      </w:r>
-      <w:proofErr w:type="spellStart"/>
-      <w:r>
-        <w:t>LoRA</w:t>
-      </w:r>
-      <w:proofErr w:type="spellEnd"/>
-      <w:r>
-        <w:t>; how do both compare to the best supervised pipeline?</w:t>
+        <w:t xml:space="preserve">; how do both </w:t>
+      </w:r>
+      <w:r>
+        <w:lastRenderedPageBreak/>
+        <w:t>compare to the best supervised pipeline?</w:t>
       </w:r>
     </w:p>
     <w:p>
@@ -6449,7 +6949,6 @@
         </w:rPr>
       </w:pPr>
       <w:r>
-        <w:lastRenderedPageBreak/>
         <w:t>Note whether the "maybe" class is systematically under-predicted (expected given class imbalance)</w:t>
       </w:r>
     </w:p>
@@ -6510,6 +7009,7 @@
           <w:numId w:val="18"/>
         </w:numPr>
         <w:rPr>
+          <w:rFonts w:hint="eastAsia"/>
           <w:b/>
           <w:bCs/>
         </w:rPr>
@@ -6551,7 +7051,6 @@
           <w:rFonts w:hint="eastAsia"/>
         </w:rPr>
       </w:pPr>
-      <w:proofErr w:type="spellStart"/>
       <w:r>
         <w:rPr>
           <w:b/>
@@ -6559,17 +7058,8 @@
         </w:rPr>
         <w:t>BioWordVec</w:t>
       </w:r>
-      <w:proofErr w:type="spellEnd"/>
-      <w:r>
-        <w:t xml:space="preserve"> (Haoran): OOV rate analysis — what proportion of test tokens were not in the </w:t>
-      </w:r>
-      <w:proofErr w:type="spellStart"/>
-      <w:r>
-        <w:t>BioWordVec</w:t>
-      </w:r>
-      <w:proofErr w:type="spellEnd"/>
-      <w:r>
-        <w:t xml:space="preserve"> vocabulary? </w:t>
+      <w:r>
+        <w:t xml:space="preserve"> (Haoran): OOV rate analysis — what proportion of test tokens were not in the BioWordVec vocabulary? </w:t>
       </w:r>
       <w:proofErr w:type="gramStart"/>
       <w:r>
@@ -6590,7 +7080,6 @@
           <w:rFonts w:hint="eastAsia"/>
         </w:rPr>
       </w:pPr>
-      <w:proofErr w:type="spellStart"/>
       <w:r>
         <w:rPr>
           <w:b/>
@@ -6598,7 +7087,6 @@
         </w:rPr>
         <w:t>PubMedBERT</w:t>
       </w:r>
-      <w:proofErr w:type="spellEnd"/>
       <w:r>
         <w:t xml:space="preserve"> (</w:t>
       </w:r>
@@ -6622,21 +7110,12 @@
           <w:rFonts w:hint="eastAsia"/>
         </w:rPr>
       </w:pPr>
-      <w:proofErr w:type="spellStart"/>
-      <w:r>
-        <w:rPr>
-          <w:b/>
-          <w:bCs/>
-        </w:rPr>
-        <w:t>BioGPT</w:t>
-      </w:r>
-      <w:proofErr w:type="spellEnd"/>
-      <w:r>
-        <w:rPr>
-          <w:b/>
-          <w:bCs/>
-        </w:rPr>
-        <w:t xml:space="preserve"> zero-shot</w:t>
+      <w:r>
+        <w:rPr>
+          <w:b/>
+          <w:bCs/>
+        </w:rPr>
+        <w:t>BioGPT zero-shot</w:t>
       </w:r>
       <w:r>
         <w:t xml:space="preserve"> (Haoran): confidence margin analysis — were errors concentrated in low-margin (uncertain) predictions? Refer to biogpt_results.csv columns uncertain, </w:t>
@@ -6882,6 +7361,7 @@
         </w:rPr>
       </w:pPr>
       <w:r>
+        <w:lastRenderedPageBreak/>
         <w:t>If results are preliminary, present what has been done and note limitations</w:t>
       </w:r>
     </w:p>
@@ -6979,23 +7459,7 @@
         <w:t>Did the axis hypotheses hold?</w:t>
       </w:r>
       <w:r>
-        <w:t xml:space="preserve"> Did increasing domain specificity in Axis 1 (TF-IDF → </w:t>
-      </w:r>
-      <w:proofErr w:type="spellStart"/>
-      <w:r>
-        <w:t>BioWordVec</w:t>
-      </w:r>
-      <w:proofErr w:type="spellEnd"/>
-      <w:r>
-        <w:t xml:space="preserve"> → </w:t>
-      </w:r>
-      <w:proofErr w:type="spellStart"/>
-      <w:r>
-        <w:t>PubMedBERT</w:t>
-      </w:r>
-      <w:proofErr w:type="spellEnd"/>
-      <w:r>
-        <w:t>) produce consistent improvements? Did MLP outperform SVM?</w:t>
+        <w:t xml:space="preserve"> Did increasing domain specificity in Axis 1 (TF-IDF → BioWordVec → PubMedBERT) produce consistent improvements? Did MLP outperform SVM?</w:t>
       </w:r>
     </w:p>
     <w:p>
@@ -7014,7 +7478,6 @@
           <w:b/>
           <w:bCs/>
         </w:rPr>
-        <w:lastRenderedPageBreak/>
         <w:t xml:space="preserve">Haoran: </w:t>
       </w:r>
       <w:r>
@@ -7025,23 +7488,7 @@
         <w:t>Generative vs. discriminative</w:t>
       </w:r>
       <w:r>
-        <w:t xml:space="preserve">: </w:t>
-      </w:r>
-      <w:proofErr w:type="spellStart"/>
-      <w:r>
-        <w:t>BioGPT</w:t>
-      </w:r>
-      <w:proofErr w:type="spellEnd"/>
-      <w:r>
-        <w:t xml:space="preserve"> zero-shot scored 36% accuracy and 0.209 Macro F1 — substantially below the supervised baselines. Discuss why: the task requires 3-class discrimination from a structured prompt, which is not what </w:t>
-      </w:r>
-      <w:proofErr w:type="spellStart"/>
-      <w:r>
-        <w:t>BioGPT</w:t>
-      </w:r>
-      <w:proofErr w:type="spellEnd"/>
-      <w:r>
-        <w:t xml:space="preserve"> was trained for; logit scoring is a coarse proxy for classification confidence. Discuss what the </w:t>
+        <w:t xml:space="preserve">: BioGPT zero-shot scored 36% accuracy and 0.209 Macro F1 — substantially below the supervised baselines. Discuss why: the task requires 3-class discrimination from a structured prompt, which is not what BioGPT was trained for; logit scoring is a coarse proxy for classification confidence. Discuss what the </w:t>
       </w:r>
       <w:proofErr w:type="spellStart"/>
       <w:r>
@@ -7078,15 +7525,7 @@
         <w:t>Limitations</w:t>
       </w:r>
       <w:r>
-        <w:t xml:space="preserve">: class imbalance effect on "maybe"; </w:t>
-      </w:r>
-      <w:proofErr w:type="spellStart"/>
-      <w:r>
-        <w:t>BioGPT</w:t>
-      </w:r>
-      <w:proofErr w:type="spellEnd"/>
-      <w:r>
-        <w:t xml:space="preserve"> prior adjustment not applied; BERT+SVM not implemented; Task 3 preliminary.</w:t>
+        <w:t>: class imbalance effect on "maybe"; BioGPT prior adjustment not applied; BERT+SVM not implemented; Task 3 preliminary.</w:t>
       </w:r>
     </w:p>
     <w:p>
@@ -7097,7 +7536,7 @@
       </w:pPr>
       <w:r>
         <w:pict w14:anchorId="69533977">
-          <v:rect id="_x0000_i1030" style="width:0;height:1.5pt" o:hralign="center" o:hrstd="t" o:hr="t" fillcolor="#a0a0a0" stroked="f"/>
+          <v:rect id="_x0000_i1050" style="width:0;height:1.5pt" o:hralign="center" o:hrstd="t" o:hr="t" fillcolor="#a0a0a0" stroked="f"/>
         </w:pict>
       </w:r>
     </w:p>
@@ -7190,22 +7629,14 @@
         <w:t>Paragraph 2 — What did not work and why:</w:t>
       </w:r>
       <w:r>
-        <w:t xml:space="preserve"> </w:t>
+        <w:t xml:space="preserve"> BioGPT zero-shot performance, "maybe" class difficulty across all methods, any unexpected results (e.g., if </w:t>
       </w:r>
       <w:proofErr w:type="spellStart"/>
       <w:r>
-        <w:t>BioGPT</w:t>
+        <w:t>MeSH</w:t>
       </w:r>
       <w:proofErr w:type="spellEnd"/>
       <w:r>
-        <w:t xml:space="preserve"> zero-shot performance, "maybe" class difficulty across all methods, any unexpected results (e.g., if </w:t>
-      </w:r>
-      <w:proofErr w:type="spellStart"/>
-      <w:r>
-        <w:t>MeSH</w:t>
-      </w:r>
-      <w:proofErr w:type="spellEnd"/>
-      <w:r>
         <w:t xml:space="preserve"> terms did not help as expected).</w:t>
       </w:r>
     </w:p>
@@ -7234,7 +7665,7 @@
       </w:pPr>
       <w:r>
         <w:pict w14:anchorId="38D07D8C">
-          <v:rect id="_x0000_i1031" style="width:0;height:1.5pt" o:hralign="center" o:hrstd="t" o:hr="t" fillcolor="#a0a0a0" stroked="f"/>
+          <v:rect id="_x0000_i1051" style="width:0;height:1.5pt" o:hralign="center" o:hrstd="t" o:hr="t" fillcolor="#a0a0a0" stroked="f"/>
         </w:pict>
       </w:r>
     </w:p>
@@ -7287,31 +7718,7 @@
       </w:r>
       <w:proofErr w:type="spellEnd"/>
       <w:r>
-        <w:t xml:space="preserve"> models are cited with links (</w:t>
-      </w:r>
-      <w:proofErr w:type="spellStart"/>
-      <w:r>
-        <w:t>BioWordVec</w:t>
-      </w:r>
-      <w:proofErr w:type="spellEnd"/>
-      <w:r>
-        <w:t xml:space="preserve">, </w:t>
-      </w:r>
-      <w:proofErr w:type="spellStart"/>
-      <w:r>
-        <w:t>PubMedBERT</w:t>
-      </w:r>
-      <w:proofErr w:type="spellEnd"/>
-      <w:r>
-        <w:t xml:space="preserve">, </w:t>
-      </w:r>
-      <w:proofErr w:type="spellStart"/>
-      <w:r>
-        <w:t>BioGPT</w:t>
-      </w:r>
-      <w:proofErr w:type="spellEnd"/>
-      <w:r>
-        <w:t>)</w:t>
+        <w:t xml:space="preserve"> models are cited with links (BioWordVec, PubMedBERT, BioGPT)</w:t>
       </w:r>
     </w:p>
     <w:p>
@@ -7407,6 +7814,64 @@
     </w:sectPr>
   </w:body>
 </w:document>
+</file>
+
+<file path=word/endnotes.xml><?xml version="1.0" encoding="utf-8"?>
+<w:endnotes xmlns:wpc="http://schemas.microsoft.com/office/word/2010/wordprocessingCanvas" xmlns:cx="http://schemas.microsoft.com/office/drawing/2014/chartex" xmlns:cx1="http://schemas.microsoft.com/office/drawing/2015/9/8/chartex" xmlns:cx2="http://schemas.microsoft.com/office/drawing/2015/10/21/chartex" xmlns:cx3="http://schemas.microsoft.com/office/drawing/2016/5/9/chartex" xmlns:cx4="http://schemas.microsoft.com/office/drawing/2016/5/10/chartex" xmlns:cx5="http://schemas.microsoft.com/office/drawing/2016/5/11/chartex" xmlns:cx6="http://schemas.microsoft.com/office/drawing/2016/5/12/chartex" xmlns:cx7="http://schemas.microsoft.com/office/drawing/2016/5/13/chartex" xmlns:cx8="http://schemas.microsoft.com/office/drawing/2016/5/14/chartex" xmlns:mc="http://schemas.openxmlformats.org/markup-compatibility/2006" xmlns:aink="http://schemas.microsoft.com/office/drawing/2016/ink" xmlns:am3d="http://schemas.microsoft.com/office/drawing/2017/model3d" xmlns:o="urn:schemas-microsoft-com:office:office" xmlns:oel="http://schemas.microsoft.com/office/2019/extlst" xmlns:r="http://schemas.openxmlformats.org/officeDocument/2006/relationships" xmlns:m="http://schemas.openxmlformats.org/officeDocument/2006/math" xmlns:v="urn:schemas-microsoft-com:vml" xmlns:wp14="http://schemas.microsoft.com/office/word/2010/wordprocessingDrawing" xmlns:wp="http://schemas.openxmlformats.org/drawingml/2006/wordprocessingDrawing" xmlns:w10="urn:schemas-microsoft-com:office:word" xmlns:w="http://schemas.openxmlformats.org/wordprocessingml/2006/main" xmlns:w14="http://schemas.microsoft.com/office/word/2010/wordml" xmlns:w15="http://schemas.microsoft.com/office/word/2012/wordml" xmlns:w16cex="http://schemas.microsoft.com/office/word/2018/wordml/cex" xmlns:w16cid="http://schemas.microsoft.com/office/word/2016/wordml/cid" xmlns:w16="http://schemas.microsoft.com/office/word/2018/wordml" xmlns:w16du="http://schemas.microsoft.com/office/word/2023/wordml/word16du" xmlns:w16sdtdh="http://schemas.microsoft.com/office/word/2020/wordml/sdtdatahash" xmlns:w16sdtfl="http://schemas.microsoft.com/office/word/2024/wordml/sdtformatlock" xmlns:w16se="http://schemas.microsoft.com/office/word/2015/wordml/symex" xmlns:wpg="http://schemas.microsoft.com/office/word/2010/wordprocessingGroup" xmlns:wpi="http://schemas.microsoft.com/office/word/2010/wordprocessingInk" xmlns:wne="http://schemas.microsoft.com/office/word/2006/wordml" xmlns:wps="http://schemas.microsoft.com/office/word/2010/wordprocessingShape" mc:Ignorable="w14 w15 w16se w16cid w16 w16cex w16sdtdh w16sdtfl w16du wp14">
+  <w:endnote w:type="separator" w:id="-1">
+    <w:p>
+      <w:pPr>
+        <w:rPr>
+          <w:rFonts w:hint="eastAsia"/>
+        </w:rPr>
+      </w:pPr>
+      <w:r>
+        <w:separator/>
+      </w:r>
+    </w:p>
+  </w:endnote>
+  <w:endnote w:type="continuationSeparator" w:id="0">
+    <w:p>
+      <w:pPr>
+        <w:rPr>
+          <w:rFonts w:hint="eastAsia"/>
+        </w:rPr>
+      </w:pPr>
+      <w:r>
+        <w:continuationSeparator/>
+      </w:r>
+    </w:p>
+  </w:endnote>
+</w:endnotes>
+</file>
+
+<file path=word/footnotes.xml><?xml version="1.0" encoding="utf-8"?>
+<w:footnotes xmlns:wpc="http://schemas.microsoft.com/office/word/2010/wordprocessingCanvas" xmlns:cx="http://schemas.microsoft.com/office/drawing/2014/chartex" xmlns:cx1="http://schemas.microsoft.com/office/drawing/2015/9/8/chartex" xmlns:cx2="http://schemas.microsoft.com/office/drawing/2015/10/21/chartex" xmlns:cx3="http://schemas.microsoft.com/office/drawing/2016/5/9/chartex" xmlns:cx4="http://schemas.microsoft.com/office/drawing/2016/5/10/chartex" xmlns:cx5="http://schemas.microsoft.com/office/drawing/2016/5/11/chartex" xmlns:cx6="http://schemas.microsoft.com/office/drawing/2016/5/12/chartex" xmlns:cx7="http://schemas.microsoft.com/office/drawing/2016/5/13/chartex" xmlns:cx8="http://schemas.microsoft.com/office/drawing/2016/5/14/chartex" xmlns:mc="http://schemas.openxmlformats.org/markup-compatibility/2006" xmlns:aink="http://schemas.microsoft.com/office/drawing/2016/ink" xmlns:am3d="http://schemas.microsoft.com/office/drawing/2017/model3d" xmlns:o="urn:schemas-microsoft-com:office:office" xmlns:oel="http://schemas.microsoft.com/office/2019/extlst" xmlns:r="http://schemas.openxmlformats.org/officeDocument/2006/relationships" xmlns:m="http://schemas.openxmlformats.org/officeDocument/2006/math" xmlns:v="urn:schemas-microsoft-com:vml" xmlns:wp14="http://schemas.microsoft.com/office/word/2010/wordprocessingDrawing" xmlns:wp="http://schemas.openxmlformats.org/drawingml/2006/wordprocessingDrawing" xmlns:w10="urn:schemas-microsoft-com:office:word" xmlns:w="http://schemas.openxmlformats.org/wordprocessingml/2006/main" xmlns:w14="http://schemas.microsoft.com/office/word/2010/wordml" xmlns:w15="http://schemas.microsoft.com/office/word/2012/wordml" xmlns:w16cex="http://schemas.microsoft.com/office/word/2018/wordml/cex" xmlns:w16cid="http://schemas.microsoft.com/office/word/2016/wordml/cid" xmlns:w16="http://schemas.microsoft.com/office/word/2018/wordml" xmlns:w16du="http://schemas.microsoft.com/office/word/2023/wordml/word16du" xmlns:w16sdtdh="http://schemas.microsoft.com/office/word/2020/wordml/sdtdatahash" xmlns:w16sdtfl="http://schemas.microsoft.com/office/word/2024/wordml/sdtformatlock" xmlns:w16se="http://schemas.microsoft.com/office/word/2015/wordml/symex" xmlns:wpg="http://schemas.microsoft.com/office/word/2010/wordprocessingGroup" xmlns:wpi="http://schemas.microsoft.com/office/word/2010/wordprocessingInk" xmlns:wne="http://schemas.microsoft.com/office/word/2006/wordml" xmlns:wps="http://schemas.microsoft.com/office/word/2010/wordprocessingShape" mc:Ignorable="w14 w15 w16se w16cid w16 w16cex w16sdtdh w16sdtfl w16du wp14">
+  <w:footnote w:type="separator" w:id="-1">
+    <w:p>
+      <w:pPr>
+        <w:rPr>
+          <w:rFonts w:hint="eastAsia"/>
+        </w:rPr>
+      </w:pPr>
+      <w:r>
+        <w:separator/>
+      </w:r>
+    </w:p>
+  </w:footnote>
+  <w:footnote w:type="continuationSeparator" w:id="0">
+    <w:p>
+      <w:pPr>
+        <w:rPr>
+          <w:rFonts w:hint="eastAsia"/>
+        </w:rPr>
+      </w:pPr>
+      <w:r>
+        <w:continuationSeparator/>
+      </w:r>
+    </w:p>
+  </w:footnote>
+</w:footnotes>
 </file>
 
 <file path=word/numbering.xml><?xml version="1.0" encoding="utf-8"?>
@@ -11324,7 +11789,6 @@
   <w:style w:type="character" w:default="1" w:styleId="a0">
     <w:name w:val="Default Paragraph Font"/>
     <w:uiPriority w:val="1"/>
-    <w:semiHidden/>
     <w:unhideWhenUsed/>
   </w:style>
   <w:style w:type="table" w:default="1" w:styleId="a1">
@@ -11643,6 +12107,68 @@
       <w:spacing w:val="5"/>
     </w:rPr>
   </w:style>
+  <w:style w:type="paragraph" w:styleId="ae">
+    <w:name w:val="header"/>
+    <w:basedOn w:val="a"/>
+    <w:link w:val="af"/>
+    <w:uiPriority w:val="99"/>
+    <w:unhideWhenUsed/>
+    <w:rsid w:val="00B2201D"/>
+    <w:pPr>
+      <w:tabs>
+        <w:tab w:val="center" w:pos="4153"/>
+        <w:tab w:val="right" w:pos="8306"/>
+      </w:tabs>
+      <w:snapToGrid w:val="0"/>
+      <w:jc w:val="center"/>
+    </w:pPr>
+    <w:rPr>
+      <w:sz w:val="18"/>
+      <w:szCs w:val="18"/>
+    </w:rPr>
+  </w:style>
+  <w:style w:type="character" w:customStyle="1" w:styleId="af">
+    <w:name w:val="页眉 字符"/>
+    <w:basedOn w:val="a0"/>
+    <w:link w:val="ae"/>
+    <w:uiPriority w:val="99"/>
+    <w:rsid w:val="00B2201D"/>
+    <w:rPr>
+      <w:sz w:val="18"/>
+      <w:szCs w:val="18"/>
+    </w:rPr>
+  </w:style>
+  <w:style w:type="paragraph" w:styleId="af0">
+    <w:name w:val="footer"/>
+    <w:basedOn w:val="a"/>
+    <w:link w:val="af1"/>
+    <w:uiPriority w:val="99"/>
+    <w:unhideWhenUsed/>
+    <w:rsid w:val="00B2201D"/>
+    <w:pPr>
+      <w:tabs>
+        <w:tab w:val="center" w:pos="4153"/>
+        <w:tab w:val="right" w:pos="8306"/>
+      </w:tabs>
+      <w:snapToGrid w:val="0"/>
+      <w:jc w:val="left"/>
+    </w:pPr>
+    <w:rPr>
+      <w:sz w:val="18"/>
+      <w:szCs w:val="18"/>
+    </w:rPr>
+  </w:style>
+  <w:style w:type="character" w:customStyle="1" w:styleId="af1">
+    <w:name w:val="页脚 字符"/>
+    <w:basedOn w:val="a0"/>
+    <w:link w:val="af0"/>
+    <w:uiPriority w:val="99"/>
+    <w:rsid w:val="00B2201D"/>
+    <w:rPr>
+      <w:sz w:val="18"/>
+      <w:szCs w:val="18"/>
+    </w:rPr>
+  </w:style>
 </w:styles>
 </file>
 

</xml_diff>

<commit_message>
small changes in the allocation
</commit_message>
<xml_diff>
--- a/Group_Report_Allocation.docx
+++ b/Group_Report_Allocation.docx
@@ -66,17 +66,8 @@
           <w:b/>
           <w:bCs/>
         </w:rPr>
-        <w:t xml:space="preserve">Section Allocation </w:t>
-      </w:r>
-      <w:proofErr w:type="gramStart"/>
-      <w:r>
-        <w:rPr>
-          <w:b/>
-          <w:bCs/>
-        </w:rPr>
-        <w:t>at a Glance</w:t>
-      </w:r>
-      <w:proofErr w:type="gramEnd"/>
+        <w:t>Section Allocation at a Glance</w:t>
+      </w:r>
     </w:p>
     <w:tbl>
       <w:tblPr>
@@ -313,14 +304,12 @@
             <w:hideMark/>
           </w:tcPr>
           <w:p>
-            <w:proofErr w:type="spellStart"/>
             <w:r>
               <w:rPr>
                 <w:rFonts w:hint="eastAsia"/>
               </w:rPr>
               <w:t>Lingshi</w:t>
             </w:r>
-            <w:proofErr w:type="spellEnd"/>
           </w:p>
         </w:tc>
         <w:tc>
@@ -375,16 +364,8 @@
               <w:rPr>
                 <w:rFonts w:hint="eastAsia"/>
               </w:rPr>
-              <w:t xml:space="preserve"> + </w:t>
-            </w:r>
-            <w:proofErr w:type="spellStart"/>
-            <w:r>
-              <w:rPr>
-                <w:rFonts w:hint="eastAsia"/>
-              </w:rPr>
-              <w:t>Lingshi</w:t>
-            </w:r>
-            <w:proofErr w:type="spellEnd"/>
+              <w:t xml:space="preserve"> + Lingshi</w:t>
+            </w:r>
           </w:p>
         </w:tc>
         <w:tc>
@@ -483,13 +464,8 @@
           </w:tcPr>
           <w:p>
             <w:r>
-              <w:t xml:space="preserve">Haoran + </w:t>
-            </w:r>
-            <w:proofErr w:type="spellStart"/>
-            <w:r>
-              <w:t>Lingshi</w:t>
-            </w:r>
-            <w:proofErr w:type="spellEnd"/>
+              <w:t>Haoran + Lingshi</w:t>
+            </w:r>
           </w:p>
         </w:tc>
         <w:tc>
@@ -590,11 +566,9 @@
             <w:hideMark/>
           </w:tcPr>
           <w:p>
-            <w:proofErr w:type="spellStart"/>
             <w:r>
               <w:t>Lingshi</w:t>
             </w:r>
-            <w:proofErr w:type="spellEnd"/>
           </w:p>
         </w:tc>
         <w:tc>
@@ -633,11 +607,9 @@
             <w:hideMark/>
           </w:tcPr>
           <w:p>
-            <w:proofErr w:type="spellStart"/>
             <w:r>
               <w:t>Lingshi</w:t>
             </w:r>
-            <w:proofErr w:type="spellEnd"/>
           </w:p>
         </w:tc>
         <w:tc>
@@ -902,6 +874,56 @@
           </w:p>
         </w:tc>
       </w:tr>
+      <w:tr>
+        <w:trPr>
+          <w:tblCellSpacing w:w="15" w:type="dxa"/>
+        </w:trPr>
+        <w:tc>
+          <w:tcPr>
+            <w:tcW w:w="0" w:type="auto"/>
+            <w:vAlign w:val="center"/>
+          </w:tcPr>
+          <w:p>
+            <w:pPr>
+              <w:rPr>
+                <w:rFonts w:hint="eastAsia"/>
+              </w:rPr>
+            </w:pPr>
+            <w:r>
+              <w:rPr>
+                <w:rFonts w:hint="eastAsia"/>
+              </w:rPr>
+              <w:t>6. Reference</w:t>
+            </w:r>
+          </w:p>
+        </w:tc>
+        <w:tc>
+          <w:tcPr>
+            <w:tcW w:w="0" w:type="auto"/>
+            <w:vAlign w:val="center"/>
+          </w:tcPr>
+          <w:p>
+            <w:pPr>
+              <w:rPr>
+                <w:rFonts w:hint="eastAsia"/>
+              </w:rPr>
+            </w:pPr>
+            <w:r>
+              <w:rPr>
+                <w:rFonts w:hint="eastAsia"/>
+              </w:rPr>
+              <w:t>Pallavi</w:t>
+            </w:r>
+          </w:p>
+        </w:tc>
+        <w:tc>
+          <w:tcPr>
+            <w:tcW w:w="0" w:type="auto"/>
+            <w:vAlign w:val="center"/>
+          </w:tcPr>
+          <w:p/>
+        </w:tc>
+      </w:tr>
     </w:tbl>
     <w:p>
       <w:r>
@@ -941,17 +963,8 @@
           <w:i/>
           <w:iCs/>
         </w:rPr>
-        <w:t xml:space="preserve">Write last, after all results are </w:t>
-      </w:r>
-      <w:proofErr w:type="spellStart"/>
-      <w:r>
-        <w:rPr>
-          <w:i/>
-          <w:iCs/>
-        </w:rPr>
-        <w:t>finalised</w:t>
-      </w:r>
-      <w:proofErr w:type="spellEnd"/>
+        <w:t>Write last, after all results are finalised</w:t>
+      </w:r>
     </w:p>
     <w:p>
       <w:r>
@@ -1124,15 +1137,7 @@
         </w:numPr>
       </w:pPr>
       <w:r>
-        <w:t xml:space="preserve">Why </w:t>
-      </w:r>
-      <w:proofErr w:type="gramStart"/>
-      <w:r>
-        <w:t>different</w:t>
-      </w:r>
-      <w:proofErr w:type="gramEnd"/>
-      <w:r>
-        <w:t xml:space="preserve"> text representations matter in the biomedical domain (motivation for the two axes)</w:t>
+        <w:t>Why different text representations matter in the biomedical domain (motivation for the two axes)</w:t>
       </w:r>
     </w:p>
     <w:p>
@@ -1211,15 +1216,7 @@
         <w:t>Figure 1</w:t>
       </w:r>
       <w:r>
-        <w:t xml:space="preserve">: Class distribution (yes / no / </w:t>
-      </w:r>
-      <w:proofErr w:type="gramStart"/>
-      <w:r>
-        <w:t>maybe) —</w:t>
-      </w:r>
-      <w:proofErr w:type="gramEnd"/>
-      <w:r>
-        <w:t xml:space="preserve"> highlight class imbalance and its implications</w:t>
+        <w:t>: Class distribution (yes / no / maybe) — highlight class imbalance and its implications</w:t>
       </w:r>
     </w:p>
     <w:p>
@@ -1391,17 +1388,8 @@
           <w:b/>
           <w:bCs/>
         </w:rPr>
-        <w:t xml:space="preserve">Owner: </w:t>
-      </w:r>
-      <w:proofErr w:type="spellStart"/>
-      <w:r>
-        <w:rPr>
-          <w:b/>
-          <w:bCs/>
-        </w:rPr>
-        <w:t>Lingshi</w:t>
-      </w:r>
-      <w:proofErr w:type="spellEnd"/>
+        <w:t>Owner: Lingshi</w:t>
+      </w:r>
       <w:r>
         <w:t xml:space="preserve"> | </w:t>
       </w:r>
@@ -1508,23 +1496,7 @@
           </w:tcPr>
           <w:p>
             <w:r>
-              <w:t xml:space="preserve">Lowercasing, punctuation removal, </w:t>
-            </w:r>
-            <w:proofErr w:type="spellStart"/>
-            <w:r>
-              <w:t>stopword</w:t>
-            </w:r>
-            <w:proofErr w:type="spellEnd"/>
-            <w:r>
-              <w:t xml:space="preserve"> removal, stemming; </w:t>
-            </w:r>
-            <w:proofErr w:type="spellStart"/>
-            <w:r>
-              <w:t>MeSH</w:t>
-            </w:r>
-            <w:proofErr w:type="spellEnd"/>
-            <w:r>
-              <w:t xml:space="preserve"> terms appended as string suffix for the +MeSH variant</w:t>
+              <w:t>Lowercasing, punctuation removal, stopword removal, stemming; MeSH terms appended as string suffix for the +MeSH variant</w:t>
             </w:r>
           </w:p>
         </w:tc>
@@ -1563,23 +1535,7 @@
               <w:t>no</w:t>
             </w:r>
             <w:r>
-              <w:t xml:space="preserve"> stemming or </w:t>
-            </w:r>
-            <w:proofErr w:type="spellStart"/>
-            <w:r>
-              <w:t>stopword</w:t>
-            </w:r>
-            <w:proofErr w:type="spellEnd"/>
-            <w:r>
-              <w:t xml:space="preserve"> removal (</w:t>
-            </w:r>
-            <w:proofErr w:type="gramStart"/>
-            <w:r>
-              <w:t>justify:</w:t>
-            </w:r>
-            <w:proofErr w:type="gramEnd"/>
-            <w:r>
-              <w:t xml:space="preserve"> biomedical terms like "methylation" would be corrupted)</w:t>
+              <w:t xml:space="preserve"> stemming or stopword removal (justify: biomedical terms like "methylation" would be corrupted)</w:t>
             </w:r>
           </w:p>
         </w:tc>
@@ -1608,39 +1564,7 @@
           </w:tcPr>
           <w:p>
             <w:r>
-              <w:t xml:space="preserve">Raw text passed directly; </w:t>
-            </w:r>
-            <w:proofErr w:type="spellStart"/>
-            <w:r>
-              <w:t>tokenisation</w:t>
-            </w:r>
-            <w:proofErr w:type="spellEnd"/>
-            <w:r>
-              <w:t xml:space="preserve"> handled by </w:t>
-            </w:r>
-            <w:proofErr w:type="spellStart"/>
-            <w:r>
-              <w:t>HuggingFace</w:t>
-            </w:r>
-            <w:proofErr w:type="spellEnd"/>
-            <w:r>
-              <w:t xml:space="preserve"> </w:t>
-            </w:r>
-            <w:proofErr w:type="spellStart"/>
-            <w:r>
-              <w:t>tokeniser</w:t>
-            </w:r>
-            <w:proofErr w:type="spellEnd"/>
-            <w:r>
-              <w:t>; truncation="</w:t>
-            </w:r>
-            <w:proofErr w:type="spellStart"/>
-            <w:r>
-              <w:t>only_second</w:t>
-            </w:r>
-            <w:proofErr w:type="spellEnd"/>
-            <w:r>
-              <w:t>" to preserve the full question</w:t>
+              <w:t>Raw text passed directly; tokenisation handled by HuggingFace tokeniser; truncation="only_second" to preserve the full question</w:t>
             </w:r>
           </w:p>
         </w:tc>
@@ -1665,15 +1589,7 @@
         </w:numPr>
       </w:pPr>
       <w:r>
-        <w:t xml:space="preserve">Note that preprocessed data </w:t>
-      </w:r>
-      <w:proofErr w:type="gramStart"/>
-      <w:r>
-        <w:t>is not persisted</w:t>
-      </w:r>
-      <w:proofErr w:type="gramEnd"/>
-      <w:r>
-        <w:t xml:space="preserve"> to disk; reprocessed at runtime</w:t>
+        <w:t>Note that preprocessed data is not persisted to disk; reprocessed at runtime</w:t>
       </w:r>
     </w:p>
     <w:p>
@@ -1697,17 +1613,8 @@
           <w:b/>
           <w:bCs/>
         </w:rPr>
-        <w:t xml:space="preserve">Owner: </w:t>
-      </w:r>
-      <w:proofErr w:type="spellStart"/>
-      <w:r>
-        <w:rPr>
-          <w:b/>
-          <w:bCs/>
-        </w:rPr>
-        <w:t>Lingshi</w:t>
-      </w:r>
-      <w:proofErr w:type="spellEnd"/>
+        <w:t>Owner: Lingshi</w:t>
+      </w:r>
       <w:r>
         <w:t xml:space="preserve"> | </w:t>
       </w:r>
@@ -1749,15 +1656,7 @@
         </w:numPr>
       </w:pPr>
       <w:r>
-        <w:t xml:space="preserve">State key parameters (e.g., max features, </w:t>
-      </w:r>
-      <w:proofErr w:type="spellStart"/>
-      <w:r>
-        <w:t>regularisation</w:t>
-      </w:r>
-      <w:proofErr w:type="spellEnd"/>
-      <w:r>
-        <w:t>)</w:t>
+        <w:t>State key parameters (e.g., max features, regularisation)</w:t>
       </w:r>
     </w:p>
     <w:p>
@@ -1806,13 +1705,8 @@
       </w:r>
     </w:p>
     <w:p>
-      <w:proofErr w:type="gramStart"/>
-      <w:r>
-        <w:t>Begin</w:t>
-      </w:r>
-      <w:proofErr w:type="gramEnd"/>
-      <w:r>
-        <w:t xml:space="preserve"> with a short paragraph (~0.15p) motivating the axis: the hypothesis that increasing domain specificity and representational richness (from sparse bag-of-words → dense static embeddings → contextual embeddings) will progressively improve classification performance on biomedical text.</w:t>
+      <w:r>
+        <w:t>Begin with a short paragraph (~0.15p) motivating the axis: the hypothesis that increasing domain specificity and representational richness (from sparse bag-of-words → dense static embeddings → contextual embeddings) will progressively improve classification performance on biomedical text.</w:t>
       </w:r>
     </w:p>
     <w:p>
@@ -1873,13 +1767,8 @@
           <w:numId w:val="8"/>
         </w:numPr>
       </w:pPr>
-      <w:proofErr w:type="spellStart"/>
-      <w:r>
-        <w:t>fastText</w:t>
-      </w:r>
-      <w:proofErr w:type="spellEnd"/>
-      <w:r>
-        <w:t>-based static word embeddings trained on PubMed + MIMIC-III (200-dim)</w:t>
+      <w:r>
+        <w:t>fastText-based static word embeddings trained on PubMed + MIMIC-III (200-dim)</w:t>
       </w:r>
     </w:p>
     <w:p>
@@ -1921,31 +1810,7 @@
         </w:numPr>
       </w:pPr>
       <w:r>
-        <w:t>Pretrained exclusively on PubMed abstracts (</w:t>
-      </w:r>
-      <w:proofErr w:type="spellStart"/>
-      <w:r>
-        <w:t>microsoft</w:t>
-      </w:r>
-      <w:proofErr w:type="spellEnd"/>
-      <w:r>
-        <w:t>/</w:t>
-      </w:r>
-      <w:proofErr w:type="spellStart"/>
-      <w:r>
-        <w:t>BiomedNLP</w:t>
-      </w:r>
-      <w:proofErr w:type="spellEnd"/>
-      <w:r>
-        <w:t>-</w:t>
-      </w:r>
-      <w:proofErr w:type="spellStart"/>
-      <w:r>
-        <w:t>BiomedBERT</w:t>
-      </w:r>
-      <w:proofErr w:type="spellEnd"/>
-      <w:r>
-        <w:t>-base-uncased-abstract)</w:t>
+        <w:t>Pretrained exclusively on PubMed abstracts (microsoft/BiomedNLP-BiomedBERT-base-uncased-abstract)</w:t>
       </w:r>
     </w:p>
     <w:p>
@@ -1956,15 +1821,7 @@
         </w:numPr>
       </w:pPr>
       <w:r>
-        <w:t>Input construction: [CLS] question [SEP] context [SEP]; truncation applied to context only (truncation="</w:t>
-      </w:r>
-      <w:proofErr w:type="spellStart"/>
-      <w:r>
-        <w:t>only_second</w:t>
-      </w:r>
-      <w:proofErr w:type="spellEnd"/>
-      <w:r>
-        <w:t>")</w:t>
+        <w:t>Input construction: [CLS] question [SEP] context [SEP]; truncation applied to context only (truncation="only_second")</w:t>
       </w:r>
     </w:p>
     <w:p>
@@ -2044,13 +1901,8 @@
           <w:numId w:val="10"/>
         </w:numPr>
       </w:pPr>
-      <w:proofErr w:type="spellStart"/>
-      <w:r>
-        <w:t>Regularisation</w:t>
-      </w:r>
-      <w:proofErr w:type="spellEnd"/>
-      <w:r>
-        <w:t xml:space="preserve"> parameter C; note class-weight balancing given label imbalance</w:t>
+      <w:r>
+        <w:t>Regularisation parameter C; note class-weight balancing given label imbalance</w:t>
       </w:r>
     </w:p>
     <w:p>
@@ -2127,39 +1979,7 @@
           <w:b/>
           <w:bCs/>
         </w:rPr>
-        <w:t xml:space="preserve">Owner: Haoran (design rationale + zero-shot) + </w:t>
-      </w:r>
-      <w:proofErr w:type="spellStart"/>
-      <w:r>
-        <w:rPr>
-          <w:b/>
-          <w:bCs/>
-        </w:rPr>
-        <w:t>Lingshi</w:t>
-      </w:r>
-      <w:proofErr w:type="spellEnd"/>
-      <w:r>
-        <w:rPr>
-          <w:b/>
-          <w:bCs/>
-        </w:rPr>
-        <w:t xml:space="preserve"> (</w:t>
-      </w:r>
-      <w:proofErr w:type="spellStart"/>
-      <w:r>
-        <w:rPr>
-          <w:b/>
-          <w:bCs/>
-        </w:rPr>
-        <w:t>LoRA</w:t>
-      </w:r>
-      <w:proofErr w:type="spellEnd"/>
-      <w:r>
-        <w:rPr>
-          <w:b/>
-          <w:bCs/>
-        </w:rPr>
-        <w:t>)</w:t>
+        <w:t>Owner: Haoran (design rationale + zero-shot) + Lingshi (LoRA)</w:t>
       </w:r>
       <w:r>
         <w:t xml:space="preserve"> | </w:t>
@@ -2204,23 +2024,7 @@
         </w:numPr>
       </w:pPr>
       <w:r>
-        <w:t xml:space="preserve">Model: </w:t>
-      </w:r>
-      <w:proofErr w:type="spellStart"/>
-      <w:r>
-        <w:t>microsoft</w:t>
-      </w:r>
-      <w:proofErr w:type="spellEnd"/>
-      <w:r>
-        <w:t>/</w:t>
-      </w:r>
-      <w:proofErr w:type="spellStart"/>
-      <w:r>
-        <w:t>biogpt</w:t>
-      </w:r>
-      <w:proofErr w:type="spellEnd"/>
-      <w:r>
-        <w:t>; pre-trained only, no PubMedQA exposure</w:t>
+        <w:t>Model: microsoft/biogpt; pre-trained only, no PubMedQA exposure</w:t>
       </w:r>
     </w:p>
     <w:p>
@@ -2257,39 +2061,12 @@
       </w:r>
     </w:p>
     <w:p>
-      <w:proofErr w:type="spellStart"/>
-      <w:proofErr w:type="gramStart"/>
-      <w:r>
-        <w:rPr>
-          <w:b/>
-          <w:bCs/>
-        </w:rPr>
-        <w:t>LoRA</w:t>
-      </w:r>
-      <w:proofErr w:type="spellEnd"/>
-      <w:proofErr w:type="gramEnd"/>
-      <w:r>
-        <w:rPr>
-          <w:b/>
-          <w:bCs/>
-        </w:rPr>
-        <w:t xml:space="preserve"> Fine-Tuning (</w:t>
-      </w:r>
-      <w:proofErr w:type="spellStart"/>
-      <w:r>
-        <w:rPr>
-          <w:b/>
-          <w:bCs/>
-        </w:rPr>
-        <w:t>Lingshi</w:t>
-      </w:r>
-      <w:proofErr w:type="spellEnd"/>
-      <w:r>
-        <w:rPr>
-          <w:b/>
-          <w:bCs/>
-        </w:rPr>
-        <w:t>)</w:t>
+      <w:r>
+        <w:rPr>
+          <w:b/>
+          <w:bCs/>
+        </w:rPr>
+        <w:t>LoRA Fine-Tuning (Lingshi)</w:t>
       </w:r>
     </w:p>
     <w:p>
@@ -2300,13 +2077,8 @@
         </w:numPr>
       </w:pPr>
       <w:r>
-        <w:t xml:space="preserve">Model: same BioGPT architecture, parameter-efficient fine-tuning via </w:t>
-      </w:r>
-      <w:proofErr w:type="spellStart"/>
-      <w:r>
-        <w:t>LoRA</w:t>
-      </w:r>
-      <w:proofErr w:type="spellEnd"/>
+        <w:t>Model: same BioGPT architecture, parameter-efficient fine-tuning via LoRA</w:t>
+      </w:r>
     </w:p>
     <w:p>
       <w:pPr>
@@ -2327,15 +2099,7 @@
         </w:numPr>
       </w:pPr>
       <w:r>
-        <w:t xml:space="preserve">Describe </w:t>
-      </w:r>
-      <w:proofErr w:type="spellStart"/>
-      <w:r>
-        <w:t>LoRA</w:t>
-      </w:r>
-      <w:proofErr w:type="spellEnd"/>
-      <w:r>
-        <w:t xml:space="preserve"> rank, target modules, training setup</w:t>
+        <w:t>Describe LoRA rank, target modules, training setup</w:t>
       </w:r>
     </w:p>
     <w:p>
@@ -2346,15 +2110,7 @@
         </w:numPr>
       </w:pPr>
       <w:r>
-        <w:t xml:space="preserve">Note: prior adjustment not applied to </w:t>
-      </w:r>
-      <w:proofErr w:type="spellStart"/>
-      <w:r>
-        <w:t>LoRA</w:t>
-      </w:r>
-      <w:proofErr w:type="spellEnd"/>
-      <w:r>
-        <w:t xml:space="preserve"> results at this stage (to be discussed in limitations)</w:t>
+        <w:t>Note: prior adjustment not applied to LoRA results at this stage (to be discussed in limitations)</w:t>
       </w:r>
     </w:p>
     <w:p>
@@ -2409,17 +2165,8 @@
           <w:b/>
           <w:bCs/>
         </w:rPr>
-        <w:t xml:space="preserve">Owner: </w:t>
-      </w:r>
-      <w:proofErr w:type="spellStart"/>
-      <w:r>
-        <w:rPr>
-          <w:b/>
-          <w:bCs/>
-        </w:rPr>
-        <w:t>Lingshi</w:t>
-      </w:r>
-      <w:proofErr w:type="spellEnd"/>
+        <w:t>Owner: Lingshi</w:t>
+      </w:r>
       <w:r>
         <w:t xml:space="preserve"> | </w:t>
       </w:r>
@@ -2492,13 +2239,8 @@
         <w:t>Per-class F1</w:t>
       </w:r>
       <w:r>
-        <w:t xml:space="preserve">: report for yes / no / maybe separately to expose class-level </w:t>
-      </w:r>
-      <w:proofErr w:type="spellStart"/>
-      <w:r>
-        <w:t>behaviour</w:t>
-      </w:r>
-      <w:proofErr w:type="spellEnd"/>
+        <w:t>: report for yes / no / maybe separately to expose class-level behaviour</w:t>
+      </w:r>
     </w:p>
     <w:p>
       <w:pPr>
@@ -2508,13 +2250,8 @@
         </w:numPr>
       </w:pPr>
       <w:r>
-        <w:t xml:space="preserve">Briefly justify why Macro F1 is preferred over Weighted F1 here: the "maybe" class is clinically meaningful and should not be </w:t>
-      </w:r>
-      <w:proofErr w:type="gramStart"/>
-      <w:r>
-        <w:t>down-weighted</w:t>
-      </w:r>
-      <w:proofErr w:type="gramEnd"/>
+        <w:t>Briefly justify why Macro F1 is preferred over Weighted F1 here: the "maybe" class is clinically meaningful and should not be down-weighted</w:t>
+      </w:r>
     </w:p>
     <w:p>
       <w:pPr>
@@ -4160,7 +3897,6 @@
             <w:hideMark/>
           </w:tcPr>
           <w:p>
-            <w:proofErr w:type="spellStart"/>
             <w:r>
               <w:t>PubMedBERT</w:t>
             </w:r>
@@ -4170,7 +3906,6 @@
               </w:rPr>
               <w:t>+Mesh</w:t>
             </w:r>
-            <w:proofErr w:type="spellEnd"/>
           </w:p>
         </w:tc>
         <w:tc>
@@ -4410,7 +4145,6 @@
             <w:vAlign w:val="center"/>
           </w:tcPr>
           <w:p>
-            <w:proofErr w:type="spellStart"/>
             <w:r>
               <w:rPr>
                 <w:rFonts w:hint="eastAsia"/>
@@ -4423,7 +4157,6 @@
               </w:rPr>
               <w:t>+Mesh</w:t>
             </w:r>
-            <w:proofErr w:type="spellEnd"/>
           </w:p>
         </w:tc>
         <w:tc>
@@ -5569,15 +5302,7 @@
           </w:tcPr>
           <w:p>
             <w:r>
-              <w:t>BioGPT (</w:t>
-            </w:r>
-            <w:proofErr w:type="spellStart"/>
-            <w:r>
-              <w:t>LoRA</w:t>
-            </w:r>
-            <w:proofErr w:type="spellEnd"/>
-            <w:r>
-              <w:t>)</w:t>
+              <w:t>BioGPT (LoRA)</w:t>
             </w:r>
           </w:p>
         </w:tc>
@@ -5722,15 +5447,7 @@
         <w:t>TF-IDF results</w:t>
       </w:r>
       <w:r>
-        <w:t xml:space="preserve"> (</w:t>
-      </w:r>
-      <w:proofErr w:type="spellStart"/>
-      <w:r>
-        <w:t>Lingshi</w:t>
-      </w:r>
-      <w:proofErr w:type="spellEnd"/>
-      <w:r>
-        <w:t>): compare plain vs. +MeSH; did MeSH terms help?</w:t>
+        <w:t xml:space="preserve"> (Lingshi): compare plain vs. +MeSH; did MeSH terms help?</w:t>
       </w:r>
     </w:p>
     <w:p>
@@ -5775,6 +5492,24 @@
         <w:t>Anis</w:t>
       </w:r>
       <w:r>
+        <w:rPr>
+          <w:rFonts w:hint="eastAsia"/>
+        </w:rPr>
+        <w:t xml:space="preserve"> </w:t>
+      </w:r>
+      <w:r>
+        <w:rPr>
+          <w:rFonts w:hint="eastAsia"/>
+        </w:rPr>
+        <w:t>+</w:t>
+      </w:r>
+      <w:r>
+        <w:rPr>
+          <w:rFonts w:hint="eastAsia"/>
+        </w:rPr>
+        <w:t xml:space="preserve"> Pallavi</w:t>
+      </w:r>
+      <w:r>
         <w:t>): compare to BioWordVec; did contextual embeddings justify the cost?</w:t>
       </w:r>
     </w:p>
@@ -5793,23 +5528,7 @@
         <w:t>BioGPT results</w:t>
       </w:r>
       <w:r>
-        <w:t xml:space="preserve"> (Haoran + </w:t>
-      </w:r>
-      <w:proofErr w:type="spellStart"/>
-      <w:r>
-        <w:t>Lingshi</w:t>
-      </w:r>
-      <w:proofErr w:type="spellEnd"/>
-      <w:r>
-        <w:t xml:space="preserve">): compare zero-shot vs. </w:t>
-      </w:r>
-      <w:proofErr w:type="spellStart"/>
-      <w:r>
-        <w:t>LoRA</w:t>
-      </w:r>
-      <w:proofErr w:type="spellEnd"/>
-      <w:r>
-        <w:t>; how do both compare to the best supervised pipeline?</w:t>
+        <w:t xml:space="preserve"> (Haoran + Lingshi): compare zero-shot vs. LoRA; how do both compare to the best supervised pipeline?</w:t>
       </w:r>
     </w:p>
     <w:p>
@@ -5960,25 +5679,7 @@
           <w:b/>
           <w:bCs/>
         </w:rPr>
-        <w:t>TF-IDF(</w:t>
-      </w:r>
-      <w:proofErr w:type="spellStart"/>
-      <w:r>
-        <w:rPr>
-          <w:rFonts w:hint="eastAsia"/>
-          <w:b/>
-          <w:bCs/>
-        </w:rPr>
-        <w:t>Lingshi</w:t>
-      </w:r>
-      <w:proofErr w:type="spellEnd"/>
-      <w:r>
-        <w:rPr>
-          <w:rFonts w:hint="eastAsia"/>
-          <w:b/>
-          <w:bCs/>
-        </w:rPr>
-        <w:t>)</w:t>
+        <w:t>TF-IDF(Lingshi)</w:t>
       </w:r>
     </w:p>
     <w:p>
@@ -5996,15 +5697,7 @@
         <w:t>BioWordVec</w:t>
       </w:r>
       <w:r>
-        <w:t xml:space="preserve"> (Haoran): OOV rate analysis — what proportion of test tokens were not in the BioWordVec vocabulary? </w:t>
-      </w:r>
-      <w:proofErr w:type="gramStart"/>
-      <w:r>
-        <w:t>Were</w:t>
-      </w:r>
-      <w:proofErr w:type="gramEnd"/>
-      <w:r>
-        <w:t xml:space="preserve"> errors correlated with high OOV rate?</w:t>
+        <w:t xml:space="preserve"> (Haoran): OOV rate analysis — what proportion of test tokens were not in the BioWordVec vocabulary? Were errors correlated with high OOV rate?</w:t>
       </w:r>
     </w:p>
     <w:p>
@@ -6049,15 +5742,7 @@
         <w:t>BioGPT zero-shot</w:t>
       </w:r>
       <w:r>
-        <w:t xml:space="preserve"> (Haoran): confidence margin analysis — were errors concentrated in low-margin (uncertain) predictions? Refer to biogpt_results.csv columns uncertain, </w:t>
-      </w:r>
-      <w:proofErr w:type="spellStart"/>
-      <w:r>
-        <w:t>margin_bucket</w:t>
-      </w:r>
-      <w:proofErr w:type="spellEnd"/>
-      <w:r>
-        <w:t>. Also report label consistency across prompt variants (52.8%) as evidence of sensitivity to prompt phrasing.</w:t>
+        <w:t xml:space="preserve"> (Haoran): confidence margin analysis — were errors concentrated in low-margin (uncertain) predictions? Refer to biogpt_results.csv columns uncertain, margin_bucket. Also report label consistency across prompt variants (52.8%) as evidence of sensitivity to prompt phrasing.</w:t>
       </w:r>
     </w:p>
     <w:p>
@@ -6104,15 +5789,7 @@
         </w:numPr>
       </w:pPr>
       <w:r>
-        <w:t xml:space="preserve">One short paragraph </w:t>
-      </w:r>
-      <w:proofErr w:type="spellStart"/>
-      <w:r>
-        <w:t>characterising</w:t>
-      </w:r>
-      <w:proofErr w:type="spellEnd"/>
-      <w:r>
-        <w:t xml:space="preserve"> these hard cases (e.g., "maybe" questions with strong contextual evidence that models misread as "yes")</w:t>
+        <w:t>One short paragraph characterising these hard cases (e.g., "maybe" questions with strong contextual evidence that models misread as "yes")</w:t>
       </w:r>
     </w:p>
     <w:p>
@@ -6313,23 +5990,13 @@
           <w:numId w:val="21"/>
         </w:numPr>
       </w:pPr>
-      <w:proofErr w:type="spellStart"/>
       <w:r>
         <w:rPr>
           <w:rFonts w:hint="eastAsia"/>
           <w:b/>
           <w:bCs/>
         </w:rPr>
-        <w:t>Lingshi</w:t>
-      </w:r>
-      <w:proofErr w:type="spellEnd"/>
-      <w:r>
-        <w:rPr>
-          <w:rFonts w:hint="eastAsia"/>
-          <w:b/>
-          <w:bCs/>
-        </w:rPr>
-        <w:t xml:space="preserve">: </w:t>
+        <w:t xml:space="preserve">Lingshi: </w:t>
       </w:r>
       <w:r>
         <w:rPr>
@@ -6365,15 +6032,7 @@
         <w:t>Generative vs. discriminative</w:t>
       </w:r>
       <w:r>
-        <w:t xml:space="preserve">: BioGPT zero-shot scored 36% accuracy and 0.209 Macro F1 — substantially below the supervised baselines. Discuss why: the task requires 3-class discrimination from a structured prompt, which is not what BioGPT was trained for; logit scoring is a coarse proxy for classification confidence. Discuss what the </w:t>
-      </w:r>
-      <w:proofErr w:type="spellStart"/>
-      <w:r>
-        <w:t>LoRA</w:t>
-      </w:r>
-      <w:proofErr w:type="spellEnd"/>
-      <w:r>
-        <w:t xml:space="preserve"> results add to this comparison.</w:t>
+        <w:t>: BioGPT zero-shot scored 36% accuracy and 0.209 Macro F1 — substantially below the supervised baselines. Discuss why: the task requires 3-class discrimination from a structured prompt, which is not what BioGPT was trained for; logit scoring is a coarse proxy for classification confidence. Discuss what the LoRA results add to this comparison.</w:t>
       </w:r>
     </w:p>
     <w:p>
@@ -6457,15 +6116,7 @@
         <w:t>Paragraph 1 — What worked:</w:t>
       </w:r>
       <w:r>
-        <w:t xml:space="preserve"> </w:t>
-      </w:r>
-      <w:proofErr w:type="spellStart"/>
-      <w:r>
-        <w:t>Summarise</w:t>
-      </w:r>
-      <w:proofErr w:type="spellEnd"/>
-      <w:r>
-        <w:t xml:space="preserve"> which pipeline achieved the best performance and why, linking back to the domain-specificity hypothesis.</w:t>
+        <w:t xml:space="preserve"> Summarise which pipeline achieved the best performance and why, linking back to the domain-specificity hypothesis.</w:t>
       </w:r>
     </w:p>
     <w:p>
@@ -6588,15 +6239,7 @@
         </w:numPr>
       </w:pPr>
       <w:r>
-        <w:t xml:space="preserve">Formatted using </w:t>
-      </w:r>
-      <w:proofErr w:type="spellStart"/>
-      <w:r>
-        <w:t>NeurIPS</w:t>
-      </w:r>
-      <w:proofErr w:type="spellEnd"/>
-      <w:r>
-        <w:t xml:space="preserve"> or ACL Overleaf template</w:t>
+        <w:t>Formatted using NeurIPS or ACL Overleaf template</w:t>
       </w:r>
     </w:p>
     <w:p/>

</xml_diff>